<commit_message>
Update Word templates with landscape irrigation dropdown restored
All four templates (Multi-Apt, Townhouse, Mixed-Use, Comm) updated with
the landscape irrigation dropdown box re-added.

Co-Authored-By: Claude Sonnet 4.6 <noreply@anthropic.com>
</commit_message>
<xml_diff>
--- a/server/templates/DATE-GIWREF-Address-SMP-MixUse-2022-A.docx
+++ b/server/templates/DATE-GIWREF-Address-SMP-MixUse-2022-A.docx
@@ -224,7 +224,7 @@
                 <w:sz w:val="20"/>
                 <w:lang w:val="en-US"/>
               </w:rPr>
-              <w:t>17 June 2026</w:t>
+              <w:t>19 June 2026</w:t>
             </w:r>
             <w:r>
               <w:rPr>
@@ -1493,6 +1493,7 @@
               </w:rPr>
               <w:br/>
             </w:r>
+            <w:proofErr w:type="spellStart"/>
             <w:r>
               <w:rPr>
                 <w:b/>
@@ -1502,6 +1503,7 @@
               </w:rPr>
               <w:t>Firstname</w:t>
             </w:r>
+            <w:proofErr w:type="spellEnd"/>
             <w:r>
               <w:rPr>
                 <w:b/>
@@ -1762,11 +1764,11 @@
         <w:br w:type="page"/>
       </w:r>
     </w:p>
-    <w:bookmarkStart w:id="19" w:name="_Toc209592307" w:displacedByCustomXml="next"/>
-    <w:bookmarkStart w:id="20" w:name="_Toc209557015" w:displacedByCustomXml="next"/>
+    <w:bookmarkStart w:id="19" w:name="_Toc231555515" w:displacedByCustomXml="next"/>
+    <w:bookmarkStart w:id="20" w:name="_Toc209555290" w:displacedByCustomXml="next"/>
     <w:bookmarkStart w:id="21" w:name="_Toc209555543" w:displacedByCustomXml="next"/>
-    <w:bookmarkStart w:id="22" w:name="_Toc209555290" w:displacedByCustomXml="next"/>
-    <w:bookmarkStart w:id="23" w:name="_Toc231555515" w:displacedByCustomXml="next"/>
+    <w:bookmarkStart w:id="22" w:name="_Toc209557015" w:displacedByCustomXml="next"/>
+    <w:bookmarkStart w:id="23" w:name="_Toc209592307" w:displacedByCustomXml="next"/>
     <w:sdt>
       <w:sdtPr>
         <w:rPr>
@@ -3729,11 +3731,24 @@
       <w:r>
         <w:t>XX</w:t>
       </w:r>
+      <w:proofErr w:type="gramStart"/>
       <w:r>
         <w:t>]</w:t>
       </w:r>
       <w:r>
-        <w:t xml:space="preserve">  x 1 bedroom apartments</w:t>
+        <w:t xml:space="preserve">  x</w:t>
+      </w:r>
+      <w:proofErr w:type="gramEnd"/>
+      <w:r>
+        <w:t xml:space="preserve"> </w:t>
+      </w:r>
+      <w:proofErr w:type="gramStart"/>
+      <w:r>
+        <w:t>1 bedroom</w:t>
+      </w:r>
+      <w:proofErr w:type="gramEnd"/>
+      <w:r>
+        <w:t xml:space="preserve"> apartments</w:t>
       </w:r>
     </w:p>
     <w:p>
@@ -3755,7 +3770,15 @@
         <w:t>]</w:t>
       </w:r>
       <w:r>
-        <w:t xml:space="preserve"> x 2 bedroom apartments</w:t>
+        <w:t xml:space="preserve"> x </w:t>
+      </w:r>
+      <w:proofErr w:type="gramStart"/>
+      <w:r>
+        <w:t>2 bedroom</w:t>
+      </w:r>
+      <w:proofErr w:type="gramEnd"/>
+      <w:r>
+        <w:t xml:space="preserve"> apartments</w:t>
       </w:r>
     </w:p>
     <w:p>
@@ -3777,7 +3800,15 @@
         <w:t>]</w:t>
       </w:r>
       <w:r>
-        <w:t xml:space="preserve"> x 3 bedroom apartments</w:t>
+        <w:t xml:space="preserve"> x </w:t>
+      </w:r>
+      <w:proofErr w:type="gramStart"/>
+      <w:r>
+        <w:t>3 bedroom</w:t>
+      </w:r>
+      <w:proofErr w:type="gramEnd"/>
+      <w:r>
+        <w:t xml:space="preserve"> apartments</w:t>
       </w:r>
     </w:p>
     <w:p>
@@ -3962,8 +3993,13 @@
       <w:r>
         <w:t xml:space="preserve"> - </w:t>
       </w:r>
+      <w:proofErr w:type="gramStart"/>
       <w:r>
-        <w:t xml:space="preserve">Pre-existing sites at </w:t>
+        <w:t>Pre-existing</w:t>
+      </w:r>
+      <w:proofErr w:type="gramEnd"/>
+      <w:r>
+        <w:t xml:space="preserve"> sites at </w:t>
       </w:r>
       <w:sdt>
         <w:sdtPr>
@@ -6127,7 +6163,7 @@
                 <w:color w:val="000000"/>
               </w:rPr>
               <w:drawing>
-                <wp:anchor distT="0" distB="0" distL="114300" distR="114300" simplePos="0" relativeHeight="251738112" behindDoc="1" locked="0" layoutInCell="1" allowOverlap="1" wp14:anchorId="22787630" wp14:editId="0ED3CC1E">
+                <wp:anchor distT="0" distB="0" distL="114300" distR="114300" simplePos="0" relativeHeight="251738112" behindDoc="1" locked="0" layoutInCell="1" allowOverlap="1" wp14:anchorId="22787630" wp14:editId="2E8DFD95">
                   <wp:simplePos x="0" y="0"/>
                   <wp:positionH relativeFrom="column">
                     <wp:posOffset>77470</wp:posOffset>
@@ -6253,13 +6289,23 @@
             <w:r>
               <w:fldChar w:fldCharType="end"/>
             </w:r>
+            <w:proofErr w:type="spellStart"/>
             <w:r>
               <w:rPr>
                 <w:rFonts w:eastAsiaTheme="minorEastAsia"/>
                 <w:szCs w:val="22"/>
                 <w:lang w:eastAsia="en-US"/>
               </w:rPr>
-              <w:t>NatHERS Energy Rating.</w:t>
+              <w:t>NatHERS</w:t>
+            </w:r>
+            <w:proofErr w:type="spellEnd"/>
+            <w:r>
+              <w:rPr>
+                <w:rFonts w:eastAsiaTheme="minorEastAsia"/>
+                <w:szCs w:val="22"/>
+                <w:lang w:eastAsia="en-US"/>
+              </w:rPr>
+              <w:t xml:space="preserve"> Energy Rating.</w:t>
             </w:r>
           </w:p>
         </w:tc>
@@ -6590,7 +6636,7 @@
                 <w:color w:val="000000"/>
               </w:rPr>
               <w:drawing>
-                <wp:anchor distT="0" distB="0" distL="114300" distR="114300" simplePos="0" relativeHeight="251739136" behindDoc="1" locked="0" layoutInCell="1" allowOverlap="1" wp14:anchorId="7055ECC5" wp14:editId="50DECFB9">
+                <wp:anchor distT="0" distB="0" distL="114300" distR="114300" simplePos="0" relativeHeight="251739136" behindDoc="1" locked="0" layoutInCell="1" allowOverlap="1" wp14:anchorId="7055ECC5" wp14:editId="6C9BC2D3">
                   <wp:simplePos x="0" y="0"/>
                   <wp:positionH relativeFrom="column">
                     <wp:posOffset>76200</wp:posOffset>
@@ -6672,13 +6718,23 @@
                 <w:lang w:eastAsia="en-US"/>
               </w:rPr>
             </w:pPr>
+            <w:proofErr w:type="gramStart"/>
             <w:r>
               <w:rPr>
                 <w:rFonts w:eastAsiaTheme="minorEastAsia"/>
                 <w:szCs w:val="22"/>
                 <w:lang w:eastAsia="en-US"/>
               </w:rPr>
-              <w:t>The majority of the development meets BESS IEQ requirements.</w:t>
+              <w:t>The majority of</w:t>
+            </w:r>
+            <w:proofErr w:type="gramEnd"/>
+            <w:r>
+              <w:rPr>
+                <w:rFonts w:eastAsiaTheme="minorEastAsia"/>
+                <w:szCs w:val="22"/>
+                <w:lang w:eastAsia="en-US"/>
+              </w:rPr>
+              <w:t xml:space="preserve"> the development meets BESS IEQ requirements.</w:t>
             </w:r>
           </w:p>
         </w:tc>
@@ -7591,7 +7647,7 @@
                 <w:color w:val="000000"/>
               </w:rPr>
               <w:drawing>
-                <wp:anchor distT="0" distB="0" distL="114300" distR="114300" simplePos="0" relativeHeight="251741184" behindDoc="1" locked="0" layoutInCell="1" allowOverlap="1" wp14:anchorId="63206793" wp14:editId="3DF73CA8">
+                <wp:anchor distT="0" distB="0" distL="114300" distR="114300" simplePos="0" relativeHeight="251741184" behindDoc="1" locked="0" layoutInCell="1" allowOverlap="1" wp14:anchorId="63206793" wp14:editId="337D6516">
                   <wp:simplePos x="0" y="0"/>
                   <wp:positionH relativeFrom="column">
                     <wp:posOffset>91440</wp:posOffset>
@@ -9055,13 +9111,41 @@
               <w:rPr>
                 <w:szCs w:val="22"/>
               </w:rPr>
-              <w:t xml:space="preserve"> [XX]</w:t>
-            </w:r>
-            <w:r>
-              <w:rPr>
-                <w:szCs w:val="22"/>
-              </w:rPr>
-              <w:t xml:space="preserve"> litre rainwater tank. XX WC’s are to be connected to the rainwater tank.</w:t>
+              <w:t xml:space="preserve"> </w:t>
+            </w:r>
+            <w:proofErr w:type="gramStart"/>
+            <w:r>
+              <w:rPr>
+                <w:szCs w:val="22"/>
+              </w:rPr>
+              <w:t>[XX]</w:t>
+            </w:r>
+            <w:r>
+              <w:rPr>
+                <w:szCs w:val="22"/>
+              </w:rPr>
+              <w:t xml:space="preserve"> litre</w:t>
+            </w:r>
+            <w:proofErr w:type="gramEnd"/>
+            <w:r>
+              <w:rPr>
+                <w:szCs w:val="22"/>
+              </w:rPr>
+              <w:t xml:space="preserve"> rainwater tank. XX </w:t>
+            </w:r>
+            <w:proofErr w:type="gramStart"/>
+            <w:r>
+              <w:rPr>
+                <w:szCs w:val="22"/>
+              </w:rPr>
+              <w:t>WC’s</w:t>
+            </w:r>
+            <w:proofErr w:type="gramEnd"/>
+            <w:r>
+              <w:rPr>
+                <w:szCs w:val="22"/>
+              </w:rPr>
+              <w:t xml:space="preserve"> are to be connected to the rainwater tank.</w:t>
             </w:r>
           </w:p>
           <w:p>
@@ -9180,7 +9264,39 @@
                 <w:color w:val="auto"/>
                 <w:szCs w:val="22"/>
               </w:rPr>
-              <w:t>To reduce total potable water use due through the use of efficient fixtures, appliances, and the use of rainwater.</w:t>
+              <w:t xml:space="preserve">To reduce total potable </w:t>
+            </w:r>
+            <w:proofErr w:type="gramStart"/>
+            <w:r>
+              <w:rPr>
+                <w:color w:val="auto"/>
+                <w:szCs w:val="22"/>
+              </w:rPr>
+              <w:t>water</w:t>
+            </w:r>
+            <w:proofErr w:type="gramEnd"/>
+            <w:r>
+              <w:rPr>
+                <w:color w:val="auto"/>
+                <w:szCs w:val="22"/>
+              </w:rPr>
+              <w:t xml:space="preserve"> use due </w:t>
+            </w:r>
+            <w:proofErr w:type="gramStart"/>
+            <w:r>
+              <w:rPr>
+                <w:color w:val="auto"/>
+                <w:szCs w:val="22"/>
+              </w:rPr>
+              <w:t>through the use of</w:t>
+            </w:r>
+            <w:proofErr w:type="gramEnd"/>
+            <w:r>
+              <w:rPr>
+                <w:color w:val="auto"/>
+                <w:szCs w:val="22"/>
+              </w:rPr>
+              <w:t xml:space="preserve"> efficient fixtures, appliances, and the use of rainwater.</w:t>
             </w:r>
           </w:p>
         </w:tc>
@@ -9990,6 +10106,7 @@
             </w:r>
           </w:p>
         </w:tc>
+        <w:bookmarkStart w:id="69" w:name="Landscaping"/>
         <w:tc>
           <w:tcPr>
             <w:tcW w:w="6236" w:type="dxa"/>
@@ -10009,15 +10126,35 @@
                 <w:szCs w:val="22"/>
               </w:rPr>
             </w:pPr>
-            <w:bookmarkStart w:id="69" w:name="Landscape_Irrigation"/>
-            <w:r>
-              <w:rPr>
-                <w:bCs/>
-                <w:szCs w:val="22"/>
-              </w:rPr>
-              <w:lastRenderedPageBreak/>
-              <w:t>[XX]</w:t>
-            </w:r>
+            <w:sdt>
+              <w:sdtPr>
+                <w:rPr>
+                  <w:b/>
+                  <w:szCs w:val="22"/>
+                </w:rPr>
+                <w:alias w:val="Irrigation"/>
+                <w:tag w:val="Irrigation"/>
+                <w:id w:val="2087878562"/>
+                <w:placeholder>
+                  <w:docPart w:val="9F41AA2BDC594A199CE6F0670E45926C"/>
+                </w:placeholder>
+                <w:showingPlcHdr/>
+                <w:dropDownList>
+                  <w:listItem w:value="Choose an item."/>
+                  <w:listItem w:displayText="The majority of landscaping is to be native vegetation with no irrigation demand after the initial establishment period." w:value="The majority of landscaping is to be native vegetation with no irrigation demand after the initial establishment period."/>
+                  <w:listItem w:displayText="No landscaping provided to the development" w:value="No landscaping provided to the development"/>
+                  <w:listItem w:displayText="Landscape irrigation demand will be connected to the rainwater tank. " w:value="Landscape irrigation demand will be connected to the rainwater tank. "/>
+                </w:dropDownList>
+              </w:sdtPr>
+              <w:sdtContent>
+                <w:r>
+                  <w:rPr>
+                    <w:rStyle w:val="PlaceholderText"/>
+                  </w:rPr>
+                  <w:t>Choose an item.</w:t>
+                </w:r>
+              </w:sdtContent>
+            </w:sdt>
             <w:bookmarkEnd w:id="69"/>
           </w:p>
         </w:tc>
@@ -10113,7 +10250,21 @@
               <w:rPr>
                 <w:szCs w:val="22"/>
               </w:rPr>
-              <w:t xml:space="preserve"> (e.g. hydrant pump test water or SCV annubar test)</w:t>
+              <w:t xml:space="preserve"> (e.g. hydrant pump test water or SCV </w:t>
+            </w:r>
+            <w:proofErr w:type="spellStart"/>
+            <w:r>
+              <w:rPr>
+                <w:szCs w:val="22"/>
+              </w:rPr>
+              <w:t>annubar</w:t>
+            </w:r>
+            <w:proofErr w:type="spellEnd"/>
+            <w:r>
+              <w:rPr>
+                <w:szCs w:val="22"/>
+              </w:rPr>
+              <w:t xml:space="preserve"> test)</w:t>
             </w:r>
             <w:r>
               <w:rPr>
@@ -10442,7 +10593,21 @@
               <w:rPr>
                 <w:szCs w:val="22"/>
               </w:rPr>
-              <w:t xml:space="preserve">The National Construction Code (NCC) Class 2 – Sole Occupancy Unit(s) residential building component is to be designed in accordance with NCC Section J (2022) NatHERS requirements. The residential units must achieve an average </w:t>
+              <w:t xml:space="preserve">The National Construction Code (NCC) Class 2 – Sole Occupancy Unit(s) residential building component is to be designed in accordance with NCC Section J (2022) </w:t>
+            </w:r>
+            <w:proofErr w:type="spellStart"/>
+            <w:r>
+              <w:rPr>
+                <w:szCs w:val="22"/>
+              </w:rPr>
+              <w:t>NatHERS</w:t>
+            </w:r>
+            <w:proofErr w:type="spellEnd"/>
+            <w:r>
+              <w:rPr>
+                <w:szCs w:val="22"/>
+              </w:rPr>
+              <w:t xml:space="preserve"> requirements. The residential units must achieve an average </w:t>
             </w:r>
             <w:bookmarkStart w:id="72" w:name="FR_target"/>
             <w:r>
@@ -12390,6 +12555,7 @@
                     </w:rPr>
                     <w:fldChar w:fldCharType="separate"/>
                   </w:r>
+                  <w:proofErr w:type="gramStart"/>
                   <w:r>
                     <w:rPr>
                       <w:rFonts w:eastAsia="SimSun" w:cs="Calibri"/>
@@ -12411,6 +12577,7 @@
                     </w:rPr>
                     <w:t>%</w:t>
                   </w:r>
+                  <w:proofErr w:type="gramEnd"/>
                   <w:r>
                     <w:rPr>
                       <w:rFonts w:eastAsia="SimSun" w:cs="Calibri"/>
@@ -12485,6 +12652,7 @@
                     </w:rPr>
                     <w:fldChar w:fldCharType="separate"/>
                   </w:r>
+                  <w:proofErr w:type="gramStart"/>
                   <w:r>
                     <w:rPr>
                       <w:rFonts w:eastAsia="SimSun" w:cs="Calibri"/>
@@ -12506,6 +12674,7 @@
                     </w:rPr>
                     <w:t>%</w:t>
                   </w:r>
+                  <w:proofErr w:type="gramEnd"/>
                   <w:r>
                     <w:rPr>
                       <w:rFonts w:eastAsia="SimSun" w:cs="Calibri"/>
@@ -12618,11 +12787,19 @@
               <w:t xml:space="preserve"> </w:t>
             </w:r>
             <w:bookmarkStart w:id="82" w:name="DTS"/>
-            <w:r>
-              <w:rPr>
-                <w:szCs w:val="22"/>
-              </w:rPr>
-              <w:t>The majority of the development complies with the Deemed-to-Satisfy method for IEQ prescribed by BESS.</w:t>
+            <w:proofErr w:type="gramStart"/>
+            <w:r>
+              <w:rPr>
+                <w:szCs w:val="22"/>
+              </w:rPr>
+              <w:t>The majority of</w:t>
+            </w:r>
+            <w:proofErr w:type="gramEnd"/>
+            <w:r>
+              <w:rPr>
+                <w:szCs w:val="22"/>
+              </w:rPr>
+              <w:t xml:space="preserve"> the development complies with the Deemed-to-Satisfy method for IEQ prescribed by BESS.</w:t>
             </w:r>
             <w:bookmarkEnd w:id="82"/>
             <w:r>
@@ -13087,8 +13264,8 @@
                 <w:szCs w:val="22"/>
               </w:rPr>
             </w:pPr>
-            <w:bookmarkStart w:id="85" w:name="Lighting"/>
-            <w:bookmarkStart w:id="86" w:name="Nat_Vent"/>
+            <w:bookmarkStart w:id="85" w:name="Nat_Vent"/>
+            <w:bookmarkStart w:id="86" w:name="Lighting"/>
             <w:r>
               <w:rPr>
                 <w:szCs w:val="22"/>
@@ -13101,26 +13278,26 @@
               </w:rPr>
               <w:t xml:space="preserve">XX% </w:t>
             </w:r>
+            <w:bookmarkEnd w:id="85"/>
+            <w:r>
+              <w:rPr>
+                <w:szCs w:val="22"/>
+              </w:rPr>
+              <w:t>(XX out of XX)</w:t>
+            </w:r>
+            <w:r>
+              <w:rPr>
+                <w:szCs w:val="22"/>
+              </w:rPr>
+              <w:t>]</w:t>
+            </w:r>
+            <w:r>
+              <w:rPr>
+                <w:szCs w:val="22"/>
+              </w:rPr>
+              <w:t xml:space="preserve"> of the development’s apartments are naturally cross-ventilated. Apartments are provided with windows on opposite or adjacent facades or are effective single sided ventilated.</w:t>
+            </w:r>
             <w:bookmarkEnd w:id="86"/>
-            <w:r>
-              <w:rPr>
-                <w:szCs w:val="22"/>
-              </w:rPr>
-              <w:t>(XX out of XX)</w:t>
-            </w:r>
-            <w:r>
-              <w:rPr>
-                <w:szCs w:val="22"/>
-              </w:rPr>
-              <w:t>]</w:t>
-            </w:r>
-            <w:r>
-              <w:rPr>
-                <w:szCs w:val="22"/>
-              </w:rPr>
-              <w:t xml:space="preserve"> of the development’s apartments are naturally cross-ventilated. Apartments are provided with windows on opposite or adjacent facades or are effective single sided ventilated.</w:t>
-            </w:r>
-            <w:bookmarkEnd w:id="85"/>
           </w:p>
           <w:p>
             <w:pPr>
@@ -13140,12 +13317,21 @@
                 <w:lang w:val="fr-FR"/>
               </w:rPr>
             </w:pPr>
+            <w:proofErr w:type="spellStart"/>
             <w:r>
               <w:rPr>
                 <w:szCs w:val="22"/>
                 <w:lang w:val="fr-FR"/>
               </w:rPr>
-              <w:t xml:space="preserve">Refer </w:t>
+              <w:t>Refer</w:t>
+            </w:r>
+            <w:proofErr w:type="spellEnd"/>
+            <w:r>
+              <w:rPr>
+                <w:szCs w:val="22"/>
+                <w:lang w:val="fr-FR"/>
+              </w:rPr>
+              <w:t xml:space="preserve"> </w:t>
             </w:r>
             <w:r>
               <w:fldChar w:fldCharType="begin"/>
@@ -13199,8 +13385,18 @@
                 <w:color w:val="00602B" w:themeColor="text2"/>
                 <w:szCs w:val="22"/>
               </w:rPr>
-              <w:t>Ventilation – Non-Residential</w:t>
-            </w:r>
+              <w:t xml:space="preserve">Ventilation – </w:t>
+            </w:r>
+            <w:proofErr w:type="gramStart"/>
+            <w:r>
+              <w:rPr>
+                <w:rFonts w:ascii="Roboto" w:hAnsi="Roboto"/>
+                <w:color w:val="00602B" w:themeColor="text2"/>
+                <w:szCs w:val="22"/>
+              </w:rPr>
+              <w:t>Non-Residential</w:t>
+            </w:r>
+            <w:proofErr w:type="gramEnd"/>
           </w:p>
         </w:tc>
         <w:tc>
@@ -14117,7 +14313,21 @@
               <w:rPr>
                 <w:szCs w:val="22"/>
               </w:rPr>
-              <w:t xml:space="preserve"> This will provide a ratio of approximately 1 visitor bicycle space for every X apartments.</w:t>
+              <w:t xml:space="preserve"> This will provide a ratio of approximately 1 visitor bicycle space for every X </w:t>
+            </w:r>
+            <w:proofErr w:type="gramStart"/>
+            <w:r>
+              <w:rPr>
+                <w:szCs w:val="22"/>
+              </w:rPr>
+              <w:t>apartments</w:t>
+            </w:r>
+            <w:proofErr w:type="gramEnd"/>
+            <w:r>
+              <w:rPr>
+                <w:szCs w:val="22"/>
+              </w:rPr>
+              <w:t>.</w:t>
             </w:r>
           </w:p>
         </w:tc>
@@ -15079,7 +15289,21 @@
               <w:rPr>
                 <w:szCs w:val="22"/>
               </w:rPr>
-              <w:t xml:space="preserve">Concrete mixes used within the project will seek to reduce Portland cement and aggregate content where deemed appropriate by the structural engineer. </w:t>
+              <w:t xml:space="preserve">Concrete mixes used within the project will seek to reduce Portland cement and aggregate content </w:t>
+            </w:r>
+            <w:proofErr w:type="gramStart"/>
+            <w:r>
+              <w:rPr>
+                <w:szCs w:val="22"/>
+              </w:rPr>
+              <w:t>where</w:t>
+            </w:r>
+            <w:proofErr w:type="gramEnd"/>
+            <w:r>
+              <w:rPr>
+                <w:szCs w:val="22"/>
+              </w:rPr>
+              <w:t xml:space="preserve"> deemed appropriate by the structural engineer. </w:t>
             </w:r>
           </w:p>
           <w:p>
@@ -15526,7 +15750,21 @@
               <w:rPr>
                 <w:szCs w:val="22"/>
               </w:rPr>
-              <w:t>The project will incorporate products that meet the transparency and sustainability requirements where deemed appropriate. This includes the following: reused products, recycled content products, environmental product declarations, third party certified and stewardship programs.</w:t>
+              <w:t xml:space="preserve">The project will incorporate products that meet the transparency and sustainability requirements </w:t>
+            </w:r>
+            <w:proofErr w:type="gramStart"/>
+            <w:r>
+              <w:rPr>
+                <w:szCs w:val="22"/>
+              </w:rPr>
+              <w:t>where</w:t>
+            </w:r>
+            <w:proofErr w:type="gramEnd"/>
+            <w:r>
+              <w:rPr>
+                <w:szCs w:val="22"/>
+              </w:rPr>
+              <w:t xml:space="preserve"> deemed appropriate. This includes the following: reused products, recycled content products, environmental product declarations, third party certified and stewardship programs.</w:t>
             </w:r>
           </w:p>
         </w:tc>
@@ -16123,7 +16361,21 @@
                 <w:szCs w:val="22"/>
               </w:rPr>
               <w:br/>
-              <w:t>Each tenancy is to be provided with separate general, recycling and food and organics waste bins. This requirement is to be included in the owners corporation rules or lease agreement.</w:t>
+              <w:t xml:space="preserve">Each tenancy is to be provided with separate general, recycling and food and organics waste bins. This requirement is to be included in the </w:t>
+            </w:r>
+            <w:proofErr w:type="gramStart"/>
+            <w:r>
+              <w:rPr>
+                <w:szCs w:val="22"/>
+              </w:rPr>
+              <w:t>owners</w:t>
+            </w:r>
+            <w:proofErr w:type="gramEnd"/>
+            <w:r>
+              <w:rPr>
+                <w:szCs w:val="22"/>
+              </w:rPr>
+              <w:t xml:space="preserve"> corporation rules or lease agreement.</w:t>
             </w:r>
             <w:r>
               <w:rPr>
@@ -17072,7 +17324,21 @@
               <w:rPr>
                 <w:szCs w:val="22"/>
               </w:rPr>
-              <w:t>Roofs are to have a three year SRI of minimum 60</w:t>
+              <w:t xml:space="preserve">Roofs are to have a </w:t>
+            </w:r>
+            <w:proofErr w:type="gramStart"/>
+            <w:r>
+              <w:rPr>
+                <w:szCs w:val="22"/>
+              </w:rPr>
+              <w:t>three year</w:t>
+            </w:r>
+            <w:proofErr w:type="gramEnd"/>
+            <w:r>
+              <w:rPr>
+                <w:szCs w:val="22"/>
+              </w:rPr>
+              <w:t xml:space="preserve"> SRI of minimum 60</w:t>
             </w:r>
             <w:r>
               <w:rPr>
@@ -17099,7 +17365,21 @@
               <w:rPr>
                 <w:szCs w:val="22"/>
               </w:rPr>
-              <w:t>Unshaded hard-scaping elements are to have a three year SRI of minimum 40.</w:t>
+              <w:t xml:space="preserve">Unshaded hard-scaping elements are to have a </w:t>
+            </w:r>
+            <w:proofErr w:type="gramStart"/>
+            <w:r>
+              <w:rPr>
+                <w:szCs w:val="22"/>
+              </w:rPr>
+              <w:t>three year</w:t>
+            </w:r>
+            <w:proofErr w:type="gramEnd"/>
+            <w:r>
+              <w:rPr>
+                <w:szCs w:val="22"/>
+              </w:rPr>
+              <w:t xml:space="preserve"> SRI of minimum 40.</w:t>
             </w:r>
           </w:p>
         </w:tc>
@@ -17534,7 +17814,21 @@
               <w:rPr>
                 <w:szCs w:val="22"/>
               </w:rPr>
-              <w:t xml:space="preserve">The proposed development will be established with a carbon neutral power agreement between developer, owner’s corporation, and electrical retailer to provide GreenPower for all energy consumed by building (including communal areas, apartments and retail tenancy). It is the intent to maintain this agreement for a minimum of 10 years. </w:t>
+              <w:t xml:space="preserve">The proposed development will be established with a carbon neutral power agreement between developer, owner’s corporation, and electrical retailer to provide </w:t>
+            </w:r>
+            <w:proofErr w:type="spellStart"/>
+            <w:r>
+              <w:rPr>
+                <w:szCs w:val="22"/>
+              </w:rPr>
+              <w:t>GreenPower</w:t>
+            </w:r>
+            <w:proofErr w:type="spellEnd"/>
+            <w:r>
+              <w:rPr>
+                <w:szCs w:val="22"/>
+              </w:rPr>
+              <w:t xml:space="preserve"> for all energy consumed by building (including communal areas, apartments and retail tenancy). It is the intent to maintain this agreement for a minimum of 10 years. </w:t>
             </w:r>
           </w:p>
         </w:tc>
@@ -17851,10 +18145,26 @@
         <w:t>Rainwater is to be collected from XX and directed into the</w:t>
       </w:r>
       <w:r>
-        <w:t xml:space="preserve"> [XX]</w:t>
+        <w:t xml:space="preserve"> </w:t>
+      </w:r>
+      <w:proofErr w:type="gramStart"/>
+      <w:r>
+        <w:t>[XX]</w:t>
       </w:r>
       <w:r>
-        <w:t xml:space="preserve"> litre rainwater tank. XX WC’s are to be connected to the rainwater tank.</w:t>
+        <w:t xml:space="preserve"> litre</w:t>
+      </w:r>
+      <w:proofErr w:type="gramEnd"/>
+      <w:r>
+        <w:t xml:space="preserve"> rainwater tank. XX </w:t>
+      </w:r>
+      <w:proofErr w:type="gramStart"/>
+      <w:r>
+        <w:t>WC’s</w:t>
+      </w:r>
+      <w:proofErr w:type="gramEnd"/>
+      <w:r>
+        <w:t xml:space="preserve"> are to be connected to the rainwater tank.</w:t>
       </w:r>
     </w:p>
     <w:p>
@@ -18506,7 +18816,15 @@
         <w:jc w:val="both"/>
       </w:pPr>
       <w:r>
-        <w:t>Introduction of offsite construction for building elements where deemed appropriate.</w:t>
+        <w:t xml:space="preserve">Introduction of offsite construction for building elements </w:t>
+      </w:r>
+      <w:proofErr w:type="gramStart"/>
+      <w:r>
+        <w:t>where</w:t>
+      </w:r>
+      <w:proofErr w:type="gramEnd"/>
+      <w:r>
+        <w:t xml:space="preserve"> deemed appropriate.</w:t>
       </w:r>
     </w:p>
     <w:p>
@@ -19425,7 +19743,21 @@
               <w:rPr>
                 <w:szCs w:val="22"/>
               </w:rPr>
-              <w:t xml:space="preserve">Clear inflow points of built up sediment, rubbish and leaves.  </w:t>
+              <w:t xml:space="preserve">Clear inflow points of </w:t>
+            </w:r>
+            <w:proofErr w:type="gramStart"/>
+            <w:r>
+              <w:rPr>
+                <w:szCs w:val="22"/>
+              </w:rPr>
+              <w:t>built up</w:t>
+            </w:r>
+            <w:proofErr w:type="gramEnd"/>
+            <w:r>
+              <w:rPr>
+                <w:szCs w:val="22"/>
+              </w:rPr>
+              <w:t xml:space="preserve"> sediment, rubbish and leaves.  </w:t>
             </w:r>
           </w:p>
           <w:p>
@@ -19985,7 +20317,21 @@
         <w:rPr>
           <w:rFonts w:eastAsia="Times New Roman" w:cs="Times New Roman"/>
         </w:rPr>
-        <w:t xml:space="preserve">The National Construction Code (NCC) Class 2 – Sole Occupancy Unit(s) residential building component is to be designed in accordance with NCC Section J (2022) NatHERS requirements. The residential units must achieve an average </w:t>
+        <w:t xml:space="preserve">The National Construction Code (NCC) Class 2 – Sole Occupancy Unit(s) residential building component is to be designed in accordance with NCC Section J (2022) </w:t>
+      </w:r>
+      <w:proofErr w:type="spellStart"/>
+      <w:r>
+        <w:rPr>
+          <w:rFonts w:eastAsia="Times New Roman" w:cs="Times New Roman"/>
+        </w:rPr>
+        <w:t>NatHERS</w:t>
+      </w:r>
+      <w:proofErr w:type="spellEnd"/>
+      <w:r>
+        <w:rPr>
+          <w:rFonts w:eastAsia="Times New Roman" w:cs="Times New Roman"/>
+        </w:rPr>
+        <w:t xml:space="preserve"> requirements. The residential units must achieve an average </w:t>
       </w:r>
       <w:r>
         <w:rPr>
@@ -20421,7 +20767,27 @@
           <w:color w:val="auto"/>
           <w:szCs w:val="22"/>
         </w:rPr>
-        <w:t xml:space="preserve">The apartments are currently achieving a X.X Star average. The below sample ratings demonstrate the developments ability to achieve </w:t>
+        <w:t xml:space="preserve">The apartments are currently achieving a X.X Star average. The below sample ratings demonstrate the </w:t>
+      </w:r>
+      <w:proofErr w:type="gramStart"/>
+      <w:r>
+        <w:rPr>
+          <w:rFonts w:ascii="Roboto Light" w:hAnsi="Roboto Light"/>
+          <w:b w:val="0"/>
+          <w:color w:val="auto"/>
+          <w:szCs w:val="22"/>
+        </w:rPr>
+        <w:t>developments</w:t>
+      </w:r>
+      <w:proofErr w:type="gramEnd"/>
+      <w:r>
+        <w:rPr>
+          <w:rFonts w:ascii="Roboto Light" w:hAnsi="Roboto Light"/>
+          <w:b w:val="0"/>
+          <w:color w:val="auto"/>
+          <w:szCs w:val="22"/>
+        </w:rPr>
+        <w:t xml:space="preserve"> ability to achieve </w:t>
       </w:r>
       <w:r>
         <w:rPr>
@@ -20548,6 +20914,7 @@
                 <w:color w:val="00602B" w:themeColor="accent1"/>
               </w:rPr>
             </w:pPr>
+            <w:proofErr w:type="gramStart"/>
             <w:r>
               <w:rPr>
                 <w:rFonts w:ascii="Roboto" w:hAnsi="Roboto"/>
@@ -20555,6 +20922,7 @@
               </w:rPr>
               <w:t>ACE  Heating</w:t>
             </w:r>
+            <w:proofErr w:type="gramEnd"/>
             <w:r>
               <w:rPr>
                 <w:rFonts w:ascii="Roboto" w:hAnsi="Roboto"/>
@@ -20589,6 +20957,7 @@
                 <w:color w:val="00602B" w:themeColor="accent1"/>
               </w:rPr>
             </w:pPr>
+            <w:proofErr w:type="gramStart"/>
             <w:r>
               <w:rPr>
                 <w:rFonts w:ascii="Roboto" w:hAnsi="Roboto"/>
@@ -20596,6 +20965,7 @@
               </w:rPr>
               <w:t>ACE  Cooling</w:t>
             </w:r>
+            <w:proofErr w:type="gramEnd"/>
             <w:r>
               <w:rPr>
                 <w:rFonts w:ascii="Roboto" w:hAnsi="Roboto"/>
@@ -20630,6 +21000,7 @@
                 <w:color w:val="00602B" w:themeColor="accent1"/>
               </w:rPr>
             </w:pPr>
+            <w:proofErr w:type="gramStart"/>
             <w:r>
               <w:rPr>
                 <w:rFonts w:ascii="Roboto" w:hAnsi="Roboto"/>
@@ -20637,6 +21008,7 @@
               </w:rPr>
               <w:t>ACE  NCFA</w:t>
             </w:r>
+            <w:proofErr w:type="gramEnd"/>
           </w:p>
         </w:tc>
         <w:tc>
@@ -21825,6 +22197,7 @@
                 <w:szCs w:val="22"/>
               </w:rPr>
             </w:pPr>
+            <w:proofErr w:type="gramStart"/>
             <w:r>
               <w:rPr>
                 <w:rFonts w:ascii="Roboto Light" w:hAnsi="Roboto Light"/>
@@ -21833,6 +22206,7 @@
               </w:rPr>
               <w:t>RX.X+RX.X</w:t>
             </w:r>
+            <w:proofErr w:type="gramEnd"/>
           </w:p>
         </w:tc>
       </w:tr>
@@ -22064,16 +22438,26 @@
                 <w:b w:val="0"/>
                 <w:szCs w:val="22"/>
               </w:rPr>
-              <w:t xml:space="preserve"> Argon filled, </w:t>
-            </w:r>
+              <w:t xml:space="preserve"> Argon </w:t>
+            </w:r>
+            <w:proofErr w:type="gramStart"/>
             <w:r>
               <w:rPr>
                 <w:rFonts w:ascii="Roboto Light" w:hAnsi="Roboto Light"/>
                 <w:b w:val="0"/>
                 <w:szCs w:val="22"/>
               </w:rPr>
+              <w:t xml:space="preserve">filled, </w:t>
+            </w:r>
+            <w:r>
+              <w:rPr>
+                <w:rFonts w:ascii="Roboto Light" w:hAnsi="Roboto Light"/>
+                <w:b w:val="0"/>
+                <w:szCs w:val="22"/>
+              </w:rPr>
               <w:t xml:space="preserve"> Clear</w:t>
             </w:r>
+            <w:proofErr w:type="gramEnd"/>
           </w:p>
         </w:tc>
         <w:tc>
@@ -22224,16 +22608,26 @@
                 <w:b w:val="0"/>
                 <w:szCs w:val="22"/>
               </w:rPr>
-              <w:t xml:space="preserve"> Argon filled, </w:t>
-            </w:r>
+              <w:t xml:space="preserve"> Argon </w:t>
+            </w:r>
+            <w:proofErr w:type="gramStart"/>
             <w:r>
               <w:rPr>
                 <w:rFonts w:ascii="Roboto Light" w:hAnsi="Roboto Light"/>
                 <w:b w:val="0"/>
                 <w:szCs w:val="22"/>
               </w:rPr>
+              <w:t xml:space="preserve">filled, </w:t>
+            </w:r>
+            <w:r>
+              <w:rPr>
+                <w:rFonts w:ascii="Roboto Light" w:hAnsi="Roboto Light"/>
+                <w:b w:val="0"/>
+                <w:szCs w:val="22"/>
+              </w:rPr>
               <w:t xml:space="preserve"> Clear</w:t>
             </w:r>
+            <w:proofErr w:type="gramEnd"/>
           </w:p>
         </w:tc>
         <w:tc>
@@ -22425,6 +22819,7 @@
       <w:pPr>
         <w:pStyle w:val="Heading3"/>
       </w:pPr>
+      <w:proofErr w:type="spellStart"/>
       <w:r>
         <w:rPr>
           <w:highlight w:val="yellow"/>
@@ -22441,7 +22836,14 @@
         <w:rPr>
           <w:highlight w:val="yellow"/>
         </w:rPr>
-        <w:t>atts Calculator</w:t>
+        <w:t>atts</w:t>
+      </w:r>
+      <w:proofErr w:type="spellEnd"/>
+      <w:r>
+        <w:rPr>
+          <w:highlight w:val="yellow"/>
+        </w:rPr>
+        <w:t xml:space="preserve"> Calculator</w:t>
       </w:r>
       <w:r>
         <w:br w:type="page"/>
@@ -33036,6 +33438,35 @@
         </w:p>
       </w:docPartBody>
     </w:docPart>
+    <w:docPart>
+      <w:docPartPr>
+        <w:name w:val="9F41AA2BDC594A199CE6F0670E45926C"/>
+        <w:category>
+          <w:name w:val="General"/>
+          <w:gallery w:val="placeholder"/>
+        </w:category>
+        <w:types>
+          <w:type w:val="bbPlcHdr"/>
+        </w:types>
+        <w:behaviors>
+          <w:behavior w:val="content"/>
+        </w:behaviors>
+        <w:guid w:val="{9B99D766-6013-4AA6-B42A-86C4A1C408FB}"/>
+      </w:docPartPr>
+      <w:docPartBody>
+        <w:p>
+          <w:pPr>
+            <w:pStyle w:val="9F41AA2BDC594A199CE6F0670E45926C"/>
+          </w:pPr>
+          <w:r>
+            <w:rPr>
+              <w:rStyle w:val="PlaceholderText"/>
+            </w:rPr>
+            <w:t>Choose an item.</w:t>
+          </w:r>
+        </w:p>
+      </w:docPartBody>
+    </w:docPart>
   </w:docParts>
 </w:glossaryDocument>
 </file>
@@ -33533,6 +33964,7 @@
     <w:rsid w:val="0041699F"/>
     <w:rsid w:val="00442A7F"/>
     <w:rsid w:val="0045519A"/>
+    <w:rsid w:val="004556FE"/>
     <w:rsid w:val="004558F6"/>
     <w:rsid w:val="00460782"/>
     <w:rsid w:val="004D7895"/>
@@ -33582,6 +34014,8 @@
     <w:rsid w:val="008F56B5"/>
     <w:rsid w:val="00910B2C"/>
     <w:rsid w:val="00916303"/>
+    <w:rsid w:val="0093443B"/>
+    <w:rsid w:val="00946496"/>
     <w:rsid w:val="0095765B"/>
     <w:rsid w:val="0096582F"/>
     <w:rsid w:val="00975BDB"/>
@@ -34099,7 +34533,7 @@
     <w:basedOn w:val="DefaultParagraphFont"/>
     <w:uiPriority w:val="99"/>
     <w:semiHidden/>
-    <w:rsid w:val="000237AA"/>
+    <w:rsid w:val="0093443B"/>
     <w:rPr>
       <w:color w:val="808080"/>
     </w:rPr>
@@ -34313,6 +34747,20 @@
   <w:style w:type="paragraph" w:customStyle="1" w:styleId="7FFC764F1F714EAF90EDBC9B656436E4">
     <w:name w:val="7FFC764F1F714EAF90EDBC9B656436E4"/>
     <w:rsid w:val="000237AA"/>
+    <w:pPr>
+      <w:spacing w:after="160" w:line="278" w:lineRule="auto"/>
+    </w:pPr>
+    <w:rPr>
+      <w:kern w:val="2"/>
+      <w:sz w:val="24"/>
+      <w:szCs w:val="24"/>
+      <w:lang w:val="en-CA" w:eastAsia="zh-CN"/>
+      <w14:ligatures w14:val="standardContextual"/>
+    </w:rPr>
+  </w:style>
+  <w:style w:type="paragraph" w:customStyle="1" w:styleId="9F41AA2BDC594A199CE6F0670E45926C">
+    <w:name w:val="9F41AA2BDC594A199CE6F0670E45926C"/>
+    <w:rsid w:val="0093443B"/>
     <w:pPr>
       <w:spacing w:after="160" w:line="278" w:lineRule="auto"/>
     </w:pPr>

</xml_diff>

<commit_message>
Fix shading/stormwater extraction, number formatting, and dropdown rules
- Extract [Shading]/[shading] directly from IEQ 3.2/3.4 commentsGIW in code rather than relying on Claude
- Extract Blue Factor score, collection area, raingarden size from IWM 2.1 commentsGIW in code
- Add formatNum() helper to add thousands commas to integers >999 (site area, tank size, etc.)
- Remove hot water system dropdown (no dropdown exists in templates)
- Fix pre-app meeting status check to handle Y/Yes/Achieved/Targeted
- Fix clothes drying dropdown text for Townhouse typology (townhouses, not apartments)
- Fix Building Reuse: remove incorrect ScopedOut → 'no existing building' assumption; now deletes row when not achieved

Co-Authored-By: Claude Sonnet 4.6 <noreply@anthropic.com>
</commit_message>
<xml_diff>
--- a/server/templates/DATE-GIWREF-Address-SMP-MixUse-2022-A.docx
+++ b/server/templates/DATE-GIWREF-Address-SMP-MixUse-2022-A.docx
@@ -97,6 +97,15 @@
               <w:rPr>
                 <w:rFonts w:ascii="Roboto" w:eastAsia="Roboto" w:hAnsi="Roboto" w:cs="Roboto"/>
                 <w:color w:val="FFFFFF"/>
+                <w:sz w:val="20"/>
+                <w:lang w:val="en-US"/>
+              </w:rPr>
+              <w:t>ed</w:t>
+            </w:r>
+            <w:r>
+              <w:rPr>
+                <w:rFonts w:ascii="Roboto" w:eastAsia="Roboto" w:hAnsi="Roboto" w:cs="Roboto"/>
+                <w:color w:val="FFFFFF"/>
                 <w:spacing w:val="-4"/>
                 <w:sz w:val="20"/>
                 <w:lang w:val="en-US"/>
@@ -224,7 +233,7 @@
                 <w:sz w:val="20"/>
                 <w:lang w:val="en-US"/>
               </w:rPr>
-              <w:t>19 June 2026</w:t>
+              <w:t>22 June 2026</w:t>
             </w:r>
             <w:r>
               <w:rPr>
@@ -1493,7 +1502,6 @@
               </w:rPr>
               <w:br/>
             </w:r>
-            <w:proofErr w:type="spellStart"/>
             <w:r>
               <w:rPr>
                 <w:b/>
@@ -1503,7 +1511,6 @@
               </w:rPr>
               <w:t>Firstname</w:t>
             </w:r>
-            <w:proofErr w:type="spellEnd"/>
             <w:r>
               <w:rPr>
                 <w:b/>
@@ -1764,11 +1771,11 @@
         <w:br w:type="page"/>
       </w:r>
     </w:p>
-    <w:bookmarkStart w:id="19" w:name="_Toc231555515" w:displacedByCustomXml="next"/>
-    <w:bookmarkStart w:id="20" w:name="_Toc209555290" w:displacedByCustomXml="next"/>
+    <w:bookmarkStart w:id="19" w:name="_Toc209592307" w:displacedByCustomXml="next"/>
+    <w:bookmarkStart w:id="20" w:name="_Toc209557015" w:displacedByCustomXml="next"/>
     <w:bookmarkStart w:id="21" w:name="_Toc209555543" w:displacedByCustomXml="next"/>
-    <w:bookmarkStart w:id="22" w:name="_Toc209557015" w:displacedByCustomXml="next"/>
-    <w:bookmarkStart w:id="23" w:name="_Toc209592307" w:displacedByCustomXml="next"/>
+    <w:bookmarkStart w:id="22" w:name="_Toc209555290" w:displacedByCustomXml="next"/>
+    <w:bookmarkStart w:id="23" w:name="_Toc231555515" w:displacedByCustomXml="next"/>
     <w:sdt>
       <w:sdtPr>
         <w:rPr>
@@ -3648,7 +3655,7 @@
         <w:t>[</w:t>
       </w:r>
       <w:r>
-        <w:t>XX</w:t>
+        <w:t>total apartments</w:t>
       </w:r>
       <w:r>
         <w:t>]</w:t>
@@ -3660,7 +3667,7 @@
         <w:t>[</w:t>
       </w:r>
       <w:r>
-        <w:t>XX</w:t>
+        <w:t>total retail</w:t>
       </w:r>
       <w:r>
         <w:t>]</w:t>
@@ -3672,7 +3679,7 @@
         <w:t>[</w:t>
       </w:r>
       <w:r>
-        <w:t>XX</w:t>
+        <w:t>total office</w:t>
       </w:r>
       <w:r>
         <w:t>]</w:t>
@@ -3684,7 +3691,7 @@
         <w:t>[</w:t>
       </w:r>
       <w:r>
-        <w:t>XX</w:t>
+        <w:t>building height</w:t>
       </w:r>
       <w:r>
         <w:t>]</w:t>
@@ -3731,24 +3738,11 @@
       <w:r>
         <w:t>XX</w:t>
       </w:r>
-      <w:proofErr w:type="gramStart"/>
       <w:r>
         <w:t>]</w:t>
       </w:r>
       <w:r>
-        <w:t xml:space="preserve">  x</w:t>
-      </w:r>
-      <w:proofErr w:type="gramEnd"/>
-      <w:r>
-        <w:t xml:space="preserve"> </w:t>
-      </w:r>
-      <w:proofErr w:type="gramStart"/>
-      <w:r>
-        <w:t>1 bedroom</w:t>
-      </w:r>
-      <w:proofErr w:type="gramEnd"/>
-      <w:r>
-        <w:t xml:space="preserve"> apartments</w:t>
+        <w:t xml:space="preserve">  x 1 bedroom apartments</w:t>
       </w:r>
     </w:p>
     <w:p>
@@ -3770,15 +3764,7 @@
         <w:t>]</w:t>
       </w:r>
       <w:r>
-        <w:t xml:space="preserve"> x </w:t>
-      </w:r>
-      <w:proofErr w:type="gramStart"/>
-      <w:r>
-        <w:t>2 bedroom</w:t>
-      </w:r>
-      <w:proofErr w:type="gramEnd"/>
-      <w:r>
-        <w:t xml:space="preserve"> apartments</w:t>
+        <w:t xml:space="preserve"> x 2 bedroom apartments</w:t>
       </w:r>
     </w:p>
     <w:p>
@@ -3800,15 +3786,7 @@
         <w:t>]</w:t>
       </w:r>
       <w:r>
-        <w:t xml:space="preserve"> x </w:t>
-      </w:r>
-      <w:proofErr w:type="gramStart"/>
-      <w:r>
-        <w:t>3 bedroom</w:t>
-      </w:r>
-      <w:proofErr w:type="gramEnd"/>
-      <w:r>
-        <w:t xml:space="preserve"> apartments</w:t>
+        <w:t xml:space="preserve"> x 3 bedroom apartments</w:t>
       </w:r>
     </w:p>
     <w:p>
@@ -3824,7 +3802,7 @@
         <w:t>[</w:t>
       </w:r>
       <w:r>
-        <w:t>XX</w:t>
+        <w:t>total area retail</w:t>
       </w:r>
       <w:r>
         <w:t>]</w:t>
@@ -3855,7 +3833,7 @@
         <w:t>[</w:t>
       </w:r>
       <w:r>
-        <w:t>XX</w:t>
+        <w:t>total area office</w:t>
       </w:r>
       <w:r>
         <w:t>]</w:t>
@@ -3884,7 +3862,7 @@
         <w:t>[</w:t>
       </w:r>
       <w:r>
-        <w:t>XX</w:t>
+        <w:t>site area</w:t>
       </w:r>
       <w:r>
         <w:t>]</w:t>
@@ -3905,7 +3883,7 @@
         <w:t>[</w:t>
       </w:r>
       <w:r>
-        <w:t>XX</w:t>
+        <w:t>distance to CBD</w:t>
       </w:r>
       <w:r>
         <w:t>]</w:t>
@@ -3993,13 +3971,8 @@
       <w:r>
         <w:t xml:space="preserve"> - </w:t>
       </w:r>
-      <w:proofErr w:type="gramStart"/>
       <w:r>
-        <w:t>Pre-existing</w:t>
-      </w:r>
-      <w:proofErr w:type="gramEnd"/>
-      <w:r>
-        <w:t xml:space="preserve"> sites at </w:t>
+        <w:t xml:space="preserve">Pre-existing sites at </w:t>
       </w:r>
       <w:sdt>
         <w:sdtPr>
@@ -5756,7 +5729,7 @@
                 <w:sz w:val="24"/>
                 <w:szCs w:val="24"/>
               </w:rPr>
-              <w:t>XX</w:t>
+              <w:t>BESS score</w:t>
             </w:r>
             <w:r>
               <w:rPr>
@@ -6163,7 +6136,7 @@
                 <w:color w:val="000000"/>
               </w:rPr>
               <w:drawing>
-                <wp:anchor distT="0" distB="0" distL="114300" distR="114300" simplePos="0" relativeHeight="251738112" behindDoc="1" locked="0" layoutInCell="1" allowOverlap="1" wp14:anchorId="22787630" wp14:editId="2E8DFD95">
+                <wp:anchor distT="0" distB="0" distL="114300" distR="114300" simplePos="0" relativeHeight="251738112" behindDoc="1" locked="0" layoutInCell="1" allowOverlap="1" wp14:anchorId="22787630" wp14:editId="698D7879">
                   <wp:simplePos x="0" y="0"/>
                   <wp:positionH relativeFrom="column">
                     <wp:posOffset>77470</wp:posOffset>
@@ -6289,23 +6262,13 @@
             <w:r>
               <w:fldChar w:fldCharType="end"/>
             </w:r>
-            <w:proofErr w:type="spellStart"/>
             <w:r>
               <w:rPr>
                 <w:rFonts w:eastAsiaTheme="minorEastAsia"/>
                 <w:szCs w:val="22"/>
                 <w:lang w:eastAsia="en-US"/>
               </w:rPr>
-              <w:t>NatHERS</w:t>
-            </w:r>
-            <w:proofErr w:type="spellEnd"/>
-            <w:r>
-              <w:rPr>
-                <w:rFonts w:eastAsiaTheme="minorEastAsia"/>
-                <w:szCs w:val="22"/>
-                <w:lang w:eastAsia="en-US"/>
-              </w:rPr>
-              <w:t xml:space="preserve"> Energy Rating.</w:t>
+              <w:t>NatHERS Energy Rating.</w:t>
             </w:r>
           </w:p>
         </w:tc>
@@ -6636,7 +6599,7 @@
                 <w:color w:val="000000"/>
               </w:rPr>
               <w:drawing>
-                <wp:anchor distT="0" distB="0" distL="114300" distR="114300" simplePos="0" relativeHeight="251739136" behindDoc="1" locked="0" layoutInCell="1" allowOverlap="1" wp14:anchorId="7055ECC5" wp14:editId="6C9BC2D3">
+                <wp:anchor distT="0" distB="0" distL="114300" distR="114300" simplePos="0" relativeHeight="251739136" behindDoc="1" locked="0" layoutInCell="1" allowOverlap="1" wp14:anchorId="7055ECC5" wp14:editId="7B6B9704">
                   <wp:simplePos x="0" y="0"/>
                   <wp:positionH relativeFrom="column">
                     <wp:posOffset>76200</wp:posOffset>
@@ -6718,23 +6681,13 @@
                 <w:lang w:eastAsia="en-US"/>
               </w:rPr>
             </w:pPr>
-            <w:proofErr w:type="gramStart"/>
             <w:r>
               <w:rPr>
                 <w:rFonts w:eastAsiaTheme="minorEastAsia"/>
                 <w:szCs w:val="22"/>
                 <w:lang w:eastAsia="en-US"/>
               </w:rPr>
-              <w:t>The majority of</w:t>
-            </w:r>
-            <w:proofErr w:type="gramEnd"/>
-            <w:r>
-              <w:rPr>
-                <w:rFonts w:eastAsiaTheme="minorEastAsia"/>
-                <w:szCs w:val="22"/>
-                <w:lang w:eastAsia="en-US"/>
-              </w:rPr>
-              <w:t xml:space="preserve"> the development meets BESS IEQ requirements.</w:t>
+              <w:t>The majority of the development meets BESS IEQ requirements.</w:t>
             </w:r>
           </w:p>
         </w:tc>
@@ -7647,7 +7600,7 @@
                 <w:color w:val="000000"/>
               </w:rPr>
               <w:drawing>
-                <wp:anchor distT="0" distB="0" distL="114300" distR="114300" simplePos="0" relativeHeight="251741184" behindDoc="1" locked="0" layoutInCell="1" allowOverlap="1" wp14:anchorId="63206793" wp14:editId="337D6516">
+                <wp:anchor distT="0" distB="0" distL="114300" distR="114300" simplePos="0" relativeHeight="251741184" behindDoc="1" locked="0" layoutInCell="1" allowOverlap="1" wp14:anchorId="63206793" wp14:editId="2DA05863">
                   <wp:simplePos x="0" y="0"/>
                   <wp:positionH relativeFrom="column">
                     <wp:posOffset>91440</wp:posOffset>
@@ -9073,7 +9026,7 @@
                 <w:color w:val="auto"/>
                 <w:szCs w:val="22"/>
               </w:rPr>
-              <w:t>100</w:t>
+              <w:t>[Blue Factor score]</w:t>
             </w:r>
             <w:r>
               <w:rPr>
@@ -9105,47 +9058,43 @@
               <w:rPr>
                 <w:szCs w:val="22"/>
               </w:rPr>
-              <w:t>Rainwater is to be collected from XX and directed into the</w:t>
-            </w:r>
-            <w:r>
-              <w:rPr>
-                <w:szCs w:val="22"/>
-              </w:rPr>
-              <w:t xml:space="preserve"> </w:t>
-            </w:r>
-            <w:proofErr w:type="gramStart"/>
-            <w:r>
-              <w:rPr>
-                <w:szCs w:val="22"/>
-              </w:rPr>
-              <w:t>[XX]</w:t>
-            </w:r>
-            <w:r>
-              <w:rPr>
-                <w:szCs w:val="22"/>
-              </w:rPr>
-              <w:t xml:space="preserve"> litre</w:t>
-            </w:r>
-            <w:proofErr w:type="gramEnd"/>
-            <w:r>
-              <w:rPr>
-                <w:szCs w:val="22"/>
-              </w:rPr>
-              <w:t xml:space="preserve"> rainwater tank. XX </w:t>
-            </w:r>
-            <w:proofErr w:type="gramStart"/>
-            <w:r>
-              <w:rPr>
-                <w:szCs w:val="22"/>
-              </w:rPr>
-              <w:t>WC’s</w:t>
-            </w:r>
-            <w:proofErr w:type="gramEnd"/>
-            <w:r>
-              <w:rPr>
-                <w:szCs w:val="22"/>
-              </w:rPr>
-              <w:t xml:space="preserve"> are to be connected to the rainwater tank.</w:t>
+              <w:t xml:space="preserve">Rainwater is to be collected from </w:t>
+            </w:r>
+            <w:r>
+              <w:rPr>
+                <w:szCs w:val="22"/>
+              </w:rPr>
+              <w:t>[collection area]m2</w:t>
+            </w:r>
+            <w:r>
+              <w:rPr>
+                <w:szCs w:val="22"/>
+              </w:rPr>
+              <w:t xml:space="preserve"> and directed into the</w:t>
+            </w:r>
+            <w:r>
+              <w:rPr>
+                <w:szCs w:val="22"/>
+              </w:rPr>
+              <w:t xml:space="preserve"> [</w:t>
+            </w:r>
+            <w:r>
+              <w:rPr>
+                <w:szCs w:val="22"/>
+              </w:rPr>
+              <w:t>rainwater tank size</w:t>
+            </w:r>
+            <w:r>
+              <w:rPr>
+                <w:szCs w:val="22"/>
+              </w:rPr>
+              <w:t>]</w:t>
+            </w:r>
+            <w:r>
+              <w:rPr>
+                <w:szCs w:val="22"/>
+              </w:rPr>
+              <w:t xml:space="preserve"> litre rainwater tank. XX WC’s are to be connected to the rainwater tank.</w:t>
             </w:r>
           </w:p>
           <w:p>
@@ -9161,7 +9110,19 @@
               <w:rPr>
                 <w:szCs w:val="22"/>
               </w:rPr>
-              <w:t>Rainwater is to be collected from XX and directed into a ≥XXm2, minimum 1,150mm deep raingarden with 300mm of extended detention.</w:t>
+              <w:t>Rainwater is to be collected from XX and directed into a ≥</w:t>
+            </w:r>
+            <w:r>
+              <w:rPr>
+                <w:szCs w:val="22"/>
+              </w:rPr>
+              <w:t>[raingarden size]</w:t>
+            </w:r>
+            <w:r>
+              <w:rPr>
+                <w:szCs w:val="22"/>
+              </w:rPr>
+              <w:t>m2, minimum 1,150mm deep raingarden with 300mm of extended detention.</w:t>
             </w:r>
           </w:p>
           <w:bookmarkEnd w:id="67"/>
@@ -9264,39 +9225,7 @@
                 <w:color w:val="auto"/>
                 <w:szCs w:val="22"/>
               </w:rPr>
-              <w:t xml:space="preserve">To reduce total potable </w:t>
-            </w:r>
-            <w:proofErr w:type="gramStart"/>
-            <w:r>
-              <w:rPr>
-                <w:color w:val="auto"/>
-                <w:szCs w:val="22"/>
-              </w:rPr>
-              <w:t>water</w:t>
-            </w:r>
-            <w:proofErr w:type="gramEnd"/>
-            <w:r>
-              <w:rPr>
-                <w:color w:val="auto"/>
-                <w:szCs w:val="22"/>
-              </w:rPr>
-              <w:t xml:space="preserve"> use due </w:t>
-            </w:r>
-            <w:proofErr w:type="gramStart"/>
-            <w:r>
-              <w:rPr>
-                <w:color w:val="auto"/>
-                <w:szCs w:val="22"/>
-              </w:rPr>
-              <w:t>through the use of</w:t>
-            </w:r>
-            <w:proofErr w:type="gramEnd"/>
-            <w:r>
-              <w:rPr>
-                <w:color w:val="auto"/>
-                <w:szCs w:val="22"/>
-              </w:rPr>
-              <w:t xml:space="preserve"> efficient fixtures, appliances, and the use of rainwater.</w:t>
+              <w:t>To reduce total potable water use due through the use of efficient fixtures, appliances, and the use of rainwater.</w:t>
             </w:r>
           </w:p>
         </w:tc>
@@ -9348,12 +9277,14 @@
                     <w:rPr>
                       <w:noProof/>
                       <w:szCs w:val="22"/>
+                      <w:lang w:val="fr-FR"/>
                     </w:rPr>
                   </w:pPr>
                   <w:r>
                     <w:rPr>
                       <w:noProof/>
                       <w:szCs w:val="22"/>
+                      <w:lang w:val="fr-FR"/>
                     </w:rPr>
                     <w:t xml:space="preserve">WELS </w:t>
                   </w:r>
@@ -9361,6 +9292,7 @@
                     <w:rPr>
                       <w:noProof/>
                       <w:szCs w:val="22"/>
+                      <w:lang w:val="fr-FR"/>
                     </w:rPr>
                     <w:t>[</w:t>
                   </w:r>
@@ -9368,13 +9300,15 @@
                     <w:rPr>
                       <w:noProof/>
                       <w:szCs w:val="22"/>
+                      <w:lang w:val="fr-FR"/>
                     </w:rPr>
-                    <w:t>4</w:t>
+                    <w:t>toilet WELS</w:t>
                   </w:r>
                   <w:r>
                     <w:rPr>
                       <w:noProof/>
                       <w:szCs w:val="22"/>
+                      <w:lang w:val="fr-FR"/>
                     </w:rPr>
                     <w:t>]</w:t>
                   </w:r>
@@ -9382,6 +9316,7 @@
                     <w:rPr>
                       <w:noProof/>
                       <w:szCs w:val="22"/>
+                      <w:lang w:val="fr-FR"/>
                     </w:rPr>
                     <w:t xml:space="preserve"> Star - Toilets</w:t>
                   </w:r>
@@ -9419,7 +9354,7 @@
                       <w:noProof/>
                       <w:szCs w:val="22"/>
                     </w:rPr>
-                    <w:t>5</w:t>
+                    <w:t>taps WELS</w:t>
                   </w:r>
                   <w:r>
                     <w:rPr>
@@ -9468,14 +9403,7 @@
                       <w:noProof/>
                       <w:szCs w:val="22"/>
                     </w:rPr>
-                    <w:t>[</w:t>
-                  </w:r>
-                  <w:r>
-                    <w:rPr>
-                      <w:noProof/>
-                      <w:szCs w:val="22"/>
-                    </w:rPr>
-                    <w:t>4</w:t>
+                    <w:t>[shower WELS</w:t>
                   </w:r>
                   <w:r>
                     <w:rPr>
@@ -9531,7 +9459,7 @@
                       <w:noProof/>
                       <w:szCs w:val="22"/>
                     </w:rPr>
-                    <w:t>5</w:t>
+                    <w:t>Dishwasher WELS</w:t>
                   </w:r>
                   <w:r>
                     <w:rPr>
@@ -9943,7 +9871,7 @@
               <w:rPr>
                 <w:szCs w:val="22"/>
               </w:rPr>
-              <w:t>XXX</w:t>
+              <w:t>rainwater tank size</w:t>
             </w:r>
             <w:r>
               <w:rPr>
@@ -9961,9 +9889,15 @@
               <w:rPr>
                 <w:szCs w:val="22"/>
               </w:rPr>
-              <w:t>litre rainwater tank will harvest rainwater from XXX</w:t>
+              <w:t xml:space="preserve">litre rainwater tank will harvest rainwater from </w:t>
             </w:r>
             <w:bookmarkEnd w:id="68"/>
+            <w:r>
+              <w:rPr>
+                <w:szCs w:val="22"/>
+              </w:rPr>
+              <w:t>[collection area]</w:t>
+            </w:r>
             <w:r>
               <w:rPr>
                 <w:szCs w:val="22"/>
@@ -10094,7 +10028,7 @@
                 <w:color w:val="auto"/>
                 <w:szCs w:val="22"/>
               </w:rPr>
-              <w:t xml:space="preserve">To ensure the efficient use of water and to reduce total operating potable water use through encouraging water efficient </w:t>
+              <w:t xml:space="preserve">To ensure the efficient use of water and to reduce total operating potable water use through </w:t>
             </w:r>
             <w:r>
               <w:rPr>
@@ -10102,7 +10036,7 @@
                 <w:szCs w:val="22"/>
               </w:rPr>
               <w:lastRenderedPageBreak/>
-              <w:t>landscape design.</w:t>
+              <w:t>encouraging water efficient landscape design.</w:t>
             </w:r>
           </w:p>
         </w:tc>
@@ -10130,7 +10064,6 @@
               <w:sdtPr>
                 <w:rPr>
                   <w:b/>
-                  <w:szCs w:val="22"/>
                 </w:rPr>
                 <w:alias w:val="Irrigation"/>
                 <w:tag w:val="Irrigation"/>
@@ -10250,21 +10183,7 @@
               <w:rPr>
                 <w:szCs w:val="22"/>
               </w:rPr>
-              <w:t xml:space="preserve"> (e.g. hydrant pump test water or SCV </w:t>
-            </w:r>
-            <w:proofErr w:type="spellStart"/>
-            <w:r>
-              <w:rPr>
-                <w:szCs w:val="22"/>
-              </w:rPr>
-              <w:t>annubar</w:t>
-            </w:r>
-            <w:proofErr w:type="spellEnd"/>
-            <w:r>
-              <w:rPr>
-                <w:szCs w:val="22"/>
-              </w:rPr>
-              <w:t xml:space="preserve"> test)</w:t>
+              <w:t xml:space="preserve"> (e.g. hydrant pump test water or SCV annubar test)</w:t>
             </w:r>
             <w:r>
               <w:rPr>
@@ -10593,21 +10512,7 @@
               <w:rPr>
                 <w:szCs w:val="22"/>
               </w:rPr>
-              <w:t xml:space="preserve">The National Construction Code (NCC) Class 2 – Sole Occupancy Unit(s) residential building component is to be designed in accordance with NCC Section J (2022) </w:t>
-            </w:r>
-            <w:proofErr w:type="spellStart"/>
-            <w:r>
-              <w:rPr>
-                <w:szCs w:val="22"/>
-              </w:rPr>
-              <w:t>NatHERS</w:t>
-            </w:r>
-            <w:proofErr w:type="spellEnd"/>
-            <w:r>
-              <w:rPr>
-                <w:szCs w:val="22"/>
-              </w:rPr>
-              <w:t xml:space="preserve"> requirements. The residential units must achieve an average </w:t>
+              <w:t xml:space="preserve">The National Construction Code (NCC) Class 2 – Sole Occupancy Unit(s) residential building component is to be designed in accordance with NCC Section J (2022) NatHERS requirements. The residential units must achieve an average </w:t>
             </w:r>
             <w:bookmarkStart w:id="72" w:name="FR_target"/>
             <w:r>
@@ -10620,7 +10525,7 @@
               <w:rPr>
                 <w:szCs w:val="22"/>
               </w:rPr>
-              <w:t>7.0</w:t>
+              <w:t>Average star rating</w:t>
             </w:r>
             <w:r>
               <w:rPr>
@@ -10925,14 +10830,7 @@
                 <w:bCs/>
                 <w:szCs w:val="22"/>
               </w:rPr>
-              <w:t>XX</w:t>
-            </w:r>
-            <w:r>
-              <w:rPr>
-                <w:bCs/>
-                <w:szCs w:val="22"/>
-              </w:rPr>
-              <w:t>%</w:t>
+              <w:t>DTS improvement</w:t>
             </w:r>
             <w:r>
               <w:rPr>
@@ -11338,7 +11236,19 @@
               <w:rPr>
                 <w:szCs w:val="22"/>
               </w:rPr>
-              <w:t>[XX]</w:t>
+              <w:t>[</w:t>
+            </w:r>
+            <w:r>
+              <w:rPr>
+                <w:szCs w:val="22"/>
+              </w:rPr>
+              <w:t>Hot water</w:t>
+            </w:r>
+            <w:r>
+              <w:rPr>
+                <w:szCs w:val="22"/>
+              </w:rPr>
+              <w:t>]</w:t>
             </w:r>
           </w:p>
         </w:tc>
@@ -12028,7 +11938,7 @@
                 <w:color w:val="auto"/>
                 <w:szCs w:val="22"/>
               </w:rPr>
-              <w:t>XX</w:t>
+              <w:t>solar PV</w:t>
             </w:r>
             <w:r>
               <w:rPr>
@@ -12064,7 +11974,7 @@
                 <w:color w:val="auto"/>
                 <w:szCs w:val="22"/>
               </w:rPr>
-              <w:t>XX</w:t>
+              <w:t>Solar PV output</w:t>
             </w:r>
             <w:r>
               <w:rPr>
@@ -12555,13 +12465,12 @@
                     </w:rPr>
                     <w:fldChar w:fldCharType="separate"/>
                   </w:r>
-                  <w:proofErr w:type="gramStart"/>
                   <w:r>
                     <w:rPr>
                       <w:rFonts w:eastAsia="SimSun" w:cs="Calibri"/>
                       <w:color w:val="000000"/>
                     </w:rPr>
-                    <w:t>XX</w:t>
+                    <w:t>daylight living</w:t>
                   </w:r>
                   <w:r>
                     <w:rPr>
@@ -12577,7 +12486,6 @@
                     </w:rPr>
                     <w:t>%</w:t>
                   </w:r>
-                  <w:proofErr w:type="gramEnd"/>
                   <w:r>
                     <w:rPr>
                       <w:rFonts w:eastAsia="SimSun" w:cs="Calibri"/>
@@ -12652,13 +12560,12 @@
                     </w:rPr>
                     <w:fldChar w:fldCharType="separate"/>
                   </w:r>
-                  <w:proofErr w:type="gramStart"/>
                   <w:r>
                     <w:rPr>
                       <w:rFonts w:eastAsia="SimSun" w:cs="Calibri"/>
                       <w:color w:val="000000"/>
                     </w:rPr>
-                    <w:t>XX</w:t>
+                    <w:t>daylight bedrooms</w:t>
                   </w:r>
                   <w:r>
                     <w:rPr>
@@ -12674,7 +12581,6 @@
                     </w:rPr>
                     <w:t>%</w:t>
                   </w:r>
-                  <w:proofErr w:type="gramEnd"/>
                   <w:r>
                     <w:rPr>
                       <w:rFonts w:eastAsia="SimSun" w:cs="Calibri"/>
@@ -12787,19 +12693,11 @@
               <w:t xml:space="preserve"> </w:t>
             </w:r>
             <w:bookmarkStart w:id="82" w:name="DTS"/>
-            <w:proofErr w:type="gramStart"/>
-            <w:r>
-              <w:rPr>
-                <w:szCs w:val="22"/>
-              </w:rPr>
-              <w:t>The majority of</w:t>
-            </w:r>
-            <w:proofErr w:type="gramEnd"/>
-            <w:r>
-              <w:rPr>
-                <w:szCs w:val="22"/>
-              </w:rPr>
-              <w:t xml:space="preserve"> the development complies with the Deemed-to-Satisfy method for IEQ prescribed by BESS.</w:t>
+            <w:r>
+              <w:rPr>
+                <w:szCs w:val="22"/>
+              </w:rPr>
+              <w:t>The majority of the development complies with the Deemed-to-Satisfy method for IEQ prescribed by BESS.</w:t>
             </w:r>
             <w:bookmarkEnd w:id="82"/>
             <w:r>
@@ -12970,7 +12868,13 @@
               <w:rPr>
                 <w:szCs w:val="22"/>
               </w:rPr>
-              <w:t>XX% (XX out of XX)</w:t>
+              <w:t>natural ventilation</w:t>
+            </w:r>
+            <w:r>
+              <w:rPr>
+                <w:szCs w:val="22"/>
+              </w:rPr>
+              <w:t>% (XX out of XX)</w:t>
             </w:r>
             <w:r>
               <w:rPr>
@@ -13090,7 +12994,19 @@
               <w:rPr>
                 <w:szCs w:val="22"/>
               </w:rPr>
-              <w:t>[XX]</w:t>
+              <w:t>[</w:t>
+            </w:r>
+            <w:r>
+              <w:rPr>
+                <w:szCs w:val="22"/>
+              </w:rPr>
+              <w:t>daylight non-resi</w:t>
+            </w:r>
+            <w:r>
+              <w:rPr>
+                <w:szCs w:val="22"/>
+              </w:rPr>
+              <w:t>]</w:t>
             </w:r>
             <w:r>
               <w:rPr>
@@ -13276,7 +13192,13 @@
               <w:rPr>
                 <w:szCs w:val="22"/>
               </w:rPr>
-              <w:t xml:space="preserve">XX% </w:t>
+              <w:t>winter sunlight</w:t>
+            </w:r>
+            <w:r>
+              <w:rPr>
+                <w:szCs w:val="22"/>
+              </w:rPr>
+              <w:t xml:space="preserve">% </w:t>
             </w:r>
             <w:bookmarkEnd w:id="85"/>
             <w:r>
@@ -13317,21 +13239,12 @@
                 <w:lang w:val="fr-FR"/>
               </w:rPr>
             </w:pPr>
-            <w:proofErr w:type="spellStart"/>
             <w:r>
               <w:rPr>
                 <w:szCs w:val="22"/>
                 <w:lang w:val="fr-FR"/>
               </w:rPr>
-              <w:t>Refer</w:t>
-            </w:r>
-            <w:proofErr w:type="spellEnd"/>
-            <w:r>
-              <w:rPr>
-                <w:szCs w:val="22"/>
-                <w:lang w:val="fr-FR"/>
-              </w:rPr>
-              <w:t xml:space="preserve"> </w:t>
+              <w:t xml:space="preserve">Refer </w:t>
             </w:r>
             <w:r>
               <w:fldChar w:fldCharType="begin"/>
@@ -13385,18 +13298,8 @@
                 <w:color w:val="00602B" w:themeColor="text2"/>
                 <w:szCs w:val="22"/>
               </w:rPr>
-              <w:t xml:space="preserve">Ventilation – </w:t>
-            </w:r>
-            <w:proofErr w:type="gramStart"/>
-            <w:r>
-              <w:rPr>
-                <w:rFonts w:ascii="Roboto" w:hAnsi="Roboto"/>
-                <w:color w:val="00602B" w:themeColor="text2"/>
-                <w:szCs w:val="22"/>
-              </w:rPr>
-              <w:t>Non-Residential</w:t>
-            </w:r>
-            <w:proofErr w:type="gramEnd"/>
+              <w:t>Ventilation – Non-Residential</w:t>
+            </w:r>
           </w:p>
         </w:tc>
         <w:tc>
@@ -13436,7 +13339,13 @@
               <w:jc w:val="both"/>
             </w:pPr>
             <w:r>
-              <w:t>[XX]</w:t>
+              <w:t>[</w:t>
+            </w:r>
+            <w:r>
+              <w:t>ventilation non-resi</w:t>
+            </w:r>
+            <w:r>
+              <w:t>]</w:t>
             </w:r>
           </w:p>
           <w:p>
@@ -13550,34 +13459,7 @@
               <w:rPr>
                 <w:szCs w:val="22"/>
               </w:rPr>
-              <w:t>XXX</w:t>
-            </w:r>
-            <w:r>
-              <w:rPr>
-                <w:szCs w:val="22"/>
-              </w:rPr>
-              <w:t>.</w:t>
-            </w:r>
-          </w:p>
-          <w:p>
-            <w:pPr>
-              <w:pStyle w:val="ListBullet"/>
-              <w:jc w:val="both"/>
-              <w:rPr>
-                <w:szCs w:val="22"/>
-              </w:rPr>
-            </w:pPr>
-            <w:r>
-              <w:rPr>
-                <w:szCs w:val="22"/>
-              </w:rPr>
-              <w:t>XXX</w:t>
-            </w:r>
-            <w:r>
-              <w:rPr>
-                <w:szCs w:val="22"/>
-              </w:rPr>
-              <w:t>.</w:t>
+              <w:t>[Shading]</w:t>
             </w:r>
           </w:p>
         </w:tc>
@@ -13670,25 +13552,7 @@
               <w:rPr>
                 <w:szCs w:val="22"/>
               </w:rPr>
-              <w:t>XXX</w:t>
-            </w:r>
-            <w:r>
-              <w:rPr>
-                <w:szCs w:val="22"/>
-              </w:rPr>
-              <w:t>.</w:t>
-            </w:r>
-          </w:p>
-          <w:p>
-            <w:pPr>
-              <w:pStyle w:val="ListBullet"/>
-              <w:jc w:val="both"/>
-              <w:rPr>
-                <w:szCs w:val="22"/>
-              </w:rPr>
-            </w:pPr>
-            <w:r>
-              <w:t>XXX.</w:t>
+              <w:t>[Shading non-resi]</w:t>
             </w:r>
           </w:p>
         </w:tc>
@@ -13752,7 +13616,7 @@
               <w:rPr>
                 <w:szCs w:val="22"/>
               </w:rPr>
-              <w:t>XX</w:t>
+              <w:t>fans</w:t>
             </w:r>
             <w:r>
               <w:rPr>
@@ -14240,7 +14104,7 @@
               <w:rPr>
                 <w:szCs w:val="22"/>
               </w:rPr>
-              <w:t>XX</w:t>
+              <w:t>residential bikes</w:t>
             </w:r>
             <w:r>
               <w:rPr>
@@ -14294,7 +14158,7 @@
               <w:rPr>
                 <w:szCs w:val="22"/>
               </w:rPr>
-              <w:t>XX</w:t>
+              <w:t>residential visitor bikes</w:t>
             </w:r>
             <w:r>
               <w:rPr>
@@ -14313,21 +14177,7 @@
               <w:rPr>
                 <w:szCs w:val="22"/>
               </w:rPr>
-              <w:t xml:space="preserve"> This will provide a ratio of approximately 1 visitor bicycle space for every X </w:t>
-            </w:r>
-            <w:proofErr w:type="gramStart"/>
-            <w:r>
-              <w:rPr>
-                <w:szCs w:val="22"/>
-              </w:rPr>
-              <w:t>apartments</w:t>
-            </w:r>
-            <w:proofErr w:type="gramEnd"/>
-            <w:r>
-              <w:rPr>
-                <w:szCs w:val="22"/>
-              </w:rPr>
-              <w:t>.</w:t>
+              <w:t xml:space="preserve"> This will provide a ratio of approximately 1 visitor bicycle space for every X apartments.</w:t>
             </w:r>
           </w:p>
         </w:tc>
@@ -14426,7 +14276,7 @@
               <w:rPr>
                 <w:szCs w:val="22"/>
               </w:rPr>
-              <w:t>XX</w:t>
+              <w:t>employee bikes</w:t>
             </w:r>
             <w:r>
               <w:rPr>
@@ -14480,7 +14330,7 @@
               <w:rPr>
                 <w:szCs w:val="22"/>
               </w:rPr>
-              <w:t>XX</w:t>
+              <w:t>commercial visitor bikes</w:t>
             </w:r>
             <w:r>
               <w:rPr>
@@ -14607,7 +14457,7 @@
               <w:rPr>
                 <w:szCs w:val="22"/>
               </w:rPr>
-              <w:t>XX</w:t>
+              <w:t>EOT showers</w:t>
             </w:r>
             <w:r>
               <w:rPr>
@@ -14631,7 +14481,7 @@
               <w:rPr>
                 <w:szCs w:val="22"/>
               </w:rPr>
-              <w:t>XX</w:t>
+              <w:t>EOT lockers</w:t>
             </w:r>
             <w:r>
               <w:rPr>
@@ -14987,7 +14837,19 @@
               <w:rPr>
                 <w:szCs w:val="22"/>
               </w:rPr>
-              <w:t>[XX]</w:t>
+              <w:t>[</w:t>
+            </w:r>
+            <w:r>
+              <w:rPr>
+                <w:szCs w:val="22"/>
+              </w:rPr>
+              <w:t>motorbikes</w:t>
+            </w:r>
+            <w:r>
+              <w:rPr>
+                <w:szCs w:val="22"/>
+              </w:rPr>
+              <w:t>]</w:t>
             </w:r>
             <w:r>
               <w:rPr>
@@ -15289,21 +15151,7 @@
               <w:rPr>
                 <w:szCs w:val="22"/>
               </w:rPr>
-              <w:t xml:space="preserve">Concrete mixes used within the project will seek to reduce Portland cement and aggregate content </w:t>
-            </w:r>
-            <w:proofErr w:type="gramStart"/>
-            <w:r>
-              <w:rPr>
-                <w:szCs w:val="22"/>
-              </w:rPr>
-              <w:t>where</w:t>
-            </w:r>
-            <w:proofErr w:type="gramEnd"/>
-            <w:r>
-              <w:rPr>
-                <w:szCs w:val="22"/>
-              </w:rPr>
-              <w:t xml:space="preserve"> deemed appropriate by the structural engineer. </w:t>
+              <w:t xml:space="preserve">Concrete mixes used within the project will seek to reduce Portland cement and aggregate content where deemed appropriate by the structural engineer. </w:t>
             </w:r>
           </w:p>
           <w:p>
@@ -15750,21 +15598,7 @@
               <w:rPr>
                 <w:szCs w:val="22"/>
               </w:rPr>
-              <w:t xml:space="preserve">The project will incorporate products that meet the transparency and sustainability requirements </w:t>
-            </w:r>
-            <w:proofErr w:type="gramStart"/>
-            <w:r>
-              <w:rPr>
-                <w:szCs w:val="22"/>
-              </w:rPr>
-              <w:t>where</w:t>
-            </w:r>
-            <w:proofErr w:type="gramEnd"/>
-            <w:r>
-              <w:rPr>
-                <w:szCs w:val="22"/>
-              </w:rPr>
-              <w:t xml:space="preserve"> deemed appropriate. This includes the following: reused products, recycled content products, environmental product declarations, third party certified and stewardship programs.</w:t>
+              <w:t>The project will incorporate products that meet the transparency and sustainability requirements where deemed appropriate. This includes the following: reused products, recycled content products, environmental product declarations, third party certified and stewardship programs.</w:t>
             </w:r>
           </w:p>
         </w:tc>
@@ -16361,21 +16195,7 @@
                 <w:szCs w:val="22"/>
               </w:rPr>
               <w:br/>
-              <w:t xml:space="preserve">Each tenancy is to be provided with separate general, recycling and food and organics waste bins. This requirement is to be included in the </w:t>
-            </w:r>
-            <w:proofErr w:type="gramStart"/>
-            <w:r>
-              <w:rPr>
-                <w:szCs w:val="22"/>
-              </w:rPr>
-              <w:t>owners</w:t>
-            </w:r>
-            <w:proofErr w:type="gramEnd"/>
-            <w:r>
-              <w:rPr>
-                <w:szCs w:val="22"/>
-              </w:rPr>
-              <w:t xml:space="preserve"> corporation rules or lease agreement.</w:t>
+              <w:t>Each tenancy is to be provided with separate general, recycling and food and organics waste bins. This requirement is to be included in the owners corporation rules or lease agreement.</w:t>
             </w:r>
             <w:r>
               <w:rPr>
@@ -16717,7 +16537,7 @@
               <w:rPr>
                 <w:szCs w:val="22"/>
               </w:rPr>
-              <w:t>XX</w:t>
+              <w:t>communal area</w:t>
             </w:r>
             <w:r>
               <w:rPr>
@@ -16915,7 +16735,7 @@
               <w:rPr>
                 <w:szCs w:val="22"/>
               </w:rPr>
-              <w:t>XX</w:t>
+              <w:t>vegetation</w:t>
             </w:r>
             <w:r>
               <w:rPr>
@@ -17215,7 +17035,7 @@
               <w:rPr>
                 <w:szCs w:val="22"/>
               </w:rPr>
-              <w:t>XX</w:t>
+              <w:t>food production area</w:t>
             </w:r>
             <w:r>
               <w:rPr>
@@ -17324,21 +17144,7 @@
               <w:rPr>
                 <w:szCs w:val="22"/>
               </w:rPr>
-              <w:t xml:space="preserve">Roofs are to have a </w:t>
-            </w:r>
-            <w:proofErr w:type="gramStart"/>
-            <w:r>
-              <w:rPr>
-                <w:szCs w:val="22"/>
-              </w:rPr>
-              <w:t>three year</w:t>
-            </w:r>
-            <w:proofErr w:type="gramEnd"/>
-            <w:r>
-              <w:rPr>
-                <w:szCs w:val="22"/>
-              </w:rPr>
-              <w:t xml:space="preserve"> SRI of minimum 60</w:t>
+              <w:t>Roofs are to have a three year SRI of minimum 60</w:t>
             </w:r>
             <w:r>
               <w:rPr>
@@ -17365,21 +17171,7 @@
               <w:rPr>
                 <w:szCs w:val="22"/>
               </w:rPr>
-              <w:t xml:space="preserve">Unshaded hard-scaping elements are to have a </w:t>
-            </w:r>
-            <w:proofErr w:type="gramStart"/>
-            <w:r>
-              <w:rPr>
-                <w:szCs w:val="22"/>
-              </w:rPr>
-              <w:t>three year</w:t>
-            </w:r>
-            <w:proofErr w:type="gramEnd"/>
-            <w:r>
-              <w:rPr>
-                <w:szCs w:val="22"/>
-              </w:rPr>
-              <w:t xml:space="preserve"> SRI of minimum 40.</w:t>
+              <w:t>Unshaded hard-scaping elements are to have a three year SRI of minimum 40.</w:t>
             </w:r>
           </w:p>
         </w:tc>
@@ -17814,21 +17606,7 @@
               <w:rPr>
                 <w:szCs w:val="22"/>
               </w:rPr>
-              <w:t xml:space="preserve">The proposed development will be established with a carbon neutral power agreement between developer, owner’s corporation, and electrical retailer to provide </w:t>
-            </w:r>
-            <w:proofErr w:type="spellStart"/>
-            <w:r>
-              <w:rPr>
-                <w:szCs w:val="22"/>
-              </w:rPr>
-              <w:t>GreenPower</w:t>
-            </w:r>
-            <w:proofErr w:type="spellEnd"/>
-            <w:r>
-              <w:rPr>
-                <w:szCs w:val="22"/>
-              </w:rPr>
-              <w:t xml:space="preserve"> for all energy consumed by building (including communal areas, apartments and retail tenancy). It is the intent to maintain this agreement for a minimum of 10 years. </w:t>
+              <w:t xml:space="preserve">The proposed development will be established with a carbon neutral power agreement between developer, owner’s corporation, and electrical retailer to provide GreenPower for all energy consumed by building (including communal areas, apartments and retail tenancy). It is the intent to maintain this agreement for a minimum of 10 years. </w:t>
             </w:r>
           </w:p>
         </w:tc>
@@ -18142,29 +17920,19 @@
         <w:fldChar w:fldCharType="separate"/>
       </w:r>
       <w:r>
-        <w:t>Rainwater is to be collected from XX and directed into the</w:t>
+        <w:t xml:space="preserve">Rainwater is to be collected from </w:t>
       </w:r>
       <w:r>
-        <w:t xml:space="preserve"> </w:t>
-      </w:r>
-      <w:proofErr w:type="gramStart"/>
-      <w:r>
-        <w:t>[XX]</w:t>
+        <w:t>[collection area]m2</w:t>
       </w:r>
       <w:r>
-        <w:t xml:space="preserve"> litre</w:t>
+        <w:t xml:space="preserve"> and directed into the</w:t>
       </w:r>
-      <w:proofErr w:type="gramEnd"/>
       <w:r>
-        <w:t xml:space="preserve"> rainwater tank. XX </w:t>
+        <w:t xml:space="preserve"> [rainwater tank size]</w:t>
       </w:r>
-      <w:proofErr w:type="gramStart"/>
       <w:r>
-        <w:t>WC’s</w:t>
-      </w:r>
-      <w:proofErr w:type="gramEnd"/>
-      <w:r>
-        <w:t xml:space="preserve"> are to be connected to the rainwater tank.</w:t>
+        <w:t xml:space="preserve"> litre rainwater tank. XX WC’s are to be connected to the rainwater tank.</w:t>
       </w:r>
     </w:p>
     <w:p>
@@ -18174,7 +17942,13 @@
         <w:jc w:val="both"/>
       </w:pPr>
       <w:r>
-        <w:t>Rainwater is to be collected from XX and directed into a ≥XXm2, minimum 1,150mm deep raingarden with 300mm of extended detention.</w:t>
+        <w:t>Rainwater is to be collected from XX and directed into a ≥</w:t>
+      </w:r>
+      <w:r>
+        <w:t>[raingarden size]</w:t>
+      </w:r>
+      <w:r>
+        <w:t>m2, minimum 1,150mm deep raingarden with 300mm of extended detention.</w:t>
       </w:r>
     </w:p>
     <w:p>
@@ -18288,7 +18062,7 @@
         <w:rPr>
           <w:highlight w:val="yellow"/>
         </w:rPr>
-        <w:t>XX</w:t>
+        <w:t>rainwater tank size</w:t>
       </w:r>
       <w:r>
         <w:rPr>
@@ -18526,7 +18300,19 @@
         <w:rPr>
           <w:highlight w:val="yellow"/>
         </w:rPr>
-        <w:t>a ≥XXm</w:t>
+        <w:t>a ≥</w:t>
+      </w:r>
+      <w:r>
+        <w:rPr>
+          <w:highlight w:val="yellow"/>
+        </w:rPr>
+        <w:t>[raingarden size]</w:t>
+      </w:r>
+      <w:r>
+        <w:rPr>
+          <w:highlight w:val="yellow"/>
+        </w:rPr>
+        <w:t>m</w:t>
       </w:r>
       <w:r>
         <w:rPr>
@@ -18816,15 +18602,7 @@
         <w:jc w:val="both"/>
       </w:pPr>
       <w:r>
-        <w:t xml:space="preserve">Introduction of offsite construction for building elements </w:t>
-      </w:r>
-      <w:proofErr w:type="gramStart"/>
-      <w:r>
-        <w:t>where</w:t>
-      </w:r>
-      <w:proofErr w:type="gramEnd"/>
-      <w:r>
-        <w:t xml:space="preserve"> deemed appropriate.</w:t>
+        <w:t>Introduction of offsite construction for building elements where deemed appropriate.</w:t>
       </w:r>
     </w:p>
     <w:p>
@@ -19743,21 +19521,7 @@
               <w:rPr>
                 <w:szCs w:val="22"/>
               </w:rPr>
-              <w:t xml:space="preserve">Clear inflow points of </w:t>
-            </w:r>
-            <w:proofErr w:type="gramStart"/>
-            <w:r>
-              <w:rPr>
-                <w:szCs w:val="22"/>
-              </w:rPr>
-              <w:t>built up</w:t>
-            </w:r>
-            <w:proofErr w:type="gramEnd"/>
-            <w:r>
-              <w:rPr>
-                <w:szCs w:val="22"/>
-              </w:rPr>
-              <w:t xml:space="preserve"> sediment, rubbish and leaves.  </w:t>
+              <w:t xml:space="preserve">Clear inflow points of built up sediment, rubbish and leaves.  </w:t>
             </w:r>
           </w:p>
           <w:p>
@@ -20317,21 +20081,7 @@
         <w:rPr>
           <w:rFonts w:eastAsia="Times New Roman" w:cs="Times New Roman"/>
         </w:rPr>
-        <w:t xml:space="preserve">The National Construction Code (NCC) Class 2 – Sole Occupancy Unit(s) residential building component is to be designed in accordance with NCC Section J (2022) </w:t>
-      </w:r>
-      <w:proofErr w:type="spellStart"/>
-      <w:r>
-        <w:rPr>
-          <w:rFonts w:eastAsia="Times New Roman" w:cs="Times New Roman"/>
-        </w:rPr>
-        <w:t>NatHERS</w:t>
-      </w:r>
-      <w:proofErr w:type="spellEnd"/>
-      <w:r>
-        <w:rPr>
-          <w:rFonts w:eastAsia="Times New Roman" w:cs="Times New Roman"/>
-        </w:rPr>
-        <w:t xml:space="preserve"> requirements. The residential units must achieve an average </w:t>
+        <w:t xml:space="preserve">The National Construction Code (NCC) Class 2 – Sole Occupancy Unit(s) residential building component is to be designed in accordance with NCC Section J (2022) NatHERS requirements. The residential units must achieve an average </w:t>
       </w:r>
       <w:r>
         <w:rPr>
@@ -20767,27 +20517,7 @@
           <w:color w:val="auto"/>
           <w:szCs w:val="22"/>
         </w:rPr>
-        <w:t xml:space="preserve">The apartments are currently achieving a X.X Star average. The below sample ratings demonstrate the </w:t>
-      </w:r>
-      <w:proofErr w:type="gramStart"/>
-      <w:r>
-        <w:rPr>
-          <w:rFonts w:ascii="Roboto Light" w:hAnsi="Roboto Light"/>
-          <w:b w:val="0"/>
-          <w:color w:val="auto"/>
-          <w:szCs w:val="22"/>
-        </w:rPr>
-        <w:t>developments</w:t>
-      </w:r>
-      <w:proofErr w:type="gramEnd"/>
-      <w:r>
-        <w:rPr>
-          <w:rFonts w:ascii="Roboto Light" w:hAnsi="Roboto Light"/>
-          <w:b w:val="0"/>
-          <w:color w:val="auto"/>
-          <w:szCs w:val="22"/>
-        </w:rPr>
-        <w:t xml:space="preserve"> ability to achieve </w:t>
+        <w:t xml:space="preserve">The apartments are currently achieving a X.X Star average. The below sample ratings demonstrate the developments ability to achieve </w:t>
       </w:r>
       <w:r>
         <w:rPr>
@@ -20914,7 +20644,6 @@
                 <w:color w:val="00602B" w:themeColor="accent1"/>
               </w:rPr>
             </w:pPr>
-            <w:proofErr w:type="gramStart"/>
             <w:r>
               <w:rPr>
                 <w:rFonts w:ascii="Roboto" w:hAnsi="Roboto"/>
@@ -20922,7 +20651,6 @@
               </w:rPr>
               <w:t>ACE  Heating</w:t>
             </w:r>
-            <w:proofErr w:type="gramEnd"/>
             <w:r>
               <w:rPr>
                 <w:rFonts w:ascii="Roboto" w:hAnsi="Roboto"/>
@@ -20957,7 +20685,6 @@
                 <w:color w:val="00602B" w:themeColor="accent1"/>
               </w:rPr>
             </w:pPr>
-            <w:proofErr w:type="gramStart"/>
             <w:r>
               <w:rPr>
                 <w:rFonts w:ascii="Roboto" w:hAnsi="Roboto"/>
@@ -20965,7 +20692,6 @@
               </w:rPr>
               <w:t>ACE  Cooling</w:t>
             </w:r>
-            <w:proofErr w:type="gramEnd"/>
             <w:r>
               <w:rPr>
                 <w:rFonts w:ascii="Roboto" w:hAnsi="Roboto"/>
@@ -21000,7 +20726,6 @@
                 <w:color w:val="00602B" w:themeColor="accent1"/>
               </w:rPr>
             </w:pPr>
-            <w:proofErr w:type="gramStart"/>
             <w:r>
               <w:rPr>
                 <w:rFonts w:ascii="Roboto" w:hAnsi="Roboto"/>
@@ -21008,7 +20733,6 @@
               </w:rPr>
               <w:t>ACE  NCFA</w:t>
             </w:r>
-            <w:proofErr w:type="gramEnd"/>
           </w:p>
         </w:tc>
         <w:tc>
@@ -22197,7 +21921,6 @@
                 <w:szCs w:val="22"/>
               </w:rPr>
             </w:pPr>
-            <w:proofErr w:type="gramStart"/>
             <w:r>
               <w:rPr>
                 <w:rFonts w:ascii="Roboto Light" w:hAnsi="Roboto Light"/>
@@ -22206,7 +21929,6 @@
               </w:rPr>
               <w:t>RX.X+RX.X</w:t>
             </w:r>
-            <w:proofErr w:type="gramEnd"/>
           </w:p>
         </w:tc>
       </w:tr>
@@ -22438,26 +22160,16 @@
                 <w:b w:val="0"/>
                 <w:szCs w:val="22"/>
               </w:rPr>
-              <w:t xml:space="preserve"> Argon </w:t>
-            </w:r>
-            <w:proofErr w:type="gramStart"/>
+              <w:t xml:space="preserve"> Argon filled, </w:t>
+            </w:r>
             <w:r>
               <w:rPr>
                 <w:rFonts w:ascii="Roboto Light" w:hAnsi="Roboto Light"/>
                 <w:b w:val="0"/>
                 <w:szCs w:val="22"/>
               </w:rPr>
-              <w:t xml:space="preserve">filled, </w:t>
-            </w:r>
-            <w:r>
-              <w:rPr>
-                <w:rFonts w:ascii="Roboto Light" w:hAnsi="Roboto Light"/>
-                <w:b w:val="0"/>
-                <w:szCs w:val="22"/>
-              </w:rPr>
               <w:t xml:space="preserve"> Clear</w:t>
             </w:r>
-            <w:proofErr w:type="gramEnd"/>
           </w:p>
         </w:tc>
         <w:tc>
@@ -22608,26 +22320,16 @@
                 <w:b w:val="0"/>
                 <w:szCs w:val="22"/>
               </w:rPr>
-              <w:t xml:space="preserve"> Argon </w:t>
-            </w:r>
-            <w:proofErr w:type="gramStart"/>
+              <w:t xml:space="preserve"> Argon filled, </w:t>
+            </w:r>
             <w:r>
               <w:rPr>
                 <w:rFonts w:ascii="Roboto Light" w:hAnsi="Roboto Light"/>
                 <w:b w:val="0"/>
                 <w:szCs w:val="22"/>
               </w:rPr>
-              <w:t xml:space="preserve">filled, </w:t>
-            </w:r>
-            <w:r>
-              <w:rPr>
-                <w:rFonts w:ascii="Roboto Light" w:hAnsi="Roboto Light"/>
-                <w:b w:val="0"/>
-                <w:szCs w:val="22"/>
-              </w:rPr>
               <w:t xml:space="preserve"> Clear</w:t>
             </w:r>
-            <w:proofErr w:type="gramEnd"/>
           </w:p>
         </w:tc>
         <w:tc>
@@ -22819,7 +22521,6 @@
       <w:pPr>
         <w:pStyle w:val="Heading3"/>
       </w:pPr>
-      <w:proofErr w:type="spellStart"/>
       <w:r>
         <w:rPr>
           <w:highlight w:val="yellow"/>
@@ -22836,14 +22537,7 @@
         <w:rPr>
           <w:highlight w:val="yellow"/>
         </w:rPr>
-        <w:t>atts</w:t>
-      </w:r>
-      <w:proofErr w:type="spellEnd"/>
-      <w:r>
-        <w:rPr>
-          <w:highlight w:val="yellow"/>
-        </w:rPr>
-        <w:t xml:space="preserve"> Calculator</w:t>
+        <w:t>atts Calculator</w:t>
       </w:r>
       <w:r>
         <w:br w:type="page"/>
@@ -33530,6 +33224,7 @@
     <w:pitch w:val="default"/>
   </w:font>
   <w:font w:name="Roboto">
+    <w:altName w:val="Arial"/>
     <w:panose1 w:val="02000000000000000000"/>
     <w:charset w:val="00"/>
     <w:family w:val="auto"/>
@@ -33946,6 +33641,7 @@
     <w:rsid w:val="0024754E"/>
     <w:rsid w:val="002476EF"/>
     <w:rsid w:val="00280C54"/>
+    <w:rsid w:val="002870BB"/>
     <w:rsid w:val="002A4853"/>
     <w:rsid w:val="002D0D3A"/>
     <w:rsid w:val="002D200A"/>
@@ -33968,6 +33664,7 @@
     <w:rsid w:val="004558F6"/>
     <w:rsid w:val="00460782"/>
     <w:rsid w:val="004D7895"/>
+    <w:rsid w:val="004E483C"/>
     <w:rsid w:val="00504E04"/>
     <w:rsid w:val="00524716"/>
     <w:rsid w:val="005437BF"/>
@@ -34040,6 +33737,7 @@
     <w:rsid w:val="00B44A2D"/>
     <w:rsid w:val="00B54FD0"/>
     <w:rsid w:val="00B6793A"/>
+    <w:rsid w:val="00B75F9D"/>
     <w:rsid w:val="00B771CA"/>
     <w:rsid w:val="00B96785"/>
     <w:rsid w:val="00BB5A18"/>

</xml_diff>

<commit_message>
Update all four SMP Word templates with latest placeholder changes
Co-Authored-By: Claude Sonnet 4.6 <noreply@anthropic.com>
</commit_message>
<xml_diff>
--- a/server/templates/DATE-GIWREF-Address-SMP-MixUse-2022-A.docx
+++ b/server/templates/DATE-GIWREF-Address-SMP-MixUse-2022-A.docx
@@ -1502,6 +1502,7 @@
               </w:rPr>
               <w:br/>
             </w:r>
+            <w:proofErr w:type="spellStart"/>
             <w:r>
               <w:rPr>
                 <w:b/>
@@ -1511,6 +1512,7 @@
               </w:rPr>
               <w:t>Firstname</w:t>
             </w:r>
+            <w:proofErr w:type="spellEnd"/>
             <w:r>
               <w:rPr>
                 <w:b/>
@@ -1771,11 +1773,11 @@
         <w:br w:type="page"/>
       </w:r>
     </w:p>
-    <w:bookmarkStart w:id="19" w:name="_Toc209592307" w:displacedByCustomXml="next"/>
-    <w:bookmarkStart w:id="20" w:name="_Toc209557015" w:displacedByCustomXml="next"/>
+    <w:bookmarkStart w:id="19" w:name="_Toc231555515" w:displacedByCustomXml="next"/>
+    <w:bookmarkStart w:id="20" w:name="_Toc209555290" w:displacedByCustomXml="next"/>
     <w:bookmarkStart w:id="21" w:name="_Toc209555543" w:displacedByCustomXml="next"/>
-    <w:bookmarkStart w:id="22" w:name="_Toc209555290" w:displacedByCustomXml="next"/>
-    <w:bookmarkStart w:id="23" w:name="_Toc231555515" w:displacedByCustomXml="next"/>
+    <w:bookmarkStart w:id="22" w:name="_Toc209557015" w:displacedByCustomXml="next"/>
+    <w:bookmarkStart w:id="23" w:name="_Toc209592307" w:displacedByCustomXml="next"/>
     <w:sdt>
       <w:sdtPr>
         <w:rPr>
@@ -3738,11 +3740,24 @@
       <w:r>
         <w:t>XX</w:t>
       </w:r>
+      <w:proofErr w:type="gramStart"/>
       <w:r>
         <w:t>]</w:t>
       </w:r>
       <w:r>
-        <w:t xml:space="preserve">  x 1 bedroom apartments</w:t>
+        <w:t xml:space="preserve">  x</w:t>
+      </w:r>
+      <w:proofErr w:type="gramEnd"/>
+      <w:r>
+        <w:t xml:space="preserve"> </w:t>
+      </w:r>
+      <w:proofErr w:type="gramStart"/>
+      <w:r>
+        <w:t>1 bedroom</w:t>
+      </w:r>
+      <w:proofErr w:type="gramEnd"/>
+      <w:r>
+        <w:t xml:space="preserve"> apartments</w:t>
       </w:r>
     </w:p>
     <w:p>
@@ -3764,7 +3779,15 @@
         <w:t>]</w:t>
       </w:r>
       <w:r>
-        <w:t xml:space="preserve"> x 2 bedroom apartments</w:t>
+        <w:t xml:space="preserve"> x </w:t>
+      </w:r>
+      <w:proofErr w:type="gramStart"/>
+      <w:r>
+        <w:t>2 bedroom</w:t>
+      </w:r>
+      <w:proofErr w:type="gramEnd"/>
+      <w:r>
+        <w:t xml:space="preserve"> apartments</w:t>
       </w:r>
     </w:p>
     <w:p>
@@ -3786,7 +3809,15 @@
         <w:t>]</w:t>
       </w:r>
       <w:r>
-        <w:t xml:space="preserve"> x 3 bedroom apartments</w:t>
+        <w:t xml:space="preserve"> x </w:t>
+      </w:r>
+      <w:proofErr w:type="gramStart"/>
+      <w:r>
+        <w:t>3 bedroom</w:t>
+      </w:r>
+      <w:proofErr w:type="gramEnd"/>
+      <w:r>
+        <w:t xml:space="preserve"> apartments</w:t>
       </w:r>
     </w:p>
     <w:p>
@@ -3883,13 +3914,21 @@
         <w:t>[</w:t>
       </w:r>
       <w:r>
-        <w:t>distance to CBD</w:t>
+        <w:t xml:space="preserve">distance to </w:t>
+      </w:r>
+      <w:proofErr w:type="gramStart"/>
+      <w:r>
+        <w:t>CBD</w:t>
       </w:r>
       <w:r>
         <w:t>]</w:t>
       </w:r>
       <w:r>
-        <w:t xml:space="preserve">km. </w:t>
+        <w:t>km.</w:t>
+      </w:r>
+      <w:proofErr w:type="gramEnd"/>
+      <w:r>
+        <w:t xml:space="preserve"> </w:t>
       </w:r>
     </w:p>
     <w:tbl>
@@ -3971,8 +4010,13 @@
       <w:r>
         <w:t xml:space="preserve"> - </w:t>
       </w:r>
+      <w:proofErr w:type="gramStart"/>
       <w:r>
-        <w:t xml:space="preserve">Pre-existing sites at </w:t>
+        <w:t>Pre-existing</w:t>
+      </w:r>
+      <w:proofErr w:type="gramEnd"/>
+      <w:r>
+        <w:t xml:space="preserve"> sites at </w:t>
       </w:r>
       <w:sdt>
         <w:sdtPr>
@@ -5729,8 +5773,9 @@
                 <w:sz w:val="24"/>
                 <w:szCs w:val="24"/>
               </w:rPr>
-              <w:t>BESS score</w:t>
-            </w:r>
+              <w:t xml:space="preserve">BESS </w:t>
+            </w:r>
+            <w:proofErr w:type="gramStart"/>
             <w:r>
               <w:rPr>
                 <w:rFonts w:eastAsia="SimSun"/>
@@ -5740,7 +5785,7 @@
                 <w:sz w:val="24"/>
                 <w:szCs w:val="24"/>
               </w:rPr>
-              <w:t>]</w:t>
+              <w:t>score</w:t>
             </w:r>
             <w:r>
               <w:rPr>
@@ -5751,7 +5796,30 @@
                 <w:sz w:val="24"/>
                 <w:szCs w:val="24"/>
               </w:rPr>
-              <w:t>% with no mandatory category (IEQ, Operational Energy, IWM) below 50%.</w:t>
+              <w:t>]</w:t>
+            </w:r>
+            <w:r>
+              <w:rPr>
+                <w:rFonts w:eastAsia="SimSun"/>
+                <w:b/>
+                <w:bCs/>
+                <w:color w:val="00602B"/>
+                <w:sz w:val="24"/>
+                <w:szCs w:val="24"/>
+              </w:rPr>
+              <w:t>%</w:t>
+            </w:r>
+            <w:proofErr w:type="gramEnd"/>
+            <w:r>
+              <w:rPr>
+                <w:rFonts w:eastAsia="SimSun"/>
+                <w:b/>
+                <w:bCs/>
+                <w:color w:val="00602B"/>
+                <w:sz w:val="24"/>
+                <w:szCs w:val="24"/>
+              </w:rPr>
+              <w:t xml:space="preserve"> with no mandatory category (IEQ, Operational Energy, IWM) below 50%.</w:t>
             </w:r>
           </w:p>
         </w:tc>
@@ -6136,7 +6204,7 @@
                 <w:color w:val="000000"/>
               </w:rPr>
               <w:drawing>
-                <wp:anchor distT="0" distB="0" distL="114300" distR="114300" simplePos="0" relativeHeight="251738112" behindDoc="1" locked="0" layoutInCell="1" allowOverlap="1" wp14:anchorId="22787630" wp14:editId="698D7879">
+                <wp:anchor distT="0" distB="0" distL="114300" distR="114300" simplePos="0" relativeHeight="251738112" behindDoc="1" locked="0" layoutInCell="1" allowOverlap="1" wp14:anchorId="22787630" wp14:editId="2EAA17F3">
                   <wp:simplePos x="0" y="0"/>
                   <wp:positionH relativeFrom="column">
                     <wp:posOffset>77470</wp:posOffset>
@@ -6262,13 +6330,23 @@
             <w:r>
               <w:fldChar w:fldCharType="end"/>
             </w:r>
+            <w:proofErr w:type="spellStart"/>
             <w:r>
               <w:rPr>
                 <w:rFonts w:eastAsiaTheme="minorEastAsia"/>
                 <w:szCs w:val="22"/>
                 <w:lang w:eastAsia="en-US"/>
               </w:rPr>
-              <w:t>NatHERS Energy Rating.</w:t>
+              <w:t>NatHERS</w:t>
+            </w:r>
+            <w:proofErr w:type="spellEnd"/>
+            <w:r>
+              <w:rPr>
+                <w:rFonts w:eastAsiaTheme="minorEastAsia"/>
+                <w:szCs w:val="22"/>
+                <w:lang w:eastAsia="en-US"/>
+              </w:rPr>
+              <w:t xml:space="preserve"> Energy Rating.</w:t>
             </w:r>
           </w:p>
         </w:tc>
@@ -6599,7 +6677,7 @@
                 <w:color w:val="000000"/>
               </w:rPr>
               <w:drawing>
-                <wp:anchor distT="0" distB="0" distL="114300" distR="114300" simplePos="0" relativeHeight="251739136" behindDoc="1" locked="0" layoutInCell="1" allowOverlap="1" wp14:anchorId="7055ECC5" wp14:editId="7B6B9704">
+                <wp:anchor distT="0" distB="0" distL="114300" distR="114300" simplePos="0" relativeHeight="251739136" behindDoc="1" locked="0" layoutInCell="1" allowOverlap="1" wp14:anchorId="7055ECC5" wp14:editId="033BF81D">
                   <wp:simplePos x="0" y="0"/>
                   <wp:positionH relativeFrom="column">
                     <wp:posOffset>76200</wp:posOffset>
@@ -6681,13 +6759,23 @@
                 <w:lang w:eastAsia="en-US"/>
               </w:rPr>
             </w:pPr>
+            <w:proofErr w:type="gramStart"/>
             <w:r>
               <w:rPr>
                 <w:rFonts w:eastAsiaTheme="minorEastAsia"/>
                 <w:szCs w:val="22"/>
                 <w:lang w:eastAsia="en-US"/>
               </w:rPr>
-              <w:t>The majority of the development meets BESS IEQ requirements.</w:t>
+              <w:t>The majority of</w:t>
+            </w:r>
+            <w:proofErr w:type="gramEnd"/>
+            <w:r>
+              <w:rPr>
+                <w:rFonts w:eastAsiaTheme="minorEastAsia"/>
+                <w:szCs w:val="22"/>
+                <w:lang w:eastAsia="en-US"/>
+              </w:rPr>
+              <w:t xml:space="preserve"> the development meets BESS IEQ requirements.</w:t>
             </w:r>
           </w:p>
         </w:tc>
@@ -7600,7 +7688,7 @@
                 <w:color w:val="000000"/>
               </w:rPr>
               <w:drawing>
-                <wp:anchor distT="0" distB="0" distL="114300" distR="114300" simplePos="0" relativeHeight="251741184" behindDoc="1" locked="0" layoutInCell="1" allowOverlap="1" wp14:anchorId="63206793" wp14:editId="2DA05863">
+                <wp:anchor distT="0" distB="0" distL="114300" distR="114300" simplePos="0" relativeHeight="251741184" behindDoc="1" locked="0" layoutInCell="1" allowOverlap="1" wp14:anchorId="63206793" wp14:editId="3759987E">
                   <wp:simplePos x="0" y="0"/>
                   <wp:positionH relativeFrom="column">
                     <wp:posOffset>91440</wp:posOffset>
@@ -8566,36 +8654,54 @@
             <w:pPr>
               <w:spacing w:before="0" w:after="0" w:line="240" w:lineRule="auto"/>
               <w:jc w:val="both"/>
-              <w:rPr>
-                <w:szCs w:val="22"/>
-              </w:rPr>
-            </w:pPr>
-            <w:bookmarkStart w:id="63" w:name="Metering"/>
-            <w:r>
-              <w:rPr>
-                <w:szCs w:val="22"/>
-              </w:rPr>
-              <w:t>Electricity, cold water, hot water or gas metering is to be provided to each individual apartment and commercial tenancy.</w:t>
-            </w:r>
-            <w:bookmarkEnd w:id="63"/>
-            <w:r>
-              <w:rPr>
-                <w:szCs w:val="22"/>
-              </w:rPr>
-              <w:t xml:space="preserve"> </w:t>
-            </w:r>
-            <w:r>
-              <w:rPr>
-                <w:szCs w:val="22"/>
-              </w:rPr>
-              <w:br/>
-            </w:r>
-            <w:r>
-              <w:rPr>
-                <w:szCs w:val="22"/>
-              </w:rPr>
-              <w:br/>
-            </w:r>
+            </w:pPr>
+            <w:r>
+              <w:t xml:space="preserve">Electricity and </w:t>
+            </w:r>
+            <w:proofErr w:type="gramStart"/>
+            <w:r>
+              <w:t>cold water</w:t>
+            </w:r>
+            <w:proofErr w:type="gramEnd"/>
+            <w:r>
+              <w:t xml:space="preserve"> metering is to be provided to each individual apartment and commercial tenancy. </w:t>
+            </w:r>
+          </w:p>
+          <w:p>
+            <w:pPr>
+              <w:spacing w:before="0" w:after="0" w:line="240" w:lineRule="auto"/>
+              <w:jc w:val="both"/>
+            </w:pPr>
+          </w:p>
+          <w:p>
+            <w:pPr>
+              <w:spacing w:before="0" w:after="0" w:line="240" w:lineRule="auto"/>
+              <w:jc w:val="both"/>
+              <w:rPr>
+                <w:szCs w:val="22"/>
+              </w:rPr>
+            </w:pPr>
+            <w:r>
+              <w:t xml:space="preserve">Gas metering is to be provided to the commercial tenancy. </w:t>
+            </w:r>
+          </w:p>
+          <w:p>
+            <w:pPr>
+              <w:spacing w:before="0" w:after="0" w:line="240" w:lineRule="auto"/>
+              <w:jc w:val="both"/>
+              <w:rPr>
+                <w:szCs w:val="22"/>
+              </w:rPr>
+            </w:pPr>
+          </w:p>
+          <w:p>
+            <w:pPr>
+              <w:spacing w:before="0" w:after="0" w:line="240" w:lineRule="auto"/>
+              <w:jc w:val="both"/>
+              <w:rPr>
+                <w:szCs w:val="22"/>
+              </w:rPr>
+            </w:pPr>
             <w:r>
               <w:rPr>
                 <w:szCs w:val="22"/>
@@ -8726,7 +8832,7 @@
       </w:tr>
     </w:tbl>
     <w:p>
-      <w:bookmarkStart w:id="64" w:name="_Toc46738705"/>
+      <w:bookmarkStart w:id="63" w:name="_Toc46738705"/>
     </w:p>
     <w:p>
       <w:pPr>
@@ -8752,13 +8858,13 @@
           <w:kern w:val="32"/>
         </w:rPr>
       </w:pPr>
-      <w:bookmarkStart w:id="65" w:name="_Toc231555526"/>
+      <w:bookmarkStart w:id="64" w:name="_Toc231555526"/>
       <w:r>
         <w:lastRenderedPageBreak/>
         <w:t>Integrated Water Management</w:t>
       </w:r>
+      <w:bookmarkEnd w:id="63"/>
       <w:bookmarkEnd w:id="64"/>
-      <w:bookmarkEnd w:id="65"/>
     </w:p>
     <w:p>
       <w:pPr>
@@ -9013,7 +9119,7 @@
                 <w:szCs w:val="22"/>
               </w:rPr>
             </w:pPr>
-            <w:bookmarkStart w:id="66" w:name="BlueFactor"/>
+            <w:bookmarkStart w:id="65" w:name="BlueFactor"/>
             <w:r>
               <w:rPr>
                 <w:color w:val="auto"/>
@@ -9026,16 +9132,32 @@
                 <w:color w:val="auto"/>
                 <w:szCs w:val="22"/>
               </w:rPr>
-              <w:t>[Blue Factor score]</w:t>
-            </w:r>
+              <w:t xml:space="preserve">[Blue Factor </w:t>
+            </w:r>
+            <w:proofErr w:type="gramStart"/>
             <w:r>
               <w:rPr>
                 <w:color w:val="auto"/>
                 <w:szCs w:val="22"/>
               </w:rPr>
-              <w:t>% is achieved</w:t>
-            </w:r>
-            <w:bookmarkEnd w:id="66"/>
+              <w:t>score]</w:t>
+            </w:r>
+            <w:r>
+              <w:rPr>
+                <w:color w:val="auto"/>
+                <w:szCs w:val="22"/>
+              </w:rPr>
+              <w:t>%</w:t>
+            </w:r>
+            <w:proofErr w:type="gramEnd"/>
+            <w:r>
+              <w:rPr>
+                <w:color w:val="auto"/>
+                <w:szCs w:val="22"/>
+              </w:rPr>
+              <w:t xml:space="preserve"> is achieved</w:t>
+            </w:r>
+            <w:bookmarkEnd w:id="65"/>
             <w:r>
               <w:rPr>
                 <w:color w:val="auto"/>
@@ -9053,7 +9175,7 @@
                 <w:szCs w:val="22"/>
               </w:rPr>
             </w:pPr>
-            <w:bookmarkStart w:id="67" w:name="WSUD_Strat"/>
+            <w:bookmarkStart w:id="66" w:name="WSUD_Strat"/>
             <w:r>
               <w:rPr>
                 <w:szCs w:val="22"/>
@@ -9094,7 +9216,21 @@
               <w:rPr>
                 <w:szCs w:val="22"/>
               </w:rPr>
-              <w:t xml:space="preserve"> litre rainwater tank. XX WC’s are to be connected to the rainwater tank.</w:t>
+              <w:t xml:space="preserve"> litre rainwater tank. XX </w:t>
+            </w:r>
+            <w:proofErr w:type="gramStart"/>
+            <w:r>
+              <w:rPr>
+                <w:szCs w:val="22"/>
+              </w:rPr>
+              <w:t>WC’s</w:t>
+            </w:r>
+            <w:proofErr w:type="gramEnd"/>
+            <w:r>
+              <w:rPr>
+                <w:szCs w:val="22"/>
+              </w:rPr>
+              <w:t xml:space="preserve"> are to be connected to the rainwater tank.</w:t>
             </w:r>
           </w:p>
           <w:p>
@@ -9110,13 +9246,27 @@
               <w:rPr>
                 <w:szCs w:val="22"/>
               </w:rPr>
-              <w:t>Rainwater is to be collected from XX and directed into a ≥</w:t>
-            </w:r>
-            <w:r>
-              <w:rPr>
-                <w:szCs w:val="22"/>
-              </w:rPr>
-              <w:t>[raingarden size]</w:t>
+              <w:t xml:space="preserve">Rainwater is to be collected from XX and directed into a </w:t>
+            </w:r>
+            <w:proofErr w:type="gramStart"/>
+            <w:r>
+              <w:rPr>
+                <w:szCs w:val="22"/>
+              </w:rPr>
+              <w:t>≥</w:t>
+            </w:r>
+            <w:r>
+              <w:rPr>
+                <w:szCs w:val="22"/>
+              </w:rPr>
+              <w:t>[</w:t>
+            </w:r>
+            <w:proofErr w:type="gramEnd"/>
+            <w:r>
+              <w:rPr>
+                <w:szCs w:val="22"/>
+              </w:rPr>
+              <w:t>raingarden size]</w:t>
             </w:r>
             <w:r>
               <w:rPr>
@@ -9125,7 +9275,7 @@
               <w:t>m2, minimum 1,150mm deep raingarden with 300mm of extended detention.</w:t>
             </w:r>
           </w:p>
-          <w:bookmarkEnd w:id="67"/>
+          <w:bookmarkEnd w:id="66"/>
           <w:p>
             <w:pPr>
               <w:spacing w:before="0" w:after="0" w:line="240" w:lineRule="auto"/>
@@ -9225,7 +9375,39 @@
                 <w:color w:val="auto"/>
                 <w:szCs w:val="22"/>
               </w:rPr>
-              <w:t>To reduce total potable water use due through the use of efficient fixtures, appliances, and the use of rainwater.</w:t>
+              <w:t xml:space="preserve">To reduce total potable </w:t>
+            </w:r>
+            <w:proofErr w:type="gramStart"/>
+            <w:r>
+              <w:rPr>
+                <w:color w:val="auto"/>
+                <w:szCs w:val="22"/>
+              </w:rPr>
+              <w:t>water</w:t>
+            </w:r>
+            <w:proofErr w:type="gramEnd"/>
+            <w:r>
+              <w:rPr>
+                <w:color w:val="auto"/>
+                <w:szCs w:val="22"/>
+              </w:rPr>
+              <w:t xml:space="preserve"> use due </w:t>
+            </w:r>
+            <w:proofErr w:type="gramStart"/>
+            <w:r>
+              <w:rPr>
+                <w:color w:val="auto"/>
+                <w:szCs w:val="22"/>
+              </w:rPr>
+              <w:t>through the use of</w:t>
+            </w:r>
+            <w:proofErr w:type="gramEnd"/>
+            <w:r>
+              <w:rPr>
+                <w:color w:val="auto"/>
+                <w:szCs w:val="22"/>
+              </w:rPr>
+              <w:t xml:space="preserve"> efficient fixtures, appliances, and the use of rainwater.</w:t>
             </w:r>
           </w:p>
         </w:tc>
@@ -9848,7 +10030,7 @@
                 <w:szCs w:val="22"/>
               </w:rPr>
             </w:pPr>
-            <w:bookmarkStart w:id="68" w:name="Rainwater_tank"/>
+            <w:bookmarkStart w:id="67" w:name="Rainwater_tank"/>
             <w:r>
               <w:rPr>
                 <w:szCs w:val="22"/>
@@ -9891,7 +10073,7 @@
               </w:rPr>
               <w:t xml:space="preserve">litre rainwater tank will harvest rainwater from </w:t>
             </w:r>
-            <w:bookmarkEnd w:id="68"/>
+            <w:bookmarkEnd w:id="67"/>
             <w:r>
               <w:rPr>
                 <w:szCs w:val="22"/>
@@ -10040,7 +10222,7 @@
             </w:r>
           </w:p>
         </w:tc>
-        <w:bookmarkStart w:id="69" w:name="Landscaping"/>
+        <w:bookmarkStart w:id="68" w:name="Landscaping"/>
         <w:tc>
           <w:tcPr>
             <w:tcW w:w="6236" w:type="dxa"/>
@@ -10088,7 +10270,7 @@
                 </w:r>
               </w:sdtContent>
             </w:sdt>
-            <w:bookmarkEnd w:id="69"/>
+            <w:bookmarkEnd w:id="68"/>
           </w:p>
         </w:tc>
       </w:tr>
@@ -10183,7 +10365,21 @@
               <w:rPr>
                 <w:szCs w:val="22"/>
               </w:rPr>
-              <w:t xml:space="preserve"> (e.g. hydrant pump test water or SCV annubar test)</w:t>
+              <w:t xml:space="preserve"> (e.g. hydrant pump test water or SCV </w:t>
+            </w:r>
+            <w:proofErr w:type="spellStart"/>
+            <w:r>
+              <w:rPr>
+                <w:szCs w:val="22"/>
+              </w:rPr>
+              <w:t>annubar</w:t>
+            </w:r>
+            <w:proofErr w:type="spellEnd"/>
+            <w:r>
+              <w:rPr>
+                <w:szCs w:val="22"/>
+              </w:rPr>
+              <w:t xml:space="preserve"> test)</w:t>
             </w:r>
             <w:r>
               <w:rPr>
@@ -10244,7 +10440,7 @@
       </w:tr>
     </w:tbl>
     <w:p>
-      <w:bookmarkStart w:id="70" w:name="_Toc46738706"/>
+      <w:bookmarkStart w:id="69" w:name="_Toc46738706"/>
     </w:p>
     <w:p>
       <w:pPr>
@@ -10258,7 +10454,7 @@
       <w:pPr>
         <w:pStyle w:val="Heading2"/>
       </w:pPr>
-      <w:bookmarkStart w:id="71" w:name="_Toc231555527"/>
+      <w:bookmarkStart w:id="70" w:name="_Toc231555527"/>
       <w:r>
         <w:lastRenderedPageBreak/>
         <w:t xml:space="preserve">Operational </w:t>
@@ -10266,8 +10462,8 @@
       <w:r>
         <w:t>Energy</w:t>
       </w:r>
+      <w:bookmarkEnd w:id="69"/>
       <w:bookmarkEnd w:id="70"/>
-      <w:bookmarkEnd w:id="71"/>
     </w:p>
     <w:p>
       <w:pPr>
@@ -10512,9 +10708,23 @@
               <w:rPr>
                 <w:szCs w:val="22"/>
               </w:rPr>
-              <w:t xml:space="preserve">The National Construction Code (NCC) Class 2 – Sole Occupancy Unit(s) residential building component is to be designed in accordance with NCC Section J (2022) NatHERS requirements. The residential units must achieve an average </w:t>
-            </w:r>
-            <w:bookmarkStart w:id="72" w:name="FR_target"/>
+              <w:t xml:space="preserve">The National Construction Code (NCC) Class 2 – Sole Occupancy Unit(s) residential building component is to be designed in accordance with NCC Section J (2022) </w:t>
+            </w:r>
+            <w:proofErr w:type="spellStart"/>
+            <w:r>
+              <w:rPr>
+                <w:szCs w:val="22"/>
+              </w:rPr>
+              <w:t>NatHERS</w:t>
+            </w:r>
+            <w:proofErr w:type="spellEnd"/>
+            <w:r>
+              <w:rPr>
+                <w:szCs w:val="22"/>
+              </w:rPr>
+              <w:t xml:space="preserve"> requirements. The residential units must achieve an average </w:t>
+            </w:r>
+            <w:bookmarkStart w:id="71" w:name="FR_target"/>
             <w:r>
               <w:rPr>
                 <w:szCs w:val="22"/>
@@ -10539,7 +10749,7 @@
               </w:rPr>
               <w:t xml:space="preserve"> Star </w:t>
             </w:r>
-            <w:bookmarkEnd w:id="72"/>
+            <w:bookmarkEnd w:id="71"/>
             <w:r>
               <w:rPr>
                 <w:szCs w:val="22"/>
@@ -10803,7 +11013,7 @@
               </w:rPr>
               <w:t xml:space="preserve"> </w:t>
             </w:r>
-            <w:bookmarkStart w:id="73" w:name="Energy_NonRes"/>
+            <w:bookmarkStart w:id="72" w:name="Energy_NonRes"/>
             <w:r>
               <w:rPr>
                 <w:bCs/>
@@ -10846,7 +11056,7 @@
               </w:rPr>
               <w:t xml:space="preserve"> </w:t>
             </w:r>
-            <w:bookmarkEnd w:id="73"/>
+            <w:bookmarkEnd w:id="72"/>
             <w:r>
               <w:rPr>
                 <w:bCs/>
@@ -11224,14 +11434,14 @@
                 <w:szCs w:val="22"/>
               </w:rPr>
             </w:pPr>
-            <w:bookmarkStart w:id="74" w:name="Hot_Water"/>
+            <w:bookmarkStart w:id="73" w:name="Hot_Water"/>
             <w:r>
               <w:rPr>
                 <w:szCs w:val="22"/>
               </w:rPr>
               <w:t xml:space="preserve">The development is to utilise </w:t>
             </w:r>
-            <w:bookmarkEnd w:id="74"/>
+            <w:bookmarkEnd w:id="73"/>
             <w:r>
               <w:rPr>
                 <w:szCs w:val="22"/>
@@ -11669,14 +11879,14 @@
                 <w:szCs w:val="22"/>
               </w:rPr>
             </w:pPr>
-            <w:bookmarkStart w:id="75" w:name="Motion_detectors"/>
+            <w:bookmarkStart w:id="74" w:name="Motion_detectors"/>
             <w:r>
               <w:rPr>
                 <w:szCs w:val="22"/>
               </w:rPr>
               <w:t xml:space="preserve">All common area, external and carpark lighting is to be controlled with daylight, motion sensors or timers (whichever is deemed appropriate). </w:t>
             </w:r>
-            <w:bookmarkEnd w:id="75"/>
+            <w:bookmarkEnd w:id="74"/>
           </w:p>
         </w:tc>
       </w:tr>
@@ -11918,7 +12128,7 @@
                 <w:szCs w:val="22"/>
               </w:rPr>
             </w:pPr>
-            <w:bookmarkStart w:id="76" w:name="PV"/>
+            <w:bookmarkStart w:id="75" w:name="PV"/>
             <w:r>
               <w:rPr>
                 <w:color w:val="auto"/>
@@ -11952,9 +12162,9 @@
                 <w:color w:val="auto"/>
                 <w:szCs w:val="22"/>
               </w:rPr>
-              <w:t>kW Solar PV system is to be located on the roof</w:t>
-            </w:r>
-            <w:bookmarkEnd w:id="76"/>
+              <w:t xml:space="preserve"> Solar PV system is to be located on the roof</w:t>
+            </w:r>
+            <w:bookmarkEnd w:id="75"/>
             <w:r>
               <w:rPr>
                 <w:color w:val="auto"/>
@@ -11974,13 +12184,21 @@
                 <w:color w:val="auto"/>
                 <w:szCs w:val="22"/>
               </w:rPr>
-              <w:t>Solar PV output</w:t>
-            </w:r>
+              <w:t xml:space="preserve">Solar PV </w:t>
+            </w:r>
+            <w:proofErr w:type="gramStart"/>
             <w:r>
               <w:rPr>
                 <w:color w:val="auto"/>
                 <w:szCs w:val="22"/>
               </w:rPr>
+              <w:t>output</w:t>
+            </w:r>
+            <w:r>
+              <w:rPr>
+                <w:color w:val="auto"/>
+                <w:szCs w:val="22"/>
+              </w:rPr>
               <w:t>]</w:t>
             </w:r>
             <w:r>
@@ -11988,7 +12206,15 @@
                 <w:color w:val="auto"/>
                 <w:szCs w:val="22"/>
               </w:rPr>
-              <w:t xml:space="preserve">kWh and will be </w:t>
+              <w:t>kWh</w:t>
+            </w:r>
+            <w:proofErr w:type="gramEnd"/>
+            <w:r>
+              <w:rPr>
+                <w:color w:val="auto"/>
+                <w:szCs w:val="22"/>
+              </w:rPr>
+              <w:t xml:space="preserve"> and will be </w:t>
             </w:r>
             <w:r>
               <w:rPr>
@@ -12067,7 +12293,7 @@
       </w:tr>
     </w:tbl>
     <w:p>
-      <w:bookmarkStart w:id="77" w:name="_Toc46738707"/>
+      <w:bookmarkStart w:id="76" w:name="_Toc46738707"/>
     </w:p>
     <w:p>
       <w:pPr>
@@ -12081,17 +12307,17 @@
       <w:pPr>
         <w:pStyle w:val="Heading2"/>
       </w:pPr>
-      <w:bookmarkStart w:id="78" w:name="_Toc46738708"/>
-      <w:bookmarkStart w:id="79" w:name="_Toc231555528"/>
-      <w:bookmarkEnd w:id="77"/>
+      <w:bookmarkStart w:id="77" w:name="_Toc46738708"/>
+      <w:bookmarkStart w:id="78" w:name="_Toc231555528"/>
+      <w:bookmarkEnd w:id="76"/>
       <w:r>
         <w:lastRenderedPageBreak/>
         <w:t>Indoor Environment Quality</w:t>
       </w:r>
       <w:bookmarkEnd w:id="61"/>
       <w:bookmarkEnd w:id="62"/>
+      <w:bookmarkEnd w:id="77"/>
       <w:bookmarkEnd w:id="78"/>
-      <w:bookmarkEnd w:id="79"/>
     </w:p>
     <w:p>
       <w:pPr>
@@ -12172,7 +12398,7 @@
                 <w:szCs w:val="22"/>
               </w:rPr>
             </w:pPr>
-            <w:bookmarkStart w:id="80" w:name="_Toc461726280"/>
+            <w:bookmarkStart w:id="79" w:name="_Toc461726280"/>
             <w:r>
               <w:rPr>
                 <w:rFonts w:ascii="Roboto" w:hAnsi="Roboto"/>
@@ -12320,7 +12546,7 @@
                 <w:szCs w:val="22"/>
               </w:rPr>
             </w:pPr>
-            <w:bookmarkStart w:id="81" w:name="Daylight_modelling"/>
+            <w:bookmarkStart w:id="80" w:name="Daylight_modelling"/>
             <w:r>
               <w:rPr>
                 <w:szCs w:val="22"/>
@@ -12334,7 +12560,7 @@
               </w:rPr>
               <w:t xml:space="preserve"> </w:t>
             </w:r>
-            <w:bookmarkEnd w:id="81"/>
+            <w:bookmarkEnd w:id="80"/>
             <w:r>
               <w:rPr>
                 <w:szCs w:val="22"/>
@@ -12470,7 +12696,15 @@
                       <w:rFonts w:eastAsia="SimSun" w:cs="Calibri"/>
                       <w:color w:val="000000"/>
                     </w:rPr>
-                    <w:t>daylight living</w:t>
+                    <w:t xml:space="preserve">daylight </w:t>
+                  </w:r>
+                  <w:proofErr w:type="gramStart"/>
+                  <w:r>
+                    <w:rPr>
+                      <w:rFonts w:eastAsia="SimSun" w:cs="Calibri"/>
+                      <w:color w:val="000000"/>
+                    </w:rPr>
+                    <w:t>living</w:t>
                   </w:r>
                   <w:r>
                     <w:rPr>
@@ -12486,6 +12720,7 @@
                     </w:rPr>
                     <w:t>%</w:t>
                   </w:r>
+                  <w:proofErr w:type="gramEnd"/>
                   <w:r>
                     <w:rPr>
                       <w:rFonts w:eastAsia="SimSun" w:cs="Calibri"/>
@@ -12565,7 +12800,15 @@
                       <w:rFonts w:eastAsia="SimSun" w:cs="Calibri"/>
                       <w:color w:val="000000"/>
                     </w:rPr>
-                    <w:t>daylight bedrooms</w:t>
+                    <w:t xml:space="preserve">daylight </w:t>
+                  </w:r>
+                  <w:proofErr w:type="gramStart"/>
+                  <w:r>
+                    <w:rPr>
+                      <w:rFonts w:eastAsia="SimSun" w:cs="Calibri"/>
+                      <w:color w:val="000000"/>
+                    </w:rPr>
+                    <w:t>bedrooms</w:t>
                   </w:r>
                   <w:r>
                     <w:rPr>
@@ -12581,6 +12824,7 @@
                     </w:rPr>
                     <w:t>%</w:t>
                   </w:r>
+                  <w:proofErr w:type="gramEnd"/>
                   <w:r>
                     <w:rPr>
                       <w:rFonts w:eastAsia="SimSun" w:cs="Calibri"/>
@@ -12692,14 +12936,22 @@
               </w:rPr>
               <w:t xml:space="preserve"> </w:t>
             </w:r>
-            <w:bookmarkStart w:id="82" w:name="DTS"/>
-            <w:r>
-              <w:rPr>
-                <w:szCs w:val="22"/>
-              </w:rPr>
-              <w:t>The majority of the development complies with the Deemed-to-Satisfy method for IEQ prescribed by BESS.</w:t>
-            </w:r>
-            <w:bookmarkEnd w:id="82"/>
+            <w:bookmarkStart w:id="81" w:name="DTS"/>
+            <w:proofErr w:type="gramStart"/>
+            <w:r>
+              <w:rPr>
+                <w:szCs w:val="22"/>
+              </w:rPr>
+              <w:t>The majority of</w:t>
+            </w:r>
+            <w:proofErr w:type="gramEnd"/>
+            <w:r>
+              <w:rPr>
+                <w:szCs w:val="22"/>
+              </w:rPr>
+              <w:t xml:space="preserve"> the development complies with the Deemed-to-Satisfy method for IEQ prescribed by BESS.</w:t>
+            </w:r>
+            <w:bookmarkEnd w:id="81"/>
             <w:r>
               <w:rPr>
                 <w:szCs w:val="22"/>
@@ -12857,7 +13109,7 @@
                 <w:szCs w:val="22"/>
               </w:rPr>
             </w:pPr>
-            <w:bookmarkStart w:id="83" w:name="Sunlight"/>
+            <w:bookmarkStart w:id="82" w:name="Sunlight"/>
             <w:r>
               <w:rPr>
                 <w:szCs w:val="22"/>
@@ -12888,7 +13140,7 @@
               </w:rPr>
               <w:t xml:space="preserve"> of apartments achieve at least 3 hours of sunlight.</w:t>
             </w:r>
-            <w:bookmarkEnd w:id="83"/>
+            <w:bookmarkEnd w:id="82"/>
           </w:p>
         </w:tc>
       </w:tr>
@@ -12983,7 +13235,7 @@
                 <w:szCs w:val="22"/>
               </w:rPr>
             </w:pPr>
-            <w:bookmarkStart w:id="84" w:name="Daylight_NonRes"/>
+            <w:bookmarkStart w:id="83" w:name="Daylight_NonRes"/>
             <w:r>
               <w:rPr>
                 <w:szCs w:val="22"/>
@@ -13000,8 +13252,17 @@
               <w:rPr>
                 <w:szCs w:val="22"/>
               </w:rPr>
-              <w:t>daylight non-resi</w:t>
-            </w:r>
+              <w:t>daylight non-</w:t>
+            </w:r>
+            <w:proofErr w:type="spellStart"/>
+            <w:proofErr w:type="gramStart"/>
+            <w:r>
+              <w:rPr>
+                <w:szCs w:val="22"/>
+              </w:rPr>
+              <w:t>resi</w:t>
+            </w:r>
+            <w:proofErr w:type="spellEnd"/>
             <w:r>
               <w:rPr>
                 <w:szCs w:val="22"/>
@@ -13012,9 +13273,16 @@
               <w:rPr>
                 <w:szCs w:val="22"/>
               </w:rPr>
-              <w:t>% of the nominated area.</w:t>
-            </w:r>
-            <w:bookmarkEnd w:id="84"/>
+              <w:t>%</w:t>
+            </w:r>
+            <w:proofErr w:type="gramEnd"/>
+            <w:r>
+              <w:rPr>
+                <w:szCs w:val="22"/>
+              </w:rPr>
+              <w:t xml:space="preserve"> of the nominated area.</w:t>
+            </w:r>
+            <w:bookmarkEnd w:id="83"/>
           </w:p>
         </w:tc>
       </w:tr>
@@ -13180,8 +13448,8 @@
                 <w:szCs w:val="22"/>
               </w:rPr>
             </w:pPr>
-            <w:bookmarkStart w:id="85" w:name="Nat_Vent"/>
-            <w:bookmarkStart w:id="86" w:name="Lighting"/>
+            <w:bookmarkStart w:id="84" w:name="Nat_Vent"/>
+            <w:bookmarkStart w:id="85" w:name="Lighting"/>
             <w:r>
               <w:rPr>
                 <w:szCs w:val="22"/>
@@ -13200,26 +13468,26 @@
               </w:rPr>
               <w:t xml:space="preserve">% </w:t>
             </w:r>
+            <w:bookmarkEnd w:id="84"/>
+            <w:r>
+              <w:rPr>
+                <w:szCs w:val="22"/>
+              </w:rPr>
+              <w:t>(XX out of XX)</w:t>
+            </w:r>
+            <w:r>
+              <w:rPr>
+                <w:szCs w:val="22"/>
+              </w:rPr>
+              <w:t>]</w:t>
+            </w:r>
+            <w:r>
+              <w:rPr>
+                <w:szCs w:val="22"/>
+              </w:rPr>
+              <w:t xml:space="preserve"> of the development’s apartments are naturally cross-ventilated. Apartments are provided with windows on opposite or adjacent facades or are effective single sided ventilated.</w:t>
+            </w:r>
             <w:bookmarkEnd w:id="85"/>
-            <w:r>
-              <w:rPr>
-                <w:szCs w:val="22"/>
-              </w:rPr>
-              <w:t>(XX out of XX)</w:t>
-            </w:r>
-            <w:r>
-              <w:rPr>
-                <w:szCs w:val="22"/>
-              </w:rPr>
-              <w:t>]</w:t>
-            </w:r>
-            <w:r>
-              <w:rPr>
-                <w:szCs w:val="22"/>
-              </w:rPr>
-              <w:t xml:space="preserve"> of the development’s apartments are naturally cross-ventilated. Apartments are provided with windows on opposite or adjacent facades or are effective single sided ventilated.</w:t>
-            </w:r>
-            <w:bookmarkEnd w:id="86"/>
           </w:p>
           <w:p>
             <w:pPr>
@@ -13239,12 +13507,21 @@
                 <w:lang w:val="fr-FR"/>
               </w:rPr>
             </w:pPr>
+            <w:proofErr w:type="spellStart"/>
             <w:r>
               <w:rPr>
                 <w:szCs w:val="22"/>
                 <w:lang w:val="fr-FR"/>
               </w:rPr>
-              <w:t xml:space="preserve">Refer </w:t>
+              <w:t>Refer</w:t>
+            </w:r>
+            <w:proofErr w:type="spellEnd"/>
+            <w:r>
+              <w:rPr>
+                <w:szCs w:val="22"/>
+                <w:lang w:val="fr-FR"/>
+              </w:rPr>
+              <w:t xml:space="preserve"> </w:t>
             </w:r>
             <w:r>
               <w:fldChar w:fldCharType="begin"/>
@@ -13298,8 +13575,18 @@
                 <w:color w:val="00602B" w:themeColor="text2"/>
                 <w:szCs w:val="22"/>
               </w:rPr>
-              <w:t>Ventilation – Non-Residential</w:t>
-            </w:r>
+              <w:t xml:space="preserve">Ventilation – </w:t>
+            </w:r>
+            <w:proofErr w:type="gramStart"/>
+            <w:r>
+              <w:rPr>
+                <w:rFonts w:ascii="Roboto" w:hAnsi="Roboto"/>
+                <w:color w:val="00602B" w:themeColor="text2"/>
+                <w:szCs w:val="22"/>
+              </w:rPr>
+              <w:t>Non-Residential</w:t>
+            </w:r>
+            <w:proofErr w:type="gramEnd"/>
           </w:p>
         </w:tc>
         <w:tc>
@@ -13342,8 +13629,13 @@
               <w:t>[</w:t>
             </w:r>
             <w:r>
-              <w:t>ventilation non-resi</w:t>
-            </w:r>
+              <w:t>ventilation non-</w:t>
+            </w:r>
+            <w:proofErr w:type="spellStart"/>
+            <w:r>
+              <w:t>resi</w:t>
+            </w:r>
+            <w:proofErr w:type="spellEnd"/>
             <w:r>
               <w:t>]</w:t>
             </w:r>
@@ -13432,14 +13724,14 @@
                 <w:szCs w:val="22"/>
               </w:rPr>
             </w:pPr>
-            <w:bookmarkStart w:id="87" w:name="Shading"/>
+            <w:bookmarkStart w:id="86" w:name="Shading"/>
             <w:r>
               <w:rPr>
                 <w:szCs w:val="22"/>
               </w:rPr>
               <w:t>The development is provided with a comprehensive shading strategy</w:t>
             </w:r>
-            <w:bookmarkEnd w:id="87"/>
+            <w:bookmarkEnd w:id="86"/>
             <w:r>
               <w:rPr>
                 <w:szCs w:val="22"/>
@@ -13552,7 +13844,21 @@
               <w:rPr>
                 <w:szCs w:val="22"/>
               </w:rPr>
-              <w:t>[Shading non-resi]</w:t>
+              <w:t>[Shading non-</w:t>
+            </w:r>
+            <w:proofErr w:type="spellStart"/>
+            <w:r>
+              <w:rPr>
+                <w:szCs w:val="22"/>
+              </w:rPr>
+              <w:t>resi</w:t>
+            </w:r>
+            <w:proofErr w:type="spellEnd"/>
+            <w:r>
+              <w:rPr>
+                <w:szCs w:val="22"/>
+              </w:rPr>
+              <w:t>]</w:t>
             </w:r>
           </w:p>
         </w:tc>
@@ -13842,19 +14148,19 @@
       <w:pPr>
         <w:pStyle w:val="Heading2"/>
       </w:pPr>
-      <w:bookmarkStart w:id="88" w:name="_Toc461726283"/>
-      <w:bookmarkStart w:id="89" w:name="_Toc462823801"/>
-      <w:bookmarkStart w:id="90" w:name="_Toc46738709"/>
-      <w:bookmarkStart w:id="91" w:name="_Toc231555529"/>
-      <w:bookmarkEnd w:id="80"/>
+      <w:bookmarkStart w:id="87" w:name="_Toc461726283"/>
+      <w:bookmarkStart w:id="88" w:name="_Toc462823801"/>
+      <w:bookmarkStart w:id="89" w:name="_Toc46738709"/>
+      <w:bookmarkStart w:id="90" w:name="_Toc231555529"/>
+      <w:bookmarkEnd w:id="79"/>
       <w:r>
         <w:lastRenderedPageBreak/>
         <w:t>Transport</w:t>
       </w:r>
+      <w:bookmarkEnd w:id="87"/>
       <w:bookmarkEnd w:id="88"/>
       <w:bookmarkEnd w:id="89"/>
       <w:bookmarkEnd w:id="90"/>
-      <w:bookmarkEnd w:id="91"/>
     </w:p>
     <w:p>
       <w:pPr>
@@ -14093,7 +14399,7 @@
               </w:rPr>
               <w:t xml:space="preserve"> </w:t>
             </w:r>
-            <w:bookmarkStart w:id="92" w:name="Bicycles"/>
+            <w:bookmarkStart w:id="91" w:name="Bicycles"/>
             <w:r>
               <w:rPr>
                 <w:szCs w:val="22"/>
@@ -14118,66 +14424,80 @@
               </w:rPr>
               <w:t xml:space="preserve"> bicycle spaces are to be provided for residents.</w:t>
             </w:r>
+            <w:bookmarkEnd w:id="91"/>
+            <w:r>
+              <w:rPr>
+                <w:szCs w:val="22"/>
+              </w:rPr>
+              <w:t xml:space="preserve"> This will provide a ratio of approximately 1 resident bicycle space for every apartment.</w:t>
+            </w:r>
+          </w:p>
+          <w:p>
+            <w:pPr>
+              <w:spacing w:before="0" w:after="0"/>
+              <w:rPr>
+                <w:szCs w:val="22"/>
+              </w:rPr>
+            </w:pPr>
+          </w:p>
+          <w:p>
+            <w:pPr>
+              <w:spacing w:before="0" w:after="0"/>
+              <w:rPr>
+                <w:szCs w:val="22"/>
+              </w:rPr>
+            </w:pPr>
+            <w:r>
+              <w:rPr>
+                <w:szCs w:val="22"/>
+              </w:rPr>
+              <w:t xml:space="preserve"> </w:t>
+            </w:r>
+            <w:bookmarkStart w:id="92" w:name="OLE_LINK9"/>
+            <w:r>
+              <w:rPr>
+                <w:szCs w:val="22"/>
+              </w:rPr>
+              <w:t>[</w:t>
+            </w:r>
+            <w:r>
+              <w:rPr>
+                <w:szCs w:val="22"/>
+              </w:rPr>
+              <w:t>residential visitor bikes</w:t>
+            </w:r>
+            <w:r>
+              <w:rPr>
+                <w:szCs w:val="22"/>
+              </w:rPr>
+              <w:t>]</w:t>
+            </w:r>
+            <w:r>
+              <w:rPr>
+                <w:szCs w:val="22"/>
+              </w:rPr>
+              <w:t xml:space="preserve"> bicycle spaces are to be provided for residential visitors.</w:t>
+            </w:r>
             <w:bookmarkEnd w:id="92"/>
             <w:r>
               <w:rPr>
                 <w:szCs w:val="22"/>
               </w:rPr>
-              <w:t xml:space="preserve"> This will provide a ratio of approximately 1 resident bicycle space for every apartment.</w:t>
-            </w:r>
-          </w:p>
-          <w:p>
-            <w:pPr>
-              <w:spacing w:before="0" w:after="0"/>
-              <w:rPr>
-                <w:szCs w:val="22"/>
-              </w:rPr>
-            </w:pPr>
-          </w:p>
-          <w:p>
-            <w:pPr>
-              <w:spacing w:before="0" w:after="0"/>
-              <w:rPr>
-                <w:szCs w:val="22"/>
-              </w:rPr>
-            </w:pPr>
-            <w:r>
-              <w:rPr>
-                <w:szCs w:val="22"/>
-              </w:rPr>
-              <w:t xml:space="preserve"> </w:t>
-            </w:r>
-            <w:bookmarkStart w:id="93" w:name="OLE_LINK9"/>
-            <w:r>
-              <w:rPr>
-                <w:szCs w:val="22"/>
-              </w:rPr>
-              <w:t>[</w:t>
-            </w:r>
-            <w:r>
-              <w:rPr>
-                <w:szCs w:val="22"/>
-              </w:rPr>
-              <w:t>residential visitor bikes</w:t>
-            </w:r>
-            <w:r>
-              <w:rPr>
-                <w:szCs w:val="22"/>
-              </w:rPr>
-              <w:t>]</w:t>
-            </w:r>
-            <w:r>
-              <w:rPr>
-                <w:szCs w:val="22"/>
-              </w:rPr>
-              <w:t xml:space="preserve"> bicycle spaces are to be provided for residential visitors.</w:t>
-            </w:r>
-            <w:bookmarkEnd w:id="93"/>
-            <w:r>
-              <w:rPr>
-                <w:szCs w:val="22"/>
-              </w:rPr>
-              <w:t xml:space="preserve"> This will provide a ratio of approximately 1 visitor bicycle space for every X apartments.</w:t>
+              <w:t xml:space="preserve"> This will provide a ratio of approximately 1 visitor bicycle space for every X </w:t>
+            </w:r>
+            <w:proofErr w:type="gramStart"/>
+            <w:r>
+              <w:rPr>
+                <w:szCs w:val="22"/>
+              </w:rPr>
+              <w:t>apartments</w:t>
+            </w:r>
+            <w:proofErr w:type="gramEnd"/>
+            <w:r>
+              <w:rPr>
+                <w:szCs w:val="22"/>
+              </w:rPr>
+              <w:t>.</w:t>
             </w:r>
           </w:p>
         </w:tc>
@@ -14265,7 +14585,7 @@
               </w:rPr>
               <w:t xml:space="preserve"> </w:t>
             </w:r>
-            <w:bookmarkStart w:id="94" w:name="Employee_Bike"/>
+            <w:bookmarkStart w:id="93" w:name="Employee_Bike"/>
             <w:r>
               <w:rPr>
                 <w:szCs w:val="22"/>
@@ -14290,61 +14610,61 @@
               </w:rPr>
               <w:t xml:space="preserve"> bicycle spaces are to be provided for employees</w:t>
             </w:r>
+            <w:bookmarkEnd w:id="93"/>
+            <w:r>
+              <w:rPr>
+                <w:szCs w:val="22"/>
+              </w:rPr>
+              <w:t>. This represents a 50% increase over the planning scheme requirements.</w:t>
+            </w:r>
+          </w:p>
+          <w:p>
+            <w:pPr>
+              <w:spacing w:before="0" w:after="0"/>
+              <w:rPr>
+                <w:szCs w:val="22"/>
+              </w:rPr>
+            </w:pPr>
+          </w:p>
+          <w:p>
+            <w:pPr>
+              <w:spacing w:before="0" w:after="0"/>
+              <w:rPr>
+                <w:szCs w:val="22"/>
+              </w:rPr>
+            </w:pPr>
+            <w:r>
+              <w:rPr>
+                <w:szCs w:val="22"/>
+              </w:rPr>
+              <w:t xml:space="preserve"> </w:t>
+            </w:r>
+            <w:bookmarkStart w:id="94" w:name="Non_res_Vis"/>
+            <w:r>
+              <w:rPr>
+                <w:szCs w:val="22"/>
+              </w:rPr>
+              <w:t>[</w:t>
+            </w:r>
+            <w:r>
+              <w:rPr>
+                <w:szCs w:val="22"/>
+              </w:rPr>
+              <w:t>commercial visitor bikes</w:t>
+            </w:r>
+            <w:r>
+              <w:rPr>
+                <w:szCs w:val="22"/>
+              </w:rPr>
+              <w:t>]</w:t>
+            </w:r>
+            <w:r>
+              <w:rPr>
+                <w:szCs w:val="22"/>
+              </w:rPr>
+              <w:t xml:space="preserve"> bicycle spaces are to be provided for non-residential visitors</w:t>
+            </w:r>
             <w:bookmarkEnd w:id="94"/>
-            <w:r>
-              <w:rPr>
-                <w:szCs w:val="22"/>
-              </w:rPr>
-              <w:t>. This represents a 50% increase over the planning scheme requirements.</w:t>
-            </w:r>
-          </w:p>
-          <w:p>
-            <w:pPr>
-              <w:spacing w:before="0" w:after="0"/>
-              <w:rPr>
-                <w:szCs w:val="22"/>
-              </w:rPr>
-            </w:pPr>
-          </w:p>
-          <w:p>
-            <w:pPr>
-              <w:spacing w:before="0" w:after="0"/>
-              <w:rPr>
-                <w:szCs w:val="22"/>
-              </w:rPr>
-            </w:pPr>
-            <w:r>
-              <w:rPr>
-                <w:szCs w:val="22"/>
-              </w:rPr>
-              <w:t xml:space="preserve"> </w:t>
-            </w:r>
-            <w:bookmarkStart w:id="95" w:name="Non_res_Vis"/>
-            <w:r>
-              <w:rPr>
-                <w:szCs w:val="22"/>
-              </w:rPr>
-              <w:t>[</w:t>
-            </w:r>
-            <w:r>
-              <w:rPr>
-                <w:szCs w:val="22"/>
-              </w:rPr>
-              <w:t>commercial visitor bikes</w:t>
-            </w:r>
-            <w:r>
-              <w:rPr>
-                <w:szCs w:val="22"/>
-              </w:rPr>
-              <w:t>]</w:t>
-            </w:r>
-            <w:r>
-              <w:rPr>
-                <w:szCs w:val="22"/>
-              </w:rPr>
-              <w:t xml:space="preserve"> bicycle spaces are to be provided for non-residential visitors</w:t>
-            </w:r>
-            <w:bookmarkEnd w:id="95"/>
             <w:r>
               <w:rPr>
                 <w:szCs w:val="22"/>
@@ -14433,14 +14753,14 @@
                 <w:szCs w:val="22"/>
               </w:rPr>
             </w:pPr>
-            <w:bookmarkStart w:id="96" w:name="end_of_trip"/>
+            <w:bookmarkStart w:id="95" w:name="end_of_trip"/>
             <w:r>
               <w:rPr>
                 <w:szCs w:val="22"/>
               </w:rPr>
               <w:t>The development is provided with an end of trip facility</w:t>
             </w:r>
-            <w:bookmarkEnd w:id="96"/>
+            <w:bookmarkEnd w:id="95"/>
             <w:r>
               <w:rPr>
                 <w:szCs w:val="22"/>
@@ -14872,11 +15192,11 @@
           <w:szCs w:val="20"/>
         </w:rPr>
       </w:pPr>
-      <w:bookmarkStart w:id="97" w:name="_Toc531765802"/>
-      <w:bookmarkStart w:id="98" w:name="_Toc231555530"/>
-      <w:bookmarkStart w:id="99" w:name="_Toc461726284"/>
-      <w:bookmarkStart w:id="100" w:name="_Toc462823802"/>
-      <w:bookmarkStart w:id="101" w:name="_Toc46738710"/>
+      <w:bookmarkStart w:id="96" w:name="_Toc531765802"/>
+      <w:bookmarkStart w:id="97" w:name="_Toc231555530"/>
+      <w:bookmarkStart w:id="98" w:name="_Toc461726284"/>
+      <w:bookmarkStart w:id="99" w:name="_Toc462823802"/>
+      <w:bookmarkStart w:id="100" w:name="_Toc46738710"/>
       <w:r>
         <w:br w:type="page"/>
       </w:r>
@@ -14889,8 +15209,8 @@
         <w:lastRenderedPageBreak/>
         <w:t>Materials</w:t>
       </w:r>
+      <w:bookmarkEnd w:id="96"/>
       <w:bookmarkEnd w:id="97"/>
-      <w:bookmarkEnd w:id="98"/>
     </w:p>
     <w:p>
       <w:pPr>
@@ -15151,7 +15471,21 @@
               <w:rPr>
                 <w:szCs w:val="22"/>
               </w:rPr>
-              <w:t xml:space="preserve">Concrete mixes used within the project will seek to reduce Portland cement and aggregate content where deemed appropriate by the structural engineer. </w:t>
+              <w:t xml:space="preserve">Concrete mixes used within the project will seek to reduce Portland cement and aggregate content </w:t>
+            </w:r>
+            <w:proofErr w:type="gramStart"/>
+            <w:r>
+              <w:rPr>
+                <w:szCs w:val="22"/>
+              </w:rPr>
+              <w:t>where</w:t>
+            </w:r>
+            <w:proofErr w:type="gramEnd"/>
+            <w:r>
+              <w:rPr>
+                <w:szCs w:val="22"/>
+              </w:rPr>
+              <w:t xml:space="preserve"> deemed appropriate by the structural engineer. </w:t>
             </w:r>
           </w:p>
           <w:p>
@@ -15598,7 +15932,21 @@
               <w:rPr>
                 <w:szCs w:val="22"/>
               </w:rPr>
-              <w:t>The project will incorporate products that meet the transparency and sustainability requirements where deemed appropriate. This includes the following: reused products, recycled content products, environmental product declarations, third party certified and stewardship programs.</w:t>
+              <w:t xml:space="preserve">The project will incorporate products that meet the transparency and sustainability requirements </w:t>
+            </w:r>
+            <w:proofErr w:type="gramStart"/>
+            <w:r>
+              <w:rPr>
+                <w:szCs w:val="22"/>
+              </w:rPr>
+              <w:t>where</w:t>
+            </w:r>
+            <w:proofErr w:type="gramEnd"/>
+            <w:r>
+              <w:rPr>
+                <w:szCs w:val="22"/>
+              </w:rPr>
+              <w:t xml:space="preserve"> deemed appropriate. This includes the following: reused products, recycled content products, environmental product declarations, third party certified and stewardship programs.</w:t>
             </w:r>
           </w:p>
         </w:tc>
@@ -15609,18 +15957,18 @@
       <w:pPr>
         <w:pStyle w:val="Heading2"/>
       </w:pPr>
-      <w:bookmarkStart w:id="102" w:name="_Toc231555531"/>
+      <w:bookmarkStart w:id="101" w:name="_Toc231555531"/>
       <w:r>
         <w:lastRenderedPageBreak/>
         <w:t>Waste</w:t>
       </w:r>
+      <w:bookmarkEnd w:id="98"/>
       <w:bookmarkEnd w:id="99"/>
       <w:bookmarkEnd w:id="100"/>
-      <w:bookmarkEnd w:id="101"/>
       <w:r>
         <w:t xml:space="preserve"> &amp; Resource Recovery</w:t>
       </w:r>
-      <w:bookmarkEnd w:id="102"/>
+      <w:bookmarkEnd w:id="101"/>
     </w:p>
     <w:p>
       <w:pPr>
@@ -15972,7 +16320,7 @@
                 <w:szCs w:val="22"/>
               </w:rPr>
             </w:pPr>
-            <w:bookmarkStart w:id="103" w:name="Waste_Percent"/>
+            <w:bookmarkStart w:id="102" w:name="Waste_Percent"/>
             <w:r>
               <w:rPr>
                 <w:szCs w:val="22"/>
@@ -15991,7 +16339,7 @@
               </w:rPr>
               <w:t>0% of the waste generated during construction and demolition has been diverted from landfill</w:t>
             </w:r>
-            <w:bookmarkEnd w:id="103"/>
+            <w:bookmarkEnd w:id="102"/>
             <w:r>
               <w:rPr>
                 <w:szCs w:val="22"/>
@@ -16167,14 +16515,14 @@
                 <w:szCs w:val="22"/>
               </w:rPr>
             </w:pPr>
-            <w:bookmarkStart w:id="104" w:name="Recycle_Location"/>
+            <w:bookmarkStart w:id="103" w:name="Recycle_Location"/>
             <w:r>
               <w:rPr>
                 <w:szCs w:val="22"/>
               </w:rPr>
               <w:t>Separate general, recycling, glass and organic waste storage will be provided at XXX</w:t>
             </w:r>
-            <w:bookmarkEnd w:id="104"/>
+            <w:bookmarkEnd w:id="103"/>
             <w:r>
               <w:rPr>
                 <w:szCs w:val="22"/>
@@ -16195,7 +16543,21 @@
                 <w:szCs w:val="22"/>
               </w:rPr>
               <w:br/>
-              <w:t>Each tenancy is to be provided with separate general, recycling and food and organics waste bins. This requirement is to be included in the owners corporation rules or lease agreement.</w:t>
+              <w:t xml:space="preserve">Each tenancy is to be provided with separate general, recycling and food and organics waste bins. This requirement is to be included in the </w:t>
+            </w:r>
+            <w:proofErr w:type="gramStart"/>
+            <w:r>
+              <w:rPr>
+                <w:szCs w:val="22"/>
+              </w:rPr>
+              <w:t>owners</w:t>
+            </w:r>
+            <w:proofErr w:type="gramEnd"/>
+            <w:r>
+              <w:rPr>
+                <w:szCs w:val="22"/>
+              </w:rPr>
+              <w:t xml:space="preserve"> corporation rules or lease agreement.</w:t>
             </w:r>
             <w:r>
               <w:rPr>
@@ -16223,8 +16585,8 @@
           <w:szCs w:val="26"/>
         </w:rPr>
       </w:pPr>
-      <w:bookmarkStart w:id="105" w:name="_Toc461726285"/>
-      <w:bookmarkStart w:id="106" w:name="_Toc462823803"/>
+      <w:bookmarkStart w:id="104" w:name="_Toc461726285"/>
+      <w:bookmarkStart w:id="105" w:name="_Toc462823803"/>
       <w:r>
         <w:br w:type="page"/>
       </w:r>
@@ -16233,16 +16595,16 @@
       <w:pPr>
         <w:pStyle w:val="Heading2"/>
       </w:pPr>
-      <w:bookmarkStart w:id="107" w:name="_Toc46738711"/>
-      <w:bookmarkStart w:id="108" w:name="_Toc231555532"/>
+      <w:bookmarkStart w:id="106" w:name="_Toc46738711"/>
+      <w:bookmarkStart w:id="107" w:name="_Toc231555532"/>
       <w:r>
         <w:lastRenderedPageBreak/>
         <w:t>Urban Ecology</w:t>
       </w:r>
+      <w:bookmarkEnd w:id="104"/>
       <w:bookmarkEnd w:id="105"/>
       <w:bookmarkEnd w:id="106"/>
       <w:bookmarkEnd w:id="107"/>
-      <w:bookmarkEnd w:id="108"/>
     </w:p>
     <w:p>
       <w:pPr>
@@ -16526,7 +16888,7 @@
                 <w:szCs w:val="22"/>
               </w:rPr>
             </w:pPr>
-            <w:bookmarkStart w:id="109" w:name="Communal_space"/>
+            <w:bookmarkStart w:id="108" w:name="Communal_space"/>
             <w:r>
               <w:rPr>
                 <w:szCs w:val="22"/>
@@ -16564,7 +16926,7 @@
               </w:rPr>
               <w:t xml:space="preserve"> of communal space will be provided at XXX.</w:t>
             </w:r>
-            <w:bookmarkEnd w:id="109"/>
+            <w:bookmarkEnd w:id="108"/>
             <w:r>
               <w:rPr>
                 <w:szCs w:val="22"/>
@@ -16718,7 +17080,7 @@
               </w:rPr>
               <w:br/>
             </w:r>
-            <w:bookmarkStart w:id="110" w:name="Vege_Percent"/>
+            <w:bookmarkStart w:id="109" w:name="Vege_Percent"/>
             <w:r>
               <w:rPr>
                 <w:szCs w:val="22"/>
@@ -16749,7 +17111,7 @@
               </w:rPr>
               <w:t>% of the site area</w:t>
             </w:r>
-            <w:bookmarkEnd w:id="110"/>
+            <w:bookmarkEnd w:id="109"/>
             <w:r>
               <w:rPr>
                 <w:szCs w:val="22"/>
@@ -17024,7 +17386,7 @@
                 <w:szCs w:val="22"/>
               </w:rPr>
             </w:pPr>
-            <w:bookmarkStart w:id="111" w:name="Food_production"/>
+            <w:bookmarkStart w:id="110" w:name="Food_production"/>
             <w:r>
               <w:rPr>
                 <w:szCs w:val="22"/>
@@ -17049,7 +17411,7 @@
               </w:rPr>
               <w:t>m2 of communal food production area will be provided</w:t>
             </w:r>
-            <w:bookmarkEnd w:id="111"/>
+            <w:bookmarkEnd w:id="110"/>
             <w:r>
               <w:rPr>
                 <w:szCs w:val="22"/>
@@ -17144,7 +17506,21 @@
               <w:rPr>
                 <w:szCs w:val="22"/>
               </w:rPr>
-              <w:t>Roofs are to have a three year SRI of minimum 60</w:t>
+              <w:t xml:space="preserve">Roofs are to have a </w:t>
+            </w:r>
+            <w:proofErr w:type="gramStart"/>
+            <w:r>
+              <w:rPr>
+                <w:szCs w:val="22"/>
+              </w:rPr>
+              <w:t>three year</w:t>
+            </w:r>
+            <w:proofErr w:type="gramEnd"/>
+            <w:r>
+              <w:rPr>
+                <w:szCs w:val="22"/>
+              </w:rPr>
+              <w:t xml:space="preserve"> SRI of minimum 60</w:t>
             </w:r>
             <w:r>
               <w:rPr>
@@ -17171,14 +17547,28 @@
               <w:rPr>
                 <w:szCs w:val="22"/>
               </w:rPr>
-              <w:t>Unshaded hard-scaping elements are to have a three year SRI of minimum 40.</w:t>
+              <w:t xml:space="preserve">Unshaded hard-scaping elements are to have a </w:t>
+            </w:r>
+            <w:proofErr w:type="gramStart"/>
+            <w:r>
+              <w:rPr>
+                <w:szCs w:val="22"/>
+              </w:rPr>
+              <w:t>three year</w:t>
+            </w:r>
+            <w:proofErr w:type="gramEnd"/>
+            <w:r>
+              <w:rPr>
+                <w:szCs w:val="22"/>
+              </w:rPr>
+              <w:t xml:space="preserve"> SRI of minimum 40.</w:t>
             </w:r>
           </w:p>
         </w:tc>
       </w:tr>
     </w:tbl>
     <w:p>
-      <w:bookmarkStart w:id="112" w:name="_Toc461726286"/>
+      <w:bookmarkStart w:id="111" w:name="_Toc461726286"/>
     </w:p>
     <w:p>
       <w:r>
@@ -17189,17 +17579,17 @@
       <w:pPr>
         <w:pStyle w:val="Heading2"/>
       </w:pPr>
-      <w:bookmarkStart w:id="113" w:name="_Toc462823804"/>
-      <w:bookmarkStart w:id="114" w:name="_Toc46738712"/>
-      <w:bookmarkStart w:id="115" w:name="_Toc231555533"/>
+      <w:bookmarkStart w:id="112" w:name="_Toc462823804"/>
+      <w:bookmarkStart w:id="113" w:name="_Toc46738712"/>
+      <w:bookmarkStart w:id="114" w:name="_Toc231555533"/>
       <w:r>
         <w:lastRenderedPageBreak/>
         <w:t>Innovation</w:t>
       </w:r>
+      <w:bookmarkEnd w:id="111"/>
       <w:bookmarkEnd w:id="112"/>
       <w:bookmarkEnd w:id="113"/>
       <w:bookmarkEnd w:id="114"/>
-      <w:bookmarkEnd w:id="115"/>
     </w:p>
     <w:p>
       <w:pPr>
@@ -17606,7 +17996,21 @@
               <w:rPr>
                 <w:szCs w:val="22"/>
               </w:rPr>
-              <w:t xml:space="preserve">The proposed development will be established with a carbon neutral power agreement between developer, owner’s corporation, and electrical retailer to provide GreenPower for all energy consumed by building (including communal areas, apartments and retail tenancy). It is the intent to maintain this agreement for a minimum of 10 years. </w:t>
+              <w:t xml:space="preserve">The proposed development will be established with a carbon neutral power agreement between developer, owner’s corporation, and electrical retailer to provide </w:t>
+            </w:r>
+            <w:proofErr w:type="spellStart"/>
+            <w:r>
+              <w:rPr>
+                <w:szCs w:val="22"/>
+              </w:rPr>
+              <w:t>GreenPower</w:t>
+            </w:r>
+            <w:proofErr w:type="spellEnd"/>
+            <w:r>
+              <w:rPr>
+                <w:szCs w:val="22"/>
+              </w:rPr>
+              <w:t xml:space="preserve"> for all energy consumed by building (including communal areas, apartments and retail tenancy). It is the intent to maintain this agreement for a minimum of 10 years. </w:t>
             </w:r>
           </w:p>
         </w:tc>
@@ -17759,8 +18163,8 @@
           <w:rFonts w:eastAsiaTheme="minorEastAsia"/>
         </w:rPr>
       </w:pPr>
-      <w:bookmarkStart w:id="116" w:name="WSUD_Appendix"/>
-      <w:bookmarkStart w:id="117" w:name="_Toc231555534"/>
+      <w:bookmarkStart w:id="115" w:name="WSUD_Appendix"/>
+      <w:bookmarkStart w:id="116" w:name="_Toc231555534"/>
       <w:r>
         <w:lastRenderedPageBreak/>
         <w:t xml:space="preserve">Appendix </w:t>
@@ -17771,8 +18175,8 @@
       <w:r>
         <w:t xml:space="preserve"> – WSUD Response</w:t>
       </w:r>
+      <w:bookmarkEnd w:id="115"/>
       <w:bookmarkEnd w:id="116"/>
-      <w:bookmarkEnd w:id="117"/>
     </w:p>
     <w:p>
       <w:pPr>
@@ -17800,7 +18204,7 @@
       <w:r>
         <w:t>The following architectural mark-up illustrates the rainwater collection and impervious areas of the proposed development site.</w:t>
       </w:r>
-      <w:bookmarkStart w:id="118" w:name="_Toc451243777"/>
+      <w:bookmarkStart w:id="117" w:name="_Toc451243777"/>
     </w:p>
     <w:tbl>
       <w:tblPr>
@@ -17880,7 +18284,7 @@
         </w:tc>
       </w:tr>
     </w:tbl>
-    <w:bookmarkEnd w:id="118"/>
+    <w:bookmarkEnd w:id="117"/>
     <w:p>
       <w:pPr>
         <w:pStyle w:val="Heading3"/>
@@ -17932,7 +18336,15 @@
         <w:t xml:space="preserve"> [rainwater tank size]</w:t>
       </w:r>
       <w:r>
-        <w:t xml:space="preserve"> litre rainwater tank. XX WC’s are to be connected to the rainwater tank.</w:t>
+        <w:t xml:space="preserve"> litre rainwater tank. XX </w:t>
+      </w:r>
+      <w:proofErr w:type="gramStart"/>
+      <w:r>
+        <w:t>WC’s</w:t>
+      </w:r>
+      <w:proofErr w:type="gramEnd"/>
+      <w:r>
+        <w:t xml:space="preserve"> are to be connected to the rainwater tank.</w:t>
       </w:r>
     </w:p>
     <w:p>
@@ -17942,10 +18354,18 @@
         <w:jc w:val="both"/>
       </w:pPr>
       <w:r>
-        <w:t>Rainwater is to be collected from XX and directed into a ≥</w:t>
+        <w:t xml:space="preserve">Rainwater is to be collected from XX and directed into a </w:t>
+      </w:r>
+      <w:proofErr w:type="gramStart"/>
+      <w:r>
+        <w:t>≥</w:t>
       </w:r>
       <w:r>
-        <w:t>[raingarden size]</w:t>
+        <w:t>[</w:t>
+      </w:r>
+      <w:proofErr w:type="gramEnd"/>
+      <w:r>
+        <w:t>raingarden size]</w:t>
       </w:r>
       <w:r>
         <w:t>m2, minimum 1,150mm deep raingarden with 300mm of extended detention.</w:t>
@@ -18295,18 +18715,32 @@
       <w:r>
         <w:t xml:space="preserve">Furthermore, </w:t>
       </w:r>
-      <w:bookmarkStart w:id="119" w:name="_Hlk512948205"/>
+      <w:bookmarkStart w:id="118" w:name="_Hlk512948205"/>
       <w:r>
         <w:rPr>
           <w:highlight w:val="yellow"/>
         </w:rPr>
-        <w:t>a ≥</w:t>
+        <w:t xml:space="preserve">a </w:t>
+      </w:r>
+      <w:proofErr w:type="gramStart"/>
+      <w:r>
+        <w:rPr>
+          <w:highlight w:val="yellow"/>
+        </w:rPr>
+        <w:t>≥</w:t>
       </w:r>
       <w:r>
         <w:rPr>
           <w:highlight w:val="yellow"/>
         </w:rPr>
-        <w:t>[raingarden size]</w:t>
+        <w:t>[</w:t>
+      </w:r>
+      <w:proofErr w:type="gramEnd"/>
+      <w:r>
+        <w:rPr>
+          <w:highlight w:val="yellow"/>
+        </w:rPr>
+        <w:t>raingarden size]</w:t>
       </w:r>
       <w:r>
         <w:rPr>
@@ -18324,7 +18758,7 @@
       <w:r>
         <w:t>, minimum 1,150mm deep raingarden with 300mm of extended detention</w:t>
       </w:r>
-      <w:bookmarkEnd w:id="119"/>
+      <w:bookmarkEnd w:id="118"/>
       <w:r>
         <w:t xml:space="preserve"> is to be provided. Rainwater collected from </w:t>
       </w:r>
@@ -18602,7 +19036,15 @@
         <w:jc w:val="both"/>
       </w:pPr>
       <w:r>
-        <w:t>Introduction of offsite construction for building elements where deemed appropriate.</w:t>
+        <w:t xml:space="preserve">Introduction of offsite construction for building elements </w:t>
+      </w:r>
+      <w:proofErr w:type="gramStart"/>
+      <w:r>
+        <w:t>where</w:t>
+      </w:r>
+      <w:proofErr w:type="gramEnd"/>
+      <w:r>
+        <w:t xml:space="preserve"> deemed appropriate.</w:t>
       </w:r>
     </w:p>
     <w:p>
@@ -19521,7 +19963,21 @@
               <w:rPr>
                 <w:szCs w:val="22"/>
               </w:rPr>
-              <w:t xml:space="preserve">Clear inflow points of built up sediment, rubbish and leaves.  </w:t>
+              <w:t xml:space="preserve">Clear inflow points of </w:t>
+            </w:r>
+            <w:proofErr w:type="gramStart"/>
+            <w:r>
+              <w:rPr>
+                <w:szCs w:val="22"/>
+              </w:rPr>
+              <w:t>built up</w:t>
+            </w:r>
+            <w:proofErr w:type="gramEnd"/>
+            <w:r>
+              <w:rPr>
+                <w:szCs w:val="22"/>
+              </w:rPr>
+              <w:t xml:space="preserve"> sediment, rubbish and leaves.  </w:t>
             </w:r>
           </w:p>
           <w:p>
@@ -20033,8 +20489,8 @@
           <w:rFonts w:eastAsiaTheme="minorEastAsia"/>
         </w:rPr>
       </w:pPr>
-      <w:bookmarkStart w:id="120" w:name="Energy_Appendix"/>
-      <w:bookmarkStart w:id="121" w:name="_Toc231555535"/>
+      <w:bookmarkStart w:id="119" w:name="Energy_Appendix"/>
+      <w:bookmarkStart w:id="120" w:name="_Toc231555535"/>
       <w:r>
         <w:lastRenderedPageBreak/>
         <w:t xml:space="preserve">Appendix </w:t>
@@ -20054,14 +20510,14 @@
       <w:r>
         <w:t xml:space="preserve"> Certificates</w:t>
       </w:r>
-      <w:bookmarkEnd w:id="120"/>
+      <w:bookmarkEnd w:id="119"/>
       <w:r>
         <w:rPr>
           <w:rFonts w:eastAsiaTheme="minorEastAsia"/>
         </w:rPr>
         <w:t>.</w:t>
       </w:r>
-      <w:bookmarkEnd w:id="121"/>
+      <w:bookmarkEnd w:id="120"/>
       <w:r>
         <w:rPr>
           <w:rFonts w:eastAsiaTheme="minorEastAsia"/>
@@ -20081,7 +20537,21 @@
         <w:rPr>
           <w:rFonts w:eastAsia="Times New Roman" w:cs="Times New Roman"/>
         </w:rPr>
-        <w:t xml:space="preserve">The National Construction Code (NCC) Class 2 – Sole Occupancy Unit(s) residential building component is to be designed in accordance with NCC Section J (2022) NatHERS requirements. The residential units must achieve an average </w:t>
+        <w:t xml:space="preserve">The National Construction Code (NCC) Class 2 – Sole Occupancy Unit(s) residential building component is to be designed in accordance with NCC Section J (2022) </w:t>
+      </w:r>
+      <w:proofErr w:type="spellStart"/>
+      <w:r>
+        <w:rPr>
+          <w:rFonts w:eastAsia="Times New Roman" w:cs="Times New Roman"/>
+        </w:rPr>
+        <w:t>NatHERS</w:t>
+      </w:r>
+      <w:proofErr w:type="spellEnd"/>
+      <w:r>
+        <w:rPr>
+          <w:rFonts w:eastAsia="Times New Roman" w:cs="Times New Roman"/>
+        </w:rPr>
+        <w:t xml:space="preserve"> requirements. The residential units must achieve an average </w:t>
       </w:r>
       <w:r>
         <w:rPr>
@@ -20517,7 +20987,27 @@
           <w:color w:val="auto"/>
           <w:szCs w:val="22"/>
         </w:rPr>
-        <w:t xml:space="preserve">The apartments are currently achieving a X.X Star average. The below sample ratings demonstrate the developments ability to achieve </w:t>
+        <w:t xml:space="preserve">The apartments are currently achieving a X.X Star average. The below sample ratings demonstrate the </w:t>
+      </w:r>
+      <w:proofErr w:type="gramStart"/>
+      <w:r>
+        <w:rPr>
+          <w:rFonts w:ascii="Roboto Light" w:hAnsi="Roboto Light"/>
+          <w:b w:val="0"/>
+          <w:color w:val="auto"/>
+          <w:szCs w:val="22"/>
+        </w:rPr>
+        <w:t>developments</w:t>
+      </w:r>
+      <w:proofErr w:type="gramEnd"/>
+      <w:r>
+        <w:rPr>
+          <w:rFonts w:ascii="Roboto Light" w:hAnsi="Roboto Light"/>
+          <w:b w:val="0"/>
+          <w:color w:val="auto"/>
+          <w:szCs w:val="22"/>
+        </w:rPr>
+        <w:t xml:space="preserve"> ability to achieve </w:t>
       </w:r>
       <w:r>
         <w:rPr>
@@ -20644,6 +21134,7 @@
                 <w:color w:val="00602B" w:themeColor="accent1"/>
               </w:rPr>
             </w:pPr>
+            <w:proofErr w:type="gramStart"/>
             <w:r>
               <w:rPr>
                 <w:rFonts w:ascii="Roboto" w:hAnsi="Roboto"/>
@@ -20651,6 +21142,7 @@
               </w:rPr>
               <w:t>ACE  Heating</w:t>
             </w:r>
+            <w:proofErr w:type="gramEnd"/>
             <w:r>
               <w:rPr>
                 <w:rFonts w:ascii="Roboto" w:hAnsi="Roboto"/>
@@ -20685,6 +21177,7 @@
                 <w:color w:val="00602B" w:themeColor="accent1"/>
               </w:rPr>
             </w:pPr>
+            <w:proofErr w:type="gramStart"/>
             <w:r>
               <w:rPr>
                 <w:rFonts w:ascii="Roboto" w:hAnsi="Roboto"/>
@@ -20692,6 +21185,7 @@
               </w:rPr>
               <w:t>ACE  Cooling</w:t>
             </w:r>
+            <w:proofErr w:type="gramEnd"/>
             <w:r>
               <w:rPr>
                 <w:rFonts w:ascii="Roboto" w:hAnsi="Roboto"/>
@@ -20726,6 +21220,7 @@
                 <w:color w:val="00602B" w:themeColor="accent1"/>
               </w:rPr>
             </w:pPr>
+            <w:proofErr w:type="gramStart"/>
             <w:r>
               <w:rPr>
                 <w:rFonts w:ascii="Roboto" w:hAnsi="Roboto"/>
@@ -20733,6 +21228,7 @@
               </w:rPr>
               <w:t>ACE  NCFA</w:t>
             </w:r>
+            <w:proofErr w:type="gramEnd"/>
           </w:p>
         </w:tc>
         <w:tc>
@@ -21921,6 +22417,7 @@
                 <w:szCs w:val="22"/>
               </w:rPr>
             </w:pPr>
+            <w:proofErr w:type="gramStart"/>
             <w:r>
               <w:rPr>
                 <w:rFonts w:ascii="Roboto Light" w:hAnsi="Roboto Light"/>
@@ -21929,6 +22426,7 @@
               </w:rPr>
               <w:t>RX.X+RX.X</w:t>
             </w:r>
+            <w:proofErr w:type="gramEnd"/>
           </w:p>
         </w:tc>
       </w:tr>
@@ -22160,16 +22658,26 @@
                 <w:b w:val="0"/>
                 <w:szCs w:val="22"/>
               </w:rPr>
-              <w:t xml:space="preserve"> Argon filled, </w:t>
-            </w:r>
+              <w:t xml:space="preserve"> Argon </w:t>
+            </w:r>
+            <w:proofErr w:type="gramStart"/>
             <w:r>
               <w:rPr>
                 <w:rFonts w:ascii="Roboto Light" w:hAnsi="Roboto Light"/>
                 <w:b w:val="0"/>
                 <w:szCs w:val="22"/>
               </w:rPr>
+              <w:t xml:space="preserve">filled, </w:t>
+            </w:r>
+            <w:r>
+              <w:rPr>
+                <w:rFonts w:ascii="Roboto Light" w:hAnsi="Roboto Light"/>
+                <w:b w:val="0"/>
+                <w:szCs w:val="22"/>
+              </w:rPr>
               <w:t xml:space="preserve"> Clear</w:t>
             </w:r>
+            <w:proofErr w:type="gramEnd"/>
           </w:p>
         </w:tc>
         <w:tc>
@@ -22320,16 +22828,26 @@
                 <w:b w:val="0"/>
                 <w:szCs w:val="22"/>
               </w:rPr>
-              <w:t xml:space="preserve"> Argon filled, </w:t>
-            </w:r>
+              <w:t xml:space="preserve"> Argon </w:t>
+            </w:r>
+            <w:proofErr w:type="gramStart"/>
             <w:r>
               <w:rPr>
                 <w:rFonts w:ascii="Roboto Light" w:hAnsi="Roboto Light"/>
                 <w:b w:val="0"/>
                 <w:szCs w:val="22"/>
               </w:rPr>
+              <w:t xml:space="preserve">filled, </w:t>
+            </w:r>
+            <w:r>
+              <w:rPr>
+                <w:rFonts w:ascii="Roboto Light" w:hAnsi="Roboto Light"/>
+                <w:b w:val="0"/>
+                <w:szCs w:val="22"/>
+              </w:rPr>
               <w:t xml:space="preserve"> Clear</w:t>
             </w:r>
+            <w:proofErr w:type="gramEnd"/>
           </w:p>
         </w:tc>
         <w:tc>
@@ -22417,14 +22935,14 @@
       <w:pPr>
         <w:pStyle w:val="Heading2"/>
       </w:pPr>
-      <w:bookmarkStart w:id="122" w:name="Renewble_Appendix"/>
-      <w:bookmarkStart w:id="123" w:name="_Toc231555536"/>
+      <w:bookmarkStart w:id="121" w:name="Renewble_Appendix"/>
+      <w:bookmarkStart w:id="122" w:name="_Toc231555536"/>
       <w:r>
         <w:lastRenderedPageBreak/>
         <w:t>Appendix X – Renewable Energy</w:t>
       </w:r>
+      <w:bookmarkEnd w:id="121"/>
       <w:bookmarkEnd w:id="122"/>
-      <w:bookmarkEnd w:id="123"/>
     </w:p>
     <w:tbl>
       <w:tblPr>
@@ -22521,6 +23039,7 @@
       <w:pPr>
         <w:pStyle w:val="Heading3"/>
       </w:pPr>
+      <w:proofErr w:type="spellStart"/>
       <w:r>
         <w:rPr>
           <w:highlight w:val="yellow"/>
@@ -22537,7 +23056,14 @@
         <w:rPr>
           <w:highlight w:val="yellow"/>
         </w:rPr>
-        <w:t>atts Calculator</w:t>
+        <w:t>atts</w:t>
+      </w:r>
+      <w:proofErr w:type="spellEnd"/>
+      <w:r>
+        <w:rPr>
+          <w:highlight w:val="yellow"/>
+        </w:rPr>
+        <w:t xml:space="preserve"> Calculator</w:t>
       </w:r>
       <w:r>
         <w:br w:type="page"/>
@@ -22547,7 +23073,7 @@
       <w:pPr>
         <w:pStyle w:val="Heading2"/>
       </w:pPr>
-      <w:bookmarkStart w:id="124" w:name="PrelimJ4D6_Appendix"/>
+      <w:bookmarkStart w:id="123" w:name="PrelimJ4D6_Appendix"/>
       <w:r>
         <w:lastRenderedPageBreak/>
         <w:t xml:space="preserve">Appendix X – </w:t>
@@ -22555,7 +23081,7 @@
       <w:r>
         <w:t>Preliminary Part J4D6 Façade Calculator</w:t>
       </w:r>
-      <w:bookmarkEnd w:id="124"/>
+      <w:bookmarkEnd w:id="123"/>
     </w:p>
     <w:p>
       <w:pPr>
@@ -22569,14 +23095,14 @@
       <w:pPr>
         <w:pStyle w:val="Heading2"/>
       </w:pPr>
-      <w:bookmarkStart w:id="125" w:name="Daylight_Appendix"/>
-      <w:bookmarkStart w:id="126" w:name="_Toc231555537"/>
+      <w:bookmarkStart w:id="124" w:name="Daylight_Appendix"/>
+      <w:bookmarkStart w:id="125" w:name="_Toc231555537"/>
       <w:r>
         <w:lastRenderedPageBreak/>
         <w:t>Appendix X – Daylight Modelling</w:t>
       </w:r>
+      <w:bookmarkEnd w:id="124"/>
       <w:bookmarkEnd w:id="125"/>
-      <w:bookmarkEnd w:id="126"/>
     </w:p>
     <w:p>
       <w:pPr>
@@ -25135,7 +25661,7 @@
               <w:spacing w:before="0" w:after="0"/>
               <w:jc w:val="center"/>
             </w:pPr>
-            <w:bookmarkStart w:id="127" w:name="Daylight_modelling_Livingareas"/>
+            <w:bookmarkStart w:id="126" w:name="Daylight_modelling_Livingareas"/>
             <w:r>
               <w:rPr>
                 <w:rFonts w:eastAsia="SimSun" w:cs="Calibri"/>
@@ -25152,7 +25678,7 @@
               </w:rPr>
               <w:t xml:space="preserve"> of Living areas</w:t>
             </w:r>
-            <w:bookmarkEnd w:id="127"/>
+            <w:bookmarkEnd w:id="126"/>
           </w:p>
         </w:tc>
         <w:tc>
@@ -25172,7 +25698,7 @@
               <w:spacing w:before="0" w:after="0"/>
               <w:jc w:val="center"/>
             </w:pPr>
-            <w:bookmarkStart w:id="128" w:name="Daylight_modelling_bedrooms"/>
+            <w:bookmarkStart w:id="127" w:name="Daylight_modelling_bedrooms"/>
             <w:r>
               <w:rPr>
                 <w:rFonts w:eastAsia="SimSun" w:cs="Calibri"/>
@@ -25189,7 +25715,7 @@
               </w:rPr>
               <w:t xml:space="preserve"> of Bedrooms</w:t>
             </w:r>
-            <w:bookmarkEnd w:id="128"/>
+            <w:bookmarkEnd w:id="127"/>
           </w:p>
         </w:tc>
       </w:tr>
@@ -25226,8 +25752,8 @@
       <w:pPr>
         <w:pStyle w:val="Heading2"/>
       </w:pPr>
-      <w:bookmarkStart w:id="129" w:name="NatVent_Appendix"/>
-      <w:bookmarkStart w:id="130" w:name="_Toc231555538"/>
+      <w:bookmarkStart w:id="128" w:name="NatVent_Appendix"/>
+      <w:bookmarkStart w:id="129" w:name="_Toc231555538"/>
       <w:r>
         <w:lastRenderedPageBreak/>
         <w:t>Appendix X –</w:t>
@@ -25238,8 +25764,8 @@
       <w:r>
         <w:t>Natural Ventilation</w:t>
       </w:r>
+      <w:bookmarkEnd w:id="128"/>
       <w:bookmarkEnd w:id="129"/>
-      <w:bookmarkEnd w:id="130"/>
     </w:p>
     <w:tbl>
       <w:tblPr>
@@ -27500,12 +28026,12 @@
       <w:pPr>
         <w:pStyle w:val="Heading2"/>
       </w:pPr>
-      <w:bookmarkStart w:id="131" w:name="_Toc231555539"/>
+      <w:bookmarkStart w:id="130" w:name="_Toc231555539"/>
       <w:r>
         <w:lastRenderedPageBreak/>
         <w:t>Appendix X – BESS Assessment</w:t>
       </w:r>
-      <w:bookmarkEnd w:id="131"/>
+      <w:bookmarkEnd w:id="130"/>
     </w:p>
     <w:p/>
     <w:sectPr>
@@ -33622,6 +34148,8 @@
     <w:rsid w:val="00022123"/>
     <w:rsid w:val="0002364D"/>
     <w:rsid w:val="000237AA"/>
+    <w:rsid w:val="000669B7"/>
+    <w:rsid w:val="000721F3"/>
     <w:rsid w:val="00076F93"/>
     <w:rsid w:val="0008015E"/>
     <w:rsid w:val="00093550"/>
@@ -33653,6 +34181,7 @@
     <w:rsid w:val="00355486"/>
     <w:rsid w:val="00355A99"/>
     <w:rsid w:val="0037731B"/>
+    <w:rsid w:val="003929AC"/>
     <w:rsid w:val="003C40DB"/>
     <w:rsid w:val="003E7BDB"/>
     <w:rsid w:val="003E7D56"/>
@@ -33671,6 +34200,7 @@
     <w:rsid w:val="00547074"/>
     <w:rsid w:val="005533A3"/>
     <w:rsid w:val="00577CC4"/>
+    <w:rsid w:val="005946A7"/>
     <w:rsid w:val="005B679C"/>
     <w:rsid w:val="005B743B"/>
     <w:rsid w:val="005C3A6B"/>
@@ -33706,6 +34236,7 @@
     <w:rsid w:val="00887C5F"/>
     <w:rsid w:val="008A5DF4"/>
     <w:rsid w:val="008C6991"/>
+    <w:rsid w:val="008D618A"/>
     <w:rsid w:val="008E3168"/>
     <w:rsid w:val="008E5806"/>
     <w:rsid w:val="008F56B5"/>
@@ -33714,6 +34245,7 @@
     <w:rsid w:val="0093443B"/>
     <w:rsid w:val="00946496"/>
     <w:rsid w:val="0095765B"/>
+    <w:rsid w:val="009622D5"/>
     <w:rsid w:val="0096582F"/>
     <w:rsid w:val="00975BDB"/>
     <w:rsid w:val="009875D4"/>
@@ -33729,6 +34261,7 @@
     <w:rsid w:val="00A474E6"/>
     <w:rsid w:val="00A70FF1"/>
     <w:rsid w:val="00AC4FCD"/>
+    <w:rsid w:val="00AE5972"/>
     <w:rsid w:val="00AE63FD"/>
     <w:rsid w:val="00AF3821"/>
     <w:rsid w:val="00B27560"/>
@@ -33750,6 +34283,7 @@
     <w:rsid w:val="00C67CAB"/>
     <w:rsid w:val="00C820F1"/>
     <w:rsid w:val="00C862C5"/>
+    <w:rsid w:val="00CA3F89"/>
     <w:rsid w:val="00CA5D56"/>
     <w:rsid w:val="00CC4EEB"/>
     <w:rsid w:val="00CC50E7"/>
@@ -34231,10 +34765,7 @@
     <w:basedOn w:val="DefaultParagraphFont"/>
     <w:uiPriority w:val="99"/>
     <w:semiHidden/>
-    <w:rsid w:val="0093443B"/>
-    <w:rPr>
-      <w:color w:val="808080"/>
-    </w:rPr>
+    <w:rsid w:val="008D618A"/>
   </w:style>
   <w:style w:type="paragraph" w:customStyle="1" w:styleId="71ADB0C41D9DEE44BAF13E2629C6DC2E">
     <w:name w:val="71ADB0C41D9DEE44BAF13E2629C6DC2E"/>
@@ -34459,6 +34990,20 @@
   <w:style w:type="paragraph" w:customStyle="1" w:styleId="9F41AA2BDC594A199CE6F0670E45926C">
     <w:name w:val="9F41AA2BDC594A199CE6F0670E45926C"/>
     <w:rsid w:val="0093443B"/>
+    <w:pPr>
+      <w:spacing w:after="160" w:line="278" w:lineRule="auto"/>
+    </w:pPr>
+    <w:rPr>
+      <w:kern w:val="2"/>
+      <w:sz w:val="24"/>
+      <w:szCs w:val="24"/>
+      <w:lang w:val="en-CA" w:eastAsia="zh-CN"/>
+      <w14:ligatures w14:val="standardContextual"/>
+    </w:rPr>
+  </w:style>
+  <w:style w:type="paragraph" w:customStyle="1" w:styleId="09364AE021A3449DB52A371E5B21A049">
+    <w:name w:val="09364AE021A3449DB52A371E5B21A049"/>
+    <w:rsid w:val="008D618A"/>
     <w:pPr>
       <w:spacing w:after="160" w:line="278" w:lineRule="auto"/>
     </w:pPr>

</xml_diff>

<commit_message>
Add BADS cooling load lookup, GIW-comment cell replacements, and Excel fill improvements
- BADS cooling load: look up NatHERS climate zone by postcode and set dropdown; highlight if postcode not found
- GIW comments: replace third-cell text for Waste 2.1, Waste 2.2, IWM 2.1 (stormwater), IEQ 3.2/3.4 (thermal comfort)
- GDFT: change 6.0 → 6.5 Stars in Thermal Performance Rating – Residential row
- Bicycle spaces: switch to named-tag fills; only delete rows when count is explicitly 0
- Innovation credit ID: abbreviate to 'Inn' in admin table
- Excel fills: add apartment count (D6), clothes drying from OE 3.4 (D33/D34), non-res water reduction (D56)
- Water values: read all three (reference, excl, incl) from IWM 1.1 in both residential and non-residential Excel functions

Co-Authored-By: Claude Sonnet 4.6 <noreply@anthropic.com>
</commit_message>
<xml_diff>
--- a/server/templates/DATE-GIWREF-Address-SMP-MixUse-2022-A.docx
+++ b/server/templates/DATE-GIWREF-Address-SMP-MixUse-2022-A.docx
@@ -1502,7 +1502,6 @@
               </w:rPr>
               <w:br/>
             </w:r>
-            <w:proofErr w:type="spellStart"/>
             <w:r>
               <w:rPr>
                 <w:b/>
@@ -1512,7 +1511,6 @@
               </w:rPr>
               <w:t>Firstname</w:t>
             </w:r>
-            <w:proofErr w:type="spellEnd"/>
             <w:r>
               <w:rPr>
                 <w:b/>
@@ -3740,24 +3738,11 @@
       <w:r>
         <w:t>XX</w:t>
       </w:r>
-      <w:proofErr w:type="gramStart"/>
       <w:r>
         <w:t>]</w:t>
       </w:r>
       <w:r>
-        <w:t xml:space="preserve">  x</w:t>
-      </w:r>
-      <w:proofErr w:type="gramEnd"/>
-      <w:r>
-        <w:t xml:space="preserve"> </w:t>
-      </w:r>
-      <w:proofErr w:type="gramStart"/>
-      <w:r>
-        <w:t>1 bedroom</w:t>
-      </w:r>
-      <w:proofErr w:type="gramEnd"/>
-      <w:r>
-        <w:t xml:space="preserve"> apartments</w:t>
+        <w:t xml:space="preserve">  x 1 bedroom apartments</w:t>
       </w:r>
     </w:p>
     <w:p>
@@ -3779,15 +3764,7 @@
         <w:t>]</w:t>
       </w:r>
       <w:r>
-        <w:t xml:space="preserve"> x </w:t>
-      </w:r>
-      <w:proofErr w:type="gramStart"/>
-      <w:r>
-        <w:t>2 bedroom</w:t>
-      </w:r>
-      <w:proofErr w:type="gramEnd"/>
-      <w:r>
-        <w:t xml:space="preserve"> apartments</w:t>
+        <w:t xml:space="preserve"> x 2 bedroom apartments</w:t>
       </w:r>
     </w:p>
     <w:p>
@@ -3809,15 +3786,7 @@
         <w:t>]</w:t>
       </w:r>
       <w:r>
-        <w:t xml:space="preserve"> x </w:t>
-      </w:r>
-      <w:proofErr w:type="gramStart"/>
-      <w:r>
-        <w:t>3 bedroom</w:t>
-      </w:r>
-      <w:proofErr w:type="gramEnd"/>
-      <w:r>
-        <w:t xml:space="preserve"> apartments</w:t>
+        <w:t xml:space="preserve"> x 3 bedroom apartments</w:t>
       </w:r>
     </w:p>
     <w:p>
@@ -3914,21 +3883,13 @@
         <w:t>[</w:t>
       </w:r>
       <w:r>
-        <w:t xml:space="preserve">distance to </w:t>
-      </w:r>
-      <w:proofErr w:type="gramStart"/>
-      <w:r>
-        <w:t>CBD</w:t>
+        <w:t>distance to CBD</w:t>
       </w:r>
       <w:r>
         <w:t>]</w:t>
       </w:r>
       <w:r>
-        <w:t>km.</w:t>
-      </w:r>
-      <w:proofErr w:type="gramEnd"/>
-      <w:r>
-        <w:t xml:space="preserve"> </w:t>
+        <w:t xml:space="preserve">km. </w:t>
       </w:r>
     </w:p>
     <w:tbl>
@@ -4010,13 +3971,8 @@
       <w:r>
         <w:t xml:space="preserve"> - </w:t>
       </w:r>
-      <w:proofErr w:type="gramStart"/>
       <w:r>
-        <w:t>Pre-existing</w:t>
-      </w:r>
-      <w:proofErr w:type="gramEnd"/>
-      <w:r>
-        <w:t xml:space="preserve"> sites at </w:t>
+        <w:t xml:space="preserve">Pre-existing sites at </w:t>
       </w:r>
       <w:sdt>
         <w:sdtPr>
@@ -5773,9 +5729,8 @@
                 <w:sz w:val="24"/>
                 <w:szCs w:val="24"/>
               </w:rPr>
-              <w:t xml:space="preserve">BESS </w:t>
-            </w:r>
-            <w:proofErr w:type="gramStart"/>
+              <w:t>BESS score</w:t>
+            </w:r>
             <w:r>
               <w:rPr>
                 <w:rFonts w:eastAsia="SimSun"/>
@@ -5785,7 +5740,7 @@
                 <w:sz w:val="24"/>
                 <w:szCs w:val="24"/>
               </w:rPr>
-              <w:t>score</w:t>
+              <w:t>]</w:t>
             </w:r>
             <w:r>
               <w:rPr>
@@ -5796,30 +5751,7 @@
                 <w:sz w:val="24"/>
                 <w:szCs w:val="24"/>
               </w:rPr>
-              <w:t>]</w:t>
-            </w:r>
-            <w:r>
-              <w:rPr>
-                <w:rFonts w:eastAsia="SimSun"/>
-                <w:b/>
-                <w:bCs/>
-                <w:color w:val="00602B"/>
-                <w:sz w:val="24"/>
-                <w:szCs w:val="24"/>
-              </w:rPr>
-              <w:t>%</w:t>
-            </w:r>
-            <w:proofErr w:type="gramEnd"/>
-            <w:r>
-              <w:rPr>
-                <w:rFonts w:eastAsia="SimSun"/>
-                <w:b/>
-                <w:bCs/>
-                <w:color w:val="00602B"/>
-                <w:sz w:val="24"/>
-                <w:szCs w:val="24"/>
-              </w:rPr>
-              <w:t xml:space="preserve"> with no mandatory category (IEQ, Operational Energy, IWM) below 50%.</w:t>
+              <w:t>% with no mandatory category (IEQ, Operational Energy, IWM) below 50%.</w:t>
             </w:r>
           </w:p>
         </w:tc>
@@ -6204,7 +6136,7 @@
                 <w:color w:val="000000"/>
               </w:rPr>
               <w:drawing>
-                <wp:anchor distT="0" distB="0" distL="114300" distR="114300" simplePos="0" relativeHeight="251738112" behindDoc="1" locked="0" layoutInCell="1" allowOverlap="1" wp14:anchorId="22787630" wp14:editId="2EAA17F3">
+                <wp:anchor distT="0" distB="0" distL="114300" distR="114300" simplePos="0" relativeHeight="251738112" behindDoc="1" locked="0" layoutInCell="1" allowOverlap="1" wp14:anchorId="22787630" wp14:editId="476CD378">
                   <wp:simplePos x="0" y="0"/>
                   <wp:positionH relativeFrom="column">
                     <wp:posOffset>77470</wp:posOffset>
@@ -6330,23 +6262,13 @@
             <w:r>
               <w:fldChar w:fldCharType="end"/>
             </w:r>
-            <w:proofErr w:type="spellStart"/>
             <w:r>
               <w:rPr>
                 <w:rFonts w:eastAsiaTheme="minorEastAsia"/>
                 <w:szCs w:val="22"/>
                 <w:lang w:eastAsia="en-US"/>
               </w:rPr>
-              <w:t>NatHERS</w:t>
-            </w:r>
-            <w:proofErr w:type="spellEnd"/>
-            <w:r>
-              <w:rPr>
-                <w:rFonts w:eastAsiaTheme="minorEastAsia"/>
-                <w:szCs w:val="22"/>
-                <w:lang w:eastAsia="en-US"/>
-              </w:rPr>
-              <w:t xml:space="preserve"> Energy Rating.</w:t>
+              <w:t>NatHERS Energy Rating.</w:t>
             </w:r>
           </w:p>
         </w:tc>
@@ -6677,7 +6599,7 @@
                 <w:color w:val="000000"/>
               </w:rPr>
               <w:drawing>
-                <wp:anchor distT="0" distB="0" distL="114300" distR="114300" simplePos="0" relativeHeight="251739136" behindDoc="1" locked="0" layoutInCell="1" allowOverlap="1" wp14:anchorId="7055ECC5" wp14:editId="033BF81D">
+                <wp:anchor distT="0" distB="0" distL="114300" distR="114300" simplePos="0" relativeHeight="251739136" behindDoc="1" locked="0" layoutInCell="1" allowOverlap="1" wp14:anchorId="7055ECC5" wp14:editId="29C6B725">
                   <wp:simplePos x="0" y="0"/>
                   <wp:positionH relativeFrom="column">
                     <wp:posOffset>76200</wp:posOffset>
@@ -6759,23 +6681,13 @@
                 <w:lang w:eastAsia="en-US"/>
               </w:rPr>
             </w:pPr>
-            <w:proofErr w:type="gramStart"/>
             <w:r>
               <w:rPr>
                 <w:rFonts w:eastAsiaTheme="minorEastAsia"/>
                 <w:szCs w:val="22"/>
                 <w:lang w:eastAsia="en-US"/>
               </w:rPr>
-              <w:t>The majority of</w:t>
-            </w:r>
-            <w:proofErr w:type="gramEnd"/>
-            <w:r>
-              <w:rPr>
-                <w:rFonts w:eastAsiaTheme="minorEastAsia"/>
-                <w:szCs w:val="22"/>
-                <w:lang w:eastAsia="en-US"/>
-              </w:rPr>
-              <w:t xml:space="preserve"> the development meets BESS IEQ requirements.</w:t>
+              <w:t>The majority of the development meets BESS IEQ requirements.</w:t>
             </w:r>
           </w:p>
         </w:tc>
@@ -7688,7 +7600,7 @@
                 <w:color w:val="000000"/>
               </w:rPr>
               <w:drawing>
-                <wp:anchor distT="0" distB="0" distL="114300" distR="114300" simplePos="0" relativeHeight="251741184" behindDoc="1" locked="0" layoutInCell="1" allowOverlap="1" wp14:anchorId="63206793" wp14:editId="3759987E">
+                <wp:anchor distT="0" distB="0" distL="114300" distR="114300" simplePos="0" relativeHeight="251741184" behindDoc="1" locked="0" layoutInCell="1" allowOverlap="1" wp14:anchorId="63206793" wp14:editId="5352C7C5">
                   <wp:simplePos x="0" y="0"/>
                   <wp:positionH relativeFrom="column">
                     <wp:posOffset>91440</wp:posOffset>
@@ -8656,15 +8568,7 @@
               <w:jc w:val="both"/>
             </w:pPr>
             <w:r>
-              <w:t xml:space="preserve">Electricity and </w:t>
-            </w:r>
-            <w:proofErr w:type="gramStart"/>
-            <w:r>
-              <w:t>cold water</w:t>
-            </w:r>
-            <w:proofErr w:type="gramEnd"/>
-            <w:r>
-              <w:t xml:space="preserve"> metering is to be provided to each individual apartment and commercial tenancy. </w:t>
+              <w:t xml:space="preserve">Electricity and cold water metering is to be provided to each individual apartment and commercial tenancy. </w:t>
             </w:r>
           </w:p>
           <w:p>
@@ -9132,30 +9036,14 @@
                 <w:color w:val="auto"/>
                 <w:szCs w:val="22"/>
               </w:rPr>
-              <w:t xml:space="preserve">[Blue Factor </w:t>
-            </w:r>
-            <w:proofErr w:type="gramStart"/>
+              <w:t>[Blue Factor score]</w:t>
+            </w:r>
             <w:r>
               <w:rPr>
                 <w:color w:val="auto"/>
                 <w:szCs w:val="22"/>
               </w:rPr>
-              <w:t>score]</w:t>
-            </w:r>
-            <w:r>
-              <w:rPr>
-                <w:color w:val="auto"/>
-                <w:szCs w:val="22"/>
-              </w:rPr>
-              <w:t>%</w:t>
-            </w:r>
-            <w:proofErr w:type="gramEnd"/>
-            <w:r>
-              <w:rPr>
-                <w:color w:val="auto"/>
-                <w:szCs w:val="22"/>
-              </w:rPr>
-              <w:t xml:space="preserve"> is achieved</w:t>
+              <w:t>% is achieved</w:t>
             </w:r>
             <w:bookmarkEnd w:id="65"/>
             <w:r>
@@ -9216,21 +9104,7 @@
               <w:rPr>
                 <w:szCs w:val="22"/>
               </w:rPr>
-              <w:t xml:space="preserve"> litre rainwater tank. XX </w:t>
-            </w:r>
-            <w:proofErr w:type="gramStart"/>
-            <w:r>
-              <w:rPr>
-                <w:szCs w:val="22"/>
-              </w:rPr>
-              <w:t>WC’s</w:t>
-            </w:r>
-            <w:proofErr w:type="gramEnd"/>
-            <w:r>
-              <w:rPr>
-                <w:szCs w:val="22"/>
-              </w:rPr>
-              <w:t xml:space="preserve"> are to be connected to the rainwater tank.</w:t>
+              <w:t xml:space="preserve"> litre rainwater tank. XX WC’s are to be connected to the rainwater tank.</w:t>
             </w:r>
           </w:p>
           <w:p>
@@ -9246,27 +9120,13 @@
               <w:rPr>
                 <w:szCs w:val="22"/>
               </w:rPr>
-              <w:t xml:space="preserve">Rainwater is to be collected from XX and directed into a </w:t>
-            </w:r>
-            <w:proofErr w:type="gramStart"/>
-            <w:r>
-              <w:rPr>
-                <w:szCs w:val="22"/>
-              </w:rPr>
-              <w:t>≥</w:t>
-            </w:r>
-            <w:r>
-              <w:rPr>
-                <w:szCs w:val="22"/>
-              </w:rPr>
-              <w:t>[</w:t>
-            </w:r>
-            <w:proofErr w:type="gramEnd"/>
-            <w:r>
-              <w:rPr>
-                <w:szCs w:val="22"/>
-              </w:rPr>
-              <w:t>raingarden size]</w:t>
+              <w:t>Rainwater is to be collected from XX and directed into a ≥</w:t>
+            </w:r>
+            <w:r>
+              <w:rPr>
+                <w:szCs w:val="22"/>
+              </w:rPr>
+              <w:t>[raingarden size]</w:t>
             </w:r>
             <w:r>
               <w:rPr>
@@ -9375,39 +9235,7 @@
                 <w:color w:val="auto"/>
                 <w:szCs w:val="22"/>
               </w:rPr>
-              <w:t xml:space="preserve">To reduce total potable </w:t>
-            </w:r>
-            <w:proofErr w:type="gramStart"/>
-            <w:r>
-              <w:rPr>
-                <w:color w:val="auto"/>
-                <w:szCs w:val="22"/>
-              </w:rPr>
-              <w:t>water</w:t>
-            </w:r>
-            <w:proofErr w:type="gramEnd"/>
-            <w:r>
-              <w:rPr>
-                <w:color w:val="auto"/>
-                <w:szCs w:val="22"/>
-              </w:rPr>
-              <w:t xml:space="preserve"> use due </w:t>
-            </w:r>
-            <w:proofErr w:type="gramStart"/>
-            <w:r>
-              <w:rPr>
-                <w:color w:val="auto"/>
-                <w:szCs w:val="22"/>
-              </w:rPr>
-              <w:t>through the use of</w:t>
-            </w:r>
-            <w:proofErr w:type="gramEnd"/>
-            <w:r>
-              <w:rPr>
-                <w:color w:val="auto"/>
-                <w:szCs w:val="22"/>
-              </w:rPr>
-              <w:t xml:space="preserve"> efficient fixtures, appliances, and the use of rainwater.</w:t>
+              <w:t>To reduce total potable water use due through the use of efficient fixtures, appliances, and the use of rainwater.</w:t>
             </w:r>
           </w:p>
         </w:tc>
@@ -10365,21 +10193,7 @@
               <w:rPr>
                 <w:szCs w:val="22"/>
               </w:rPr>
-              <w:t xml:space="preserve"> (e.g. hydrant pump test water or SCV </w:t>
-            </w:r>
-            <w:proofErr w:type="spellStart"/>
-            <w:r>
-              <w:rPr>
-                <w:szCs w:val="22"/>
-              </w:rPr>
-              <w:t>annubar</w:t>
-            </w:r>
-            <w:proofErr w:type="spellEnd"/>
-            <w:r>
-              <w:rPr>
-                <w:szCs w:val="22"/>
-              </w:rPr>
-              <w:t xml:space="preserve"> test)</w:t>
+              <w:t xml:space="preserve"> (e.g. hydrant pump test water or SCV annubar test)</w:t>
             </w:r>
             <w:r>
               <w:rPr>
@@ -10708,21 +10522,7 @@
               <w:rPr>
                 <w:szCs w:val="22"/>
               </w:rPr>
-              <w:t xml:space="preserve">The National Construction Code (NCC) Class 2 – Sole Occupancy Unit(s) residential building component is to be designed in accordance with NCC Section J (2022) </w:t>
-            </w:r>
-            <w:proofErr w:type="spellStart"/>
-            <w:r>
-              <w:rPr>
-                <w:szCs w:val="22"/>
-              </w:rPr>
-              <w:t>NatHERS</w:t>
-            </w:r>
-            <w:proofErr w:type="spellEnd"/>
-            <w:r>
-              <w:rPr>
-                <w:szCs w:val="22"/>
-              </w:rPr>
-              <w:t xml:space="preserve"> requirements. The residential units must achieve an average </w:t>
+              <w:t xml:space="preserve">The National Construction Code (NCC) Class 2 – Sole Occupancy Unit(s) residential building component is to be designed in accordance with NCC Section J (2022) NatHERS requirements. The residential units must achieve an average </w:t>
             </w:r>
             <w:bookmarkStart w:id="71" w:name="FR_target"/>
             <w:r>
@@ -11040,13 +10840,20 @@
                 <w:bCs/>
                 <w:szCs w:val="22"/>
               </w:rPr>
-              <w:t>DTS improvement</w:t>
+              <w:t>improvement</w:t>
             </w:r>
             <w:r>
               <w:rPr>
                 <w:bCs/>
                 <w:szCs w:val="22"/>
               </w:rPr>
+              <w:t>%</w:t>
+            </w:r>
+            <w:r>
+              <w:rPr>
+                <w:bCs/>
+                <w:szCs w:val="22"/>
+              </w:rPr>
               <w:t>]</w:t>
             </w:r>
             <w:r>
@@ -11081,7 +10888,6 @@
               <w:jc w:val="both"/>
               <w:rPr>
                 <w:bCs/>
-                <w:szCs w:val="22"/>
               </w:rPr>
             </w:pPr>
             <w:r>
@@ -11135,6 +10941,106 @@
                 <w:bCs/>
               </w:rPr>
               <w:fldChar w:fldCharType="end"/>
+            </w:r>
+          </w:p>
+          <w:p>
+            <w:pPr>
+              <w:spacing w:before="0" w:after="0"/>
+              <w:jc w:val="both"/>
+              <w:rPr>
+                <w:bCs/>
+              </w:rPr>
+            </w:pPr>
+          </w:p>
+          <w:p>
+            <w:pPr>
+              <w:spacing w:before="120" w:after="120"/>
+              <w:rPr>
+                <w:bCs/>
+                <w:szCs w:val="22"/>
+              </w:rPr>
+            </w:pPr>
+            <w:bookmarkStart w:id="73" w:name="Thermal_Envelope"/>
+            <w:r>
+              <w:rPr>
+                <w:bCs/>
+                <w:szCs w:val="22"/>
+              </w:rPr>
+              <w:t>A</w:t>
+            </w:r>
+            <w:r>
+              <w:rPr>
+                <w:bCs/>
+                <w:szCs w:val="22"/>
+              </w:rPr>
+              <w:t xml:space="preserve">ll exposed floors and ceilings (forming part of the envelope) </w:t>
+            </w:r>
+            <w:r>
+              <w:rPr>
+                <w:bCs/>
+                <w:szCs w:val="22"/>
+              </w:rPr>
+              <w:t xml:space="preserve">to </w:t>
+            </w:r>
+            <w:r>
+              <w:rPr>
+                <w:bCs/>
+                <w:szCs w:val="22"/>
+              </w:rPr>
+              <w:t>demonstrate a minimum 10% improvement in required NCC2022 insulation levels</w:t>
+            </w:r>
+            <w:r>
+              <w:rPr>
+                <w:bCs/>
+                <w:szCs w:val="22"/>
+              </w:rPr>
+              <w:t>.</w:t>
+            </w:r>
+          </w:p>
+          <w:bookmarkEnd w:id="73"/>
+          <w:p>
+            <w:pPr>
+              <w:spacing w:before="0" w:after="0"/>
+              <w:jc w:val="both"/>
+              <w:rPr>
+                <w:bCs/>
+                <w:szCs w:val="22"/>
+              </w:rPr>
+            </w:pPr>
+            <w:r>
+              <w:rPr>
+                <w:bCs/>
+                <w:szCs w:val="22"/>
+              </w:rPr>
+              <w:t>A</w:t>
+            </w:r>
+            <w:r>
+              <w:rPr>
+                <w:bCs/>
+                <w:szCs w:val="22"/>
+              </w:rPr>
+              <w:t xml:space="preserve">ll wall and glazing </w:t>
+            </w:r>
+            <w:r>
+              <w:rPr>
+                <w:bCs/>
+                <w:szCs w:val="22"/>
+              </w:rPr>
+              <w:t xml:space="preserve">are to </w:t>
+            </w:r>
+            <w:r>
+              <w:rPr>
+                <w:bCs/>
+                <w:szCs w:val="22"/>
+              </w:rPr>
+              <w:t>meet the required NCC2022 facade calculator (or better than the total allowance)</w:t>
+            </w:r>
+            <w:r>
+              <w:rPr>
+                <w:bCs/>
+                <w:szCs w:val="22"/>
+              </w:rPr>
+              <w:t>. Refer Appendix X – Preliminary J4D6 BCA 2022 Façade Calculator</w:t>
             </w:r>
           </w:p>
         </w:tc>
@@ -11434,14 +11340,14 @@
                 <w:szCs w:val="22"/>
               </w:rPr>
             </w:pPr>
-            <w:bookmarkStart w:id="73" w:name="Hot_Water"/>
+            <w:bookmarkStart w:id="74" w:name="Hot_Water"/>
             <w:r>
               <w:rPr>
                 <w:szCs w:val="22"/>
               </w:rPr>
               <w:t xml:space="preserve">The development is to utilise </w:t>
             </w:r>
-            <w:bookmarkEnd w:id="73"/>
+            <w:bookmarkEnd w:id="74"/>
             <w:r>
               <w:rPr>
                 <w:szCs w:val="22"/>
@@ -11879,14 +11785,14 @@
                 <w:szCs w:val="22"/>
               </w:rPr>
             </w:pPr>
-            <w:bookmarkStart w:id="74" w:name="Motion_detectors"/>
+            <w:bookmarkStart w:id="75" w:name="Motion_detectors"/>
             <w:r>
               <w:rPr>
                 <w:szCs w:val="22"/>
               </w:rPr>
               <w:t xml:space="preserve">All common area, external and carpark lighting is to be controlled with daylight, motion sensors or timers (whichever is deemed appropriate). </w:t>
             </w:r>
-            <w:bookmarkEnd w:id="74"/>
+            <w:bookmarkEnd w:id="75"/>
           </w:p>
         </w:tc>
       </w:tr>
@@ -12128,7 +12034,7 @@
                 <w:szCs w:val="22"/>
               </w:rPr>
             </w:pPr>
-            <w:bookmarkStart w:id="75" w:name="PV"/>
+            <w:bookmarkStart w:id="76" w:name="PV"/>
             <w:r>
               <w:rPr>
                 <w:color w:val="auto"/>
@@ -12164,7 +12070,7 @@
               </w:rPr>
               <w:t xml:space="preserve"> Solar PV system is to be located on the roof</w:t>
             </w:r>
-            <w:bookmarkEnd w:id="75"/>
+            <w:bookmarkEnd w:id="76"/>
             <w:r>
               <w:rPr>
                 <w:color w:val="auto"/>
@@ -12184,37 +12090,21 @@
                 <w:color w:val="auto"/>
                 <w:szCs w:val="22"/>
               </w:rPr>
-              <w:t xml:space="preserve">Solar PV </w:t>
-            </w:r>
-            <w:proofErr w:type="gramStart"/>
+              <w:t>Solar PV output</w:t>
+            </w:r>
             <w:r>
               <w:rPr>
                 <w:color w:val="auto"/>
                 <w:szCs w:val="22"/>
               </w:rPr>
-              <w:t>output</w:t>
+              <w:t>]</w:t>
             </w:r>
             <w:r>
               <w:rPr>
                 <w:color w:val="auto"/>
                 <w:szCs w:val="22"/>
               </w:rPr>
-              <w:t>]</w:t>
-            </w:r>
-            <w:r>
-              <w:rPr>
-                <w:color w:val="auto"/>
-                <w:szCs w:val="22"/>
-              </w:rPr>
-              <w:t>kWh</w:t>
-            </w:r>
-            <w:proofErr w:type="gramEnd"/>
-            <w:r>
-              <w:rPr>
-                <w:color w:val="auto"/>
-                <w:szCs w:val="22"/>
-              </w:rPr>
-              <w:t xml:space="preserve"> and will be </w:t>
+              <w:t xml:space="preserve">kWh and will be </w:t>
             </w:r>
             <w:r>
               <w:rPr>
@@ -12293,7 +12183,7 @@
       </w:tr>
     </w:tbl>
     <w:p>
-      <w:bookmarkStart w:id="76" w:name="_Toc46738707"/>
+      <w:bookmarkStart w:id="77" w:name="_Toc46738707"/>
     </w:p>
     <w:p>
       <w:pPr>
@@ -12307,17 +12197,17 @@
       <w:pPr>
         <w:pStyle w:val="Heading2"/>
       </w:pPr>
-      <w:bookmarkStart w:id="77" w:name="_Toc46738708"/>
-      <w:bookmarkStart w:id="78" w:name="_Toc231555528"/>
-      <w:bookmarkEnd w:id="76"/>
+      <w:bookmarkStart w:id="78" w:name="_Toc46738708"/>
+      <w:bookmarkStart w:id="79" w:name="_Toc231555528"/>
+      <w:bookmarkEnd w:id="77"/>
       <w:r>
         <w:lastRenderedPageBreak/>
         <w:t>Indoor Environment Quality</w:t>
       </w:r>
       <w:bookmarkEnd w:id="61"/>
       <w:bookmarkEnd w:id="62"/>
-      <w:bookmarkEnd w:id="77"/>
       <w:bookmarkEnd w:id="78"/>
+      <w:bookmarkEnd w:id="79"/>
     </w:p>
     <w:p>
       <w:pPr>
@@ -12398,7 +12288,7 @@
                 <w:szCs w:val="22"/>
               </w:rPr>
             </w:pPr>
-            <w:bookmarkStart w:id="79" w:name="_Toc461726280"/>
+            <w:bookmarkStart w:id="80" w:name="_Toc461726280"/>
             <w:r>
               <w:rPr>
                 <w:rFonts w:ascii="Roboto" w:hAnsi="Roboto"/>
@@ -12546,7 +12436,7 @@
                 <w:szCs w:val="22"/>
               </w:rPr>
             </w:pPr>
-            <w:bookmarkStart w:id="80" w:name="Daylight_modelling"/>
+            <w:bookmarkStart w:id="81" w:name="Daylight_modelling"/>
             <w:r>
               <w:rPr>
                 <w:szCs w:val="22"/>
@@ -12560,7 +12450,7 @@
               </w:rPr>
               <w:t xml:space="preserve"> </w:t>
             </w:r>
-            <w:bookmarkEnd w:id="80"/>
+            <w:bookmarkEnd w:id="81"/>
             <w:r>
               <w:rPr>
                 <w:szCs w:val="22"/>
@@ -12696,15 +12586,7 @@
                       <w:rFonts w:eastAsia="SimSun" w:cs="Calibri"/>
                       <w:color w:val="000000"/>
                     </w:rPr>
-                    <w:t xml:space="preserve">daylight </w:t>
-                  </w:r>
-                  <w:proofErr w:type="gramStart"/>
-                  <w:r>
-                    <w:rPr>
-                      <w:rFonts w:eastAsia="SimSun" w:cs="Calibri"/>
-                      <w:color w:val="000000"/>
-                    </w:rPr>
-                    <w:t>living</w:t>
+                    <w:t>daylight living</w:t>
                   </w:r>
                   <w:r>
                     <w:rPr>
@@ -12720,7 +12602,6 @@
                     </w:rPr>
                     <w:t>%</w:t>
                   </w:r>
-                  <w:proofErr w:type="gramEnd"/>
                   <w:r>
                     <w:rPr>
                       <w:rFonts w:eastAsia="SimSun" w:cs="Calibri"/>
@@ -12800,15 +12681,7 @@
                       <w:rFonts w:eastAsia="SimSun" w:cs="Calibri"/>
                       <w:color w:val="000000"/>
                     </w:rPr>
-                    <w:t xml:space="preserve">daylight </w:t>
-                  </w:r>
-                  <w:proofErr w:type="gramStart"/>
-                  <w:r>
-                    <w:rPr>
-                      <w:rFonts w:eastAsia="SimSun" w:cs="Calibri"/>
-                      <w:color w:val="000000"/>
-                    </w:rPr>
-                    <w:t>bedrooms</w:t>
+                    <w:t>daylight bedrooms</w:t>
                   </w:r>
                   <w:r>
                     <w:rPr>
@@ -12824,7 +12697,6 @@
                     </w:rPr>
                     <w:t>%</w:t>
                   </w:r>
-                  <w:proofErr w:type="gramEnd"/>
                   <w:r>
                     <w:rPr>
                       <w:rFonts w:eastAsia="SimSun" w:cs="Calibri"/>
@@ -12936,22 +12808,14 @@
               </w:rPr>
               <w:t xml:space="preserve"> </w:t>
             </w:r>
-            <w:bookmarkStart w:id="81" w:name="DTS"/>
-            <w:proofErr w:type="gramStart"/>
-            <w:r>
-              <w:rPr>
-                <w:szCs w:val="22"/>
-              </w:rPr>
-              <w:t>The majority of</w:t>
-            </w:r>
-            <w:proofErr w:type="gramEnd"/>
-            <w:r>
-              <w:rPr>
-                <w:szCs w:val="22"/>
-              </w:rPr>
-              <w:t xml:space="preserve"> the development complies with the Deemed-to-Satisfy method for IEQ prescribed by BESS.</w:t>
-            </w:r>
-            <w:bookmarkEnd w:id="81"/>
+            <w:bookmarkStart w:id="82" w:name="DTS"/>
+            <w:r>
+              <w:rPr>
+                <w:szCs w:val="22"/>
+              </w:rPr>
+              <w:t>The majority of the development complies with the Deemed-to-Satisfy method for IEQ prescribed by BESS.</w:t>
+            </w:r>
+            <w:bookmarkEnd w:id="82"/>
             <w:r>
               <w:rPr>
                 <w:szCs w:val="22"/>
@@ -13109,7 +12973,7 @@
                 <w:szCs w:val="22"/>
               </w:rPr>
             </w:pPr>
-            <w:bookmarkStart w:id="82" w:name="Sunlight"/>
+            <w:bookmarkStart w:id="83" w:name="Sunlight"/>
             <w:r>
               <w:rPr>
                 <w:szCs w:val="22"/>
@@ -13140,7 +13004,7 @@
               </w:rPr>
               <w:t xml:space="preserve"> of apartments achieve at least 3 hours of sunlight.</w:t>
             </w:r>
-            <w:bookmarkEnd w:id="82"/>
+            <w:bookmarkEnd w:id="83"/>
           </w:p>
         </w:tc>
       </w:tr>
@@ -13235,7 +13099,7 @@
                 <w:szCs w:val="22"/>
               </w:rPr>
             </w:pPr>
-            <w:bookmarkStart w:id="83" w:name="Daylight_NonRes"/>
+            <w:bookmarkStart w:id="84" w:name="Daylight_NonRes"/>
             <w:r>
               <w:rPr>
                 <w:szCs w:val="22"/>
@@ -13252,17 +13116,8 @@
               <w:rPr>
                 <w:szCs w:val="22"/>
               </w:rPr>
-              <w:t>daylight non-</w:t>
-            </w:r>
-            <w:proofErr w:type="spellStart"/>
-            <w:proofErr w:type="gramStart"/>
-            <w:r>
-              <w:rPr>
-                <w:szCs w:val="22"/>
-              </w:rPr>
-              <w:t>resi</w:t>
-            </w:r>
-            <w:proofErr w:type="spellEnd"/>
+              <w:t>daylight non-resi</w:t>
+            </w:r>
             <w:r>
               <w:rPr>
                 <w:szCs w:val="22"/>
@@ -13273,16 +13128,9 @@
               <w:rPr>
                 <w:szCs w:val="22"/>
               </w:rPr>
-              <w:t>%</w:t>
-            </w:r>
-            <w:proofErr w:type="gramEnd"/>
-            <w:r>
-              <w:rPr>
-                <w:szCs w:val="22"/>
-              </w:rPr>
-              <w:t xml:space="preserve"> of the nominated area.</w:t>
-            </w:r>
-            <w:bookmarkEnd w:id="83"/>
+              <w:t>% of the nominated area.</w:t>
+            </w:r>
+            <w:bookmarkEnd w:id="84"/>
           </w:p>
         </w:tc>
       </w:tr>
@@ -13448,8 +13296,8 @@
                 <w:szCs w:val="22"/>
               </w:rPr>
             </w:pPr>
-            <w:bookmarkStart w:id="84" w:name="Nat_Vent"/>
-            <w:bookmarkStart w:id="85" w:name="Lighting"/>
+            <w:bookmarkStart w:id="85" w:name="Nat_Vent"/>
+            <w:bookmarkStart w:id="86" w:name="Lighting"/>
             <w:r>
               <w:rPr>
                 <w:szCs w:val="22"/>
@@ -13468,7 +13316,7 @@
               </w:rPr>
               <w:t xml:space="preserve">% </w:t>
             </w:r>
-            <w:bookmarkEnd w:id="84"/>
+            <w:bookmarkEnd w:id="85"/>
             <w:r>
               <w:rPr>
                 <w:szCs w:val="22"/>
@@ -13487,7 +13335,7 @@
               </w:rPr>
               <w:t xml:space="preserve"> of the development’s apartments are naturally cross-ventilated. Apartments are provided with windows on opposite or adjacent facades or are effective single sided ventilated.</w:t>
             </w:r>
-            <w:bookmarkEnd w:id="85"/>
+            <w:bookmarkEnd w:id="86"/>
           </w:p>
           <w:p>
             <w:pPr>
@@ -13507,21 +13355,12 @@
                 <w:lang w:val="fr-FR"/>
               </w:rPr>
             </w:pPr>
-            <w:proofErr w:type="spellStart"/>
             <w:r>
               <w:rPr>
                 <w:szCs w:val="22"/>
                 <w:lang w:val="fr-FR"/>
               </w:rPr>
-              <w:t>Refer</w:t>
-            </w:r>
-            <w:proofErr w:type="spellEnd"/>
-            <w:r>
-              <w:rPr>
-                <w:szCs w:val="22"/>
-                <w:lang w:val="fr-FR"/>
-              </w:rPr>
-              <w:t xml:space="preserve"> </w:t>
+              <w:t xml:space="preserve">Refer </w:t>
             </w:r>
             <w:r>
               <w:fldChar w:fldCharType="begin"/>
@@ -13575,18 +13414,8 @@
                 <w:color w:val="00602B" w:themeColor="text2"/>
                 <w:szCs w:val="22"/>
               </w:rPr>
-              <w:t xml:space="preserve">Ventilation – </w:t>
-            </w:r>
-            <w:proofErr w:type="gramStart"/>
-            <w:r>
-              <w:rPr>
-                <w:rFonts w:ascii="Roboto" w:hAnsi="Roboto"/>
-                <w:color w:val="00602B" w:themeColor="text2"/>
-                <w:szCs w:val="22"/>
-              </w:rPr>
-              <w:t>Non-Residential</w:t>
-            </w:r>
-            <w:proofErr w:type="gramEnd"/>
+              <w:t>Ventilation – Non-Residential</w:t>
+            </w:r>
           </w:p>
         </w:tc>
         <w:tc>
@@ -13629,13 +13458,8 @@
               <w:t>[</w:t>
             </w:r>
             <w:r>
-              <w:t>ventilation non-</w:t>
-            </w:r>
-            <w:proofErr w:type="spellStart"/>
-            <w:r>
-              <w:t>resi</w:t>
-            </w:r>
-            <w:proofErr w:type="spellEnd"/>
+              <w:t>ventilation non-resi</w:t>
+            </w:r>
             <w:r>
               <w:t>]</w:t>
             </w:r>
@@ -13724,14 +13548,14 @@
                 <w:szCs w:val="22"/>
               </w:rPr>
             </w:pPr>
-            <w:bookmarkStart w:id="86" w:name="Shading"/>
+            <w:bookmarkStart w:id="87" w:name="Shading"/>
             <w:r>
               <w:rPr>
                 <w:szCs w:val="22"/>
               </w:rPr>
               <w:t>The development is provided with a comprehensive shading strategy</w:t>
             </w:r>
-            <w:bookmarkEnd w:id="86"/>
+            <w:bookmarkEnd w:id="87"/>
             <w:r>
               <w:rPr>
                 <w:szCs w:val="22"/>
@@ -13844,21 +13668,7 @@
               <w:rPr>
                 <w:szCs w:val="22"/>
               </w:rPr>
-              <w:t>[Shading non-</w:t>
-            </w:r>
-            <w:proofErr w:type="spellStart"/>
-            <w:r>
-              <w:rPr>
-                <w:szCs w:val="22"/>
-              </w:rPr>
-              <w:t>resi</w:t>
-            </w:r>
-            <w:proofErr w:type="spellEnd"/>
-            <w:r>
-              <w:rPr>
-                <w:szCs w:val="22"/>
-              </w:rPr>
-              <w:t>]</w:t>
+              <w:t>[Shading non-resi]</w:t>
             </w:r>
           </w:p>
         </w:tc>
@@ -14148,19 +13958,19 @@
       <w:pPr>
         <w:pStyle w:val="Heading2"/>
       </w:pPr>
-      <w:bookmarkStart w:id="87" w:name="_Toc461726283"/>
-      <w:bookmarkStart w:id="88" w:name="_Toc462823801"/>
-      <w:bookmarkStart w:id="89" w:name="_Toc46738709"/>
-      <w:bookmarkStart w:id="90" w:name="_Toc231555529"/>
-      <w:bookmarkEnd w:id="79"/>
+      <w:bookmarkStart w:id="88" w:name="_Toc461726283"/>
+      <w:bookmarkStart w:id="89" w:name="_Toc462823801"/>
+      <w:bookmarkStart w:id="90" w:name="_Toc46738709"/>
+      <w:bookmarkStart w:id="91" w:name="_Toc231555529"/>
+      <w:bookmarkEnd w:id="80"/>
       <w:r>
         <w:lastRenderedPageBreak/>
         <w:t>Transport</w:t>
       </w:r>
-      <w:bookmarkEnd w:id="87"/>
       <w:bookmarkEnd w:id="88"/>
       <w:bookmarkEnd w:id="89"/>
       <w:bookmarkEnd w:id="90"/>
+      <w:bookmarkEnd w:id="91"/>
     </w:p>
     <w:p>
       <w:pPr>
@@ -14399,7 +14209,7 @@
               </w:rPr>
               <w:t xml:space="preserve"> </w:t>
             </w:r>
-            <w:bookmarkStart w:id="91" w:name="Bicycles"/>
+            <w:bookmarkStart w:id="92" w:name="Bicycles"/>
             <w:r>
               <w:rPr>
                 <w:szCs w:val="22"/>
@@ -14424,7 +14234,7 @@
               </w:rPr>
               <w:t xml:space="preserve"> bicycle spaces are to be provided for residents.</w:t>
             </w:r>
-            <w:bookmarkEnd w:id="91"/>
+            <w:bookmarkEnd w:id="92"/>
             <w:r>
               <w:rPr>
                 <w:szCs w:val="22"/>
@@ -14453,7 +14263,7 @@
               </w:rPr>
               <w:t xml:space="preserve"> </w:t>
             </w:r>
-            <w:bookmarkStart w:id="92" w:name="OLE_LINK9"/>
+            <w:bookmarkStart w:id="93" w:name="OLE_LINK9"/>
             <w:r>
               <w:rPr>
                 <w:szCs w:val="22"/>
@@ -14478,26 +14288,12 @@
               </w:rPr>
               <w:t xml:space="preserve"> bicycle spaces are to be provided for residential visitors.</w:t>
             </w:r>
-            <w:bookmarkEnd w:id="92"/>
-            <w:r>
-              <w:rPr>
-                <w:szCs w:val="22"/>
-              </w:rPr>
-              <w:t xml:space="preserve"> This will provide a ratio of approximately 1 visitor bicycle space for every X </w:t>
-            </w:r>
-            <w:proofErr w:type="gramStart"/>
-            <w:r>
-              <w:rPr>
-                <w:szCs w:val="22"/>
-              </w:rPr>
-              <w:t>apartments</w:t>
-            </w:r>
-            <w:proofErr w:type="gramEnd"/>
-            <w:r>
-              <w:rPr>
-                <w:szCs w:val="22"/>
-              </w:rPr>
-              <w:t>.</w:t>
+            <w:bookmarkEnd w:id="93"/>
+            <w:r>
+              <w:rPr>
+                <w:szCs w:val="22"/>
+              </w:rPr>
+              <w:t xml:space="preserve"> This will provide a ratio of approximately 1 visitor bicycle space for every X apartments.</w:t>
             </w:r>
           </w:p>
         </w:tc>
@@ -14585,7 +14381,7 @@
               </w:rPr>
               <w:t xml:space="preserve"> </w:t>
             </w:r>
-            <w:bookmarkStart w:id="93" w:name="Employee_Bike"/>
+            <w:bookmarkStart w:id="94" w:name="Employee_Bike"/>
             <w:r>
               <w:rPr>
                 <w:szCs w:val="22"/>
@@ -14610,7 +14406,7 @@
               </w:rPr>
               <w:t xml:space="preserve"> bicycle spaces are to be provided for employees</w:t>
             </w:r>
-            <w:bookmarkEnd w:id="93"/>
+            <w:bookmarkEnd w:id="94"/>
             <w:r>
               <w:rPr>
                 <w:szCs w:val="22"/>
@@ -14639,7 +14435,7 @@
               </w:rPr>
               <w:t xml:space="preserve"> </w:t>
             </w:r>
-            <w:bookmarkStart w:id="94" w:name="Non_res_Vis"/>
+            <w:bookmarkStart w:id="95" w:name="Non_res_Vis"/>
             <w:r>
               <w:rPr>
                 <w:szCs w:val="22"/>
@@ -14664,7 +14460,7 @@
               </w:rPr>
               <w:t xml:space="preserve"> bicycle spaces are to be provided for non-residential visitors</w:t>
             </w:r>
-            <w:bookmarkEnd w:id="94"/>
+            <w:bookmarkEnd w:id="95"/>
             <w:r>
               <w:rPr>
                 <w:szCs w:val="22"/>
@@ -14753,14 +14549,14 @@
                 <w:szCs w:val="22"/>
               </w:rPr>
             </w:pPr>
-            <w:bookmarkStart w:id="95" w:name="end_of_trip"/>
+            <w:bookmarkStart w:id="96" w:name="end_of_trip"/>
             <w:r>
               <w:rPr>
                 <w:szCs w:val="22"/>
               </w:rPr>
               <w:t>The development is provided with an end of trip facility</w:t>
             </w:r>
-            <w:bookmarkEnd w:id="95"/>
+            <w:bookmarkEnd w:id="96"/>
             <w:r>
               <w:rPr>
                 <w:szCs w:val="22"/>
@@ -15192,11 +14988,11 @@
           <w:szCs w:val="20"/>
         </w:rPr>
       </w:pPr>
-      <w:bookmarkStart w:id="96" w:name="_Toc531765802"/>
-      <w:bookmarkStart w:id="97" w:name="_Toc231555530"/>
-      <w:bookmarkStart w:id="98" w:name="_Toc461726284"/>
-      <w:bookmarkStart w:id="99" w:name="_Toc462823802"/>
-      <w:bookmarkStart w:id="100" w:name="_Toc46738710"/>
+      <w:bookmarkStart w:id="97" w:name="_Toc531765802"/>
+      <w:bookmarkStart w:id="98" w:name="_Toc231555530"/>
+      <w:bookmarkStart w:id="99" w:name="_Toc461726284"/>
+      <w:bookmarkStart w:id="100" w:name="_Toc462823802"/>
+      <w:bookmarkStart w:id="101" w:name="_Toc46738710"/>
       <w:r>
         <w:br w:type="page"/>
       </w:r>
@@ -15209,8 +15005,8 @@
         <w:lastRenderedPageBreak/>
         <w:t>Materials</w:t>
       </w:r>
-      <w:bookmarkEnd w:id="96"/>
       <w:bookmarkEnd w:id="97"/>
+      <w:bookmarkEnd w:id="98"/>
     </w:p>
     <w:p>
       <w:pPr>
@@ -15471,21 +15267,7 @@
               <w:rPr>
                 <w:szCs w:val="22"/>
               </w:rPr>
-              <w:t xml:space="preserve">Concrete mixes used within the project will seek to reduce Portland cement and aggregate content </w:t>
-            </w:r>
-            <w:proofErr w:type="gramStart"/>
-            <w:r>
-              <w:rPr>
-                <w:szCs w:val="22"/>
-              </w:rPr>
-              <w:t>where</w:t>
-            </w:r>
-            <w:proofErr w:type="gramEnd"/>
-            <w:r>
-              <w:rPr>
-                <w:szCs w:val="22"/>
-              </w:rPr>
-              <w:t xml:space="preserve"> deemed appropriate by the structural engineer. </w:t>
+              <w:t xml:space="preserve">Concrete mixes used within the project will seek to reduce Portland cement and aggregate content where deemed appropriate by the structural engineer. </w:t>
             </w:r>
           </w:p>
           <w:p>
@@ -15932,21 +15714,7 @@
               <w:rPr>
                 <w:szCs w:val="22"/>
               </w:rPr>
-              <w:t xml:space="preserve">The project will incorporate products that meet the transparency and sustainability requirements </w:t>
-            </w:r>
-            <w:proofErr w:type="gramStart"/>
-            <w:r>
-              <w:rPr>
-                <w:szCs w:val="22"/>
-              </w:rPr>
-              <w:t>where</w:t>
-            </w:r>
-            <w:proofErr w:type="gramEnd"/>
-            <w:r>
-              <w:rPr>
-                <w:szCs w:val="22"/>
-              </w:rPr>
-              <w:t xml:space="preserve"> deemed appropriate. This includes the following: reused products, recycled content products, environmental product declarations, third party certified and stewardship programs.</w:t>
+              <w:t>The project will incorporate products that meet the transparency and sustainability requirements where deemed appropriate. This includes the following: reused products, recycled content products, environmental product declarations, third party certified and stewardship programs.</w:t>
             </w:r>
           </w:p>
         </w:tc>
@@ -15957,18 +15725,18 @@
       <w:pPr>
         <w:pStyle w:val="Heading2"/>
       </w:pPr>
-      <w:bookmarkStart w:id="101" w:name="_Toc231555531"/>
+      <w:bookmarkStart w:id="102" w:name="_Toc231555531"/>
       <w:r>
         <w:lastRenderedPageBreak/>
         <w:t>Waste</w:t>
       </w:r>
-      <w:bookmarkEnd w:id="98"/>
       <w:bookmarkEnd w:id="99"/>
       <w:bookmarkEnd w:id="100"/>
+      <w:bookmarkEnd w:id="101"/>
       <w:r>
         <w:t xml:space="preserve"> &amp; Resource Recovery</w:t>
       </w:r>
-      <w:bookmarkEnd w:id="101"/>
+      <w:bookmarkEnd w:id="102"/>
     </w:p>
     <w:p>
       <w:pPr>
@@ -16320,7 +16088,7 @@
                 <w:szCs w:val="22"/>
               </w:rPr>
             </w:pPr>
-            <w:bookmarkStart w:id="102" w:name="Waste_Percent"/>
+            <w:bookmarkStart w:id="103" w:name="Waste_Percent"/>
             <w:r>
               <w:rPr>
                 <w:szCs w:val="22"/>
@@ -16339,7 +16107,7 @@
               </w:rPr>
               <w:t>0% of the waste generated during construction and demolition has been diverted from landfill</w:t>
             </w:r>
-            <w:bookmarkEnd w:id="102"/>
+            <w:bookmarkEnd w:id="103"/>
             <w:r>
               <w:rPr>
                 <w:szCs w:val="22"/>
@@ -16515,14 +16283,14 @@
                 <w:szCs w:val="22"/>
               </w:rPr>
             </w:pPr>
-            <w:bookmarkStart w:id="103" w:name="Recycle_Location"/>
+            <w:bookmarkStart w:id="104" w:name="Recycle_Location"/>
             <w:r>
               <w:rPr>
                 <w:szCs w:val="22"/>
               </w:rPr>
               <w:t>Separate general, recycling, glass and organic waste storage will be provided at XXX</w:t>
             </w:r>
-            <w:bookmarkEnd w:id="103"/>
+            <w:bookmarkEnd w:id="104"/>
             <w:r>
               <w:rPr>
                 <w:szCs w:val="22"/>
@@ -16543,21 +16311,7 @@
                 <w:szCs w:val="22"/>
               </w:rPr>
               <w:br/>
-              <w:t xml:space="preserve">Each tenancy is to be provided with separate general, recycling and food and organics waste bins. This requirement is to be included in the </w:t>
-            </w:r>
-            <w:proofErr w:type="gramStart"/>
-            <w:r>
-              <w:rPr>
-                <w:szCs w:val="22"/>
-              </w:rPr>
-              <w:t>owners</w:t>
-            </w:r>
-            <w:proofErr w:type="gramEnd"/>
-            <w:r>
-              <w:rPr>
-                <w:szCs w:val="22"/>
-              </w:rPr>
-              <w:t xml:space="preserve"> corporation rules or lease agreement.</w:t>
+              <w:t>Each tenancy is to be provided with separate general, recycling and food and organics waste bins. This requirement is to be included in the owners corporation rules or lease agreement.</w:t>
             </w:r>
             <w:r>
               <w:rPr>
@@ -16585,8 +16339,8 @@
           <w:szCs w:val="26"/>
         </w:rPr>
       </w:pPr>
-      <w:bookmarkStart w:id="104" w:name="_Toc461726285"/>
-      <w:bookmarkStart w:id="105" w:name="_Toc462823803"/>
+      <w:bookmarkStart w:id="105" w:name="_Toc461726285"/>
+      <w:bookmarkStart w:id="106" w:name="_Toc462823803"/>
       <w:r>
         <w:br w:type="page"/>
       </w:r>
@@ -16595,16 +16349,16 @@
       <w:pPr>
         <w:pStyle w:val="Heading2"/>
       </w:pPr>
-      <w:bookmarkStart w:id="106" w:name="_Toc46738711"/>
-      <w:bookmarkStart w:id="107" w:name="_Toc231555532"/>
+      <w:bookmarkStart w:id="107" w:name="_Toc46738711"/>
+      <w:bookmarkStart w:id="108" w:name="_Toc231555532"/>
       <w:r>
         <w:lastRenderedPageBreak/>
         <w:t>Urban Ecology</w:t>
       </w:r>
-      <w:bookmarkEnd w:id="104"/>
       <w:bookmarkEnd w:id="105"/>
       <w:bookmarkEnd w:id="106"/>
       <w:bookmarkEnd w:id="107"/>
+      <w:bookmarkEnd w:id="108"/>
     </w:p>
     <w:p>
       <w:pPr>
@@ -16888,7 +16642,7 @@
                 <w:szCs w:val="22"/>
               </w:rPr>
             </w:pPr>
-            <w:bookmarkStart w:id="108" w:name="Communal_space"/>
+            <w:bookmarkStart w:id="109" w:name="Communal_space"/>
             <w:r>
               <w:rPr>
                 <w:szCs w:val="22"/>
@@ -16926,7 +16680,7 @@
               </w:rPr>
               <w:t xml:space="preserve"> of communal space will be provided at XXX.</w:t>
             </w:r>
-            <w:bookmarkEnd w:id="108"/>
+            <w:bookmarkEnd w:id="109"/>
             <w:r>
               <w:rPr>
                 <w:szCs w:val="22"/>
@@ -17080,7 +16834,7 @@
               </w:rPr>
               <w:br/>
             </w:r>
-            <w:bookmarkStart w:id="109" w:name="Vege_Percent"/>
+            <w:bookmarkStart w:id="110" w:name="Vege_Percent"/>
             <w:r>
               <w:rPr>
                 <w:szCs w:val="22"/>
@@ -17111,7 +16865,7 @@
               </w:rPr>
               <w:t>% of the site area</w:t>
             </w:r>
-            <w:bookmarkEnd w:id="109"/>
+            <w:bookmarkEnd w:id="110"/>
             <w:r>
               <w:rPr>
                 <w:szCs w:val="22"/>
@@ -17386,7 +17140,7 @@
                 <w:szCs w:val="22"/>
               </w:rPr>
             </w:pPr>
-            <w:bookmarkStart w:id="110" w:name="Food_production"/>
+            <w:bookmarkStart w:id="111" w:name="Food_production"/>
             <w:r>
               <w:rPr>
                 <w:szCs w:val="22"/>
@@ -17411,7 +17165,7 @@
               </w:rPr>
               <w:t>m2 of communal food production area will be provided</w:t>
             </w:r>
-            <w:bookmarkEnd w:id="110"/>
+            <w:bookmarkEnd w:id="111"/>
             <w:r>
               <w:rPr>
                 <w:szCs w:val="22"/>
@@ -17506,21 +17260,7 @@
               <w:rPr>
                 <w:szCs w:val="22"/>
               </w:rPr>
-              <w:t xml:space="preserve">Roofs are to have a </w:t>
-            </w:r>
-            <w:proofErr w:type="gramStart"/>
-            <w:r>
-              <w:rPr>
-                <w:szCs w:val="22"/>
-              </w:rPr>
-              <w:t>three year</w:t>
-            </w:r>
-            <w:proofErr w:type="gramEnd"/>
-            <w:r>
-              <w:rPr>
-                <w:szCs w:val="22"/>
-              </w:rPr>
-              <w:t xml:space="preserve"> SRI of minimum 60</w:t>
+              <w:t>Roofs are to have a three year SRI of minimum 60</w:t>
             </w:r>
             <w:r>
               <w:rPr>
@@ -17547,28 +17287,14 @@
               <w:rPr>
                 <w:szCs w:val="22"/>
               </w:rPr>
-              <w:t xml:space="preserve">Unshaded hard-scaping elements are to have a </w:t>
-            </w:r>
-            <w:proofErr w:type="gramStart"/>
-            <w:r>
-              <w:rPr>
-                <w:szCs w:val="22"/>
-              </w:rPr>
-              <w:t>three year</w:t>
-            </w:r>
-            <w:proofErr w:type="gramEnd"/>
-            <w:r>
-              <w:rPr>
-                <w:szCs w:val="22"/>
-              </w:rPr>
-              <w:t xml:space="preserve"> SRI of minimum 40.</w:t>
+              <w:t>Unshaded hard-scaping elements are to have a three year SRI of minimum 40.</w:t>
             </w:r>
           </w:p>
         </w:tc>
       </w:tr>
     </w:tbl>
     <w:p>
-      <w:bookmarkStart w:id="111" w:name="_Toc461726286"/>
+      <w:bookmarkStart w:id="112" w:name="_Toc461726286"/>
     </w:p>
     <w:p>
       <w:r>
@@ -17579,17 +17305,17 @@
       <w:pPr>
         <w:pStyle w:val="Heading2"/>
       </w:pPr>
-      <w:bookmarkStart w:id="112" w:name="_Toc462823804"/>
-      <w:bookmarkStart w:id="113" w:name="_Toc46738712"/>
-      <w:bookmarkStart w:id="114" w:name="_Toc231555533"/>
+      <w:bookmarkStart w:id="113" w:name="_Toc462823804"/>
+      <w:bookmarkStart w:id="114" w:name="_Toc46738712"/>
+      <w:bookmarkStart w:id="115" w:name="_Toc231555533"/>
       <w:r>
         <w:lastRenderedPageBreak/>
         <w:t>Innovation</w:t>
       </w:r>
-      <w:bookmarkEnd w:id="111"/>
       <w:bookmarkEnd w:id="112"/>
       <w:bookmarkEnd w:id="113"/>
       <w:bookmarkEnd w:id="114"/>
+      <w:bookmarkEnd w:id="115"/>
     </w:p>
     <w:p>
       <w:pPr>
@@ -17996,21 +17722,7 @@
               <w:rPr>
                 <w:szCs w:val="22"/>
               </w:rPr>
-              <w:t xml:space="preserve">The proposed development will be established with a carbon neutral power agreement between developer, owner’s corporation, and electrical retailer to provide </w:t>
-            </w:r>
-            <w:proofErr w:type="spellStart"/>
-            <w:r>
-              <w:rPr>
-                <w:szCs w:val="22"/>
-              </w:rPr>
-              <w:t>GreenPower</w:t>
-            </w:r>
-            <w:proofErr w:type="spellEnd"/>
-            <w:r>
-              <w:rPr>
-                <w:szCs w:val="22"/>
-              </w:rPr>
-              <w:t xml:space="preserve"> for all energy consumed by building (including communal areas, apartments and retail tenancy). It is the intent to maintain this agreement for a minimum of 10 years. </w:t>
+              <w:t xml:space="preserve">The proposed development will be established with a carbon neutral power agreement between developer, owner’s corporation, and electrical retailer to provide GreenPower for all energy consumed by building (including communal areas, apartments and retail tenancy). It is the intent to maintain this agreement for a minimum of 10 years. </w:t>
             </w:r>
           </w:p>
         </w:tc>
@@ -18163,8 +17875,8 @@
           <w:rFonts w:eastAsiaTheme="minorEastAsia"/>
         </w:rPr>
       </w:pPr>
-      <w:bookmarkStart w:id="115" w:name="WSUD_Appendix"/>
-      <w:bookmarkStart w:id="116" w:name="_Toc231555534"/>
+      <w:bookmarkStart w:id="116" w:name="WSUD_Appendix"/>
+      <w:bookmarkStart w:id="117" w:name="_Toc231555534"/>
       <w:r>
         <w:lastRenderedPageBreak/>
         <w:t xml:space="preserve">Appendix </w:t>
@@ -18175,8 +17887,8 @@
       <w:r>
         <w:t xml:space="preserve"> – WSUD Response</w:t>
       </w:r>
-      <w:bookmarkEnd w:id="115"/>
       <w:bookmarkEnd w:id="116"/>
+      <w:bookmarkEnd w:id="117"/>
     </w:p>
     <w:p>
       <w:pPr>
@@ -18204,7 +17916,7 @@
       <w:r>
         <w:t>The following architectural mark-up illustrates the rainwater collection and impervious areas of the proposed development site.</w:t>
       </w:r>
-      <w:bookmarkStart w:id="117" w:name="_Toc451243777"/>
+      <w:bookmarkStart w:id="118" w:name="_Toc451243777"/>
     </w:p>
     <w:tbl>
       <w:tblPr>
@@ -18284,7 +17996,7 @@
         </w:tc>
       </w:tr>
     </w:tbl>
-    <w:bookmarkEnd w:id="117"/>
+    <w:bookmarkEnd w:id="118"/>
     <w:p>
       <w:pPr>
         <w:pStyle w:val="Heading3"/>
@@ -18336,15 +18048,7 @@
         <w:t xml:space="preserve"> [rainwater tank size]</w:t>
       </w:r>
       <w:r>
-        <w:t xml:space="preserve"> litre rainwater tank. XX </w:t>
-      </w:r>
-      <w:proofErr w:type="gramStart"/>
-      <w:r>
-        <w:t>WC’s</w:t>
-      </w:r>
-      <w:proofErr w:type="gramEnd"/>
-      <w:r>
-        <w:t xml:space="preserve"> are to be connected to the rainwater tank.</w:t>
+        <w:t xml:space="preserve"> litre rainwater tank. XX WC’s are to be connected to the rainwater tank.</w:t>
       </w:r>
     </w:p>
     <w:p>
@@ -18354,18 +18058,10 @@
         <w:jc w:val="both"/>
       </w:pPr>
       <w:r>
-        <w:t xml:space="preserve">Rainwater is to be collected from XX and directed into a </w:t>
-      </w:r>
-      <w:proofErr w:type="gramStart"/>
-      <w:r>
-        <w:t>≥</w:t>
+        <w:t>Rainwater is to be collected from XX and directed into a ≥</w:t>
       </w:r>
       <w:r>
-        <w:t>[</w:t>
-      </w:r>
-      <w:proofErr w:type="gramEnd"/>
-      <w:r>
-        <w:t>raingarden size]</w:t>
+        <w:t>[raingarden size]</w:t>
       </w:r>
       <w:r>
         <w:t>m2, minimum 1,150mm deep raingarden with 300mm of extended detention.</w:t>
@@ -18715,32 +18411,18 @@
       <w:r>
         <w:t xml:space="preserve">Furthermore, </w:t>
       </w:r>
-      <w:bookmarkStart w:id="118" w:name="_Hlk512948205"/>
+      <w:bookmarkStart w:id="119" w:name="_Hlk512948205"/>
       <w:r>
         <w:rPr>
           <w:highlight w:val="yellow"/>
         </w:rPr>
-        <w:t xml:space="preserve">a </w:t>
-      </w:r>
-      <w:proofErr w:type="gramStart"/>
-      <w:r>
-        <w:rPr>
-          <w:highlight w:val="yellow"/>
-        </w:rPr>
-        <w:t>≥</w:t>
+        <w:t>a ≥</w:t>
       </w:r>
       <w:r>
         <w:rPr>
           <w:highlight w:val="yellow"/>
         </w:rPr>
-        <w:t>[</w:t>
-      </w:r>
-      <w:proofErr w:type="gramEnd"/>
-      <w:r>
-        <w:rPr>
-          <w:highlight w:val="yellow"/>
-        </w:rPr>
-        <w:t>raingarden size]</w:t>
+        <w:t>[raingarden size]</w:t>
       </w:r>
       <w:r>
         <w:rPr>
@@ -18758,7 +18440,7 @@
       <w:r>
         <w:t>, minimum 1,150mm deep raingarden with 300mm of extended detention</w:t>
       </w:r>
-      <w:bookmarkEnd w:id="118"/>
+      <w:bookmarkEnd w:id="119"/>
       <w:r>
         <w:t xml:space="preserve"> is to be provided. Rainwater collected from </w:t>
       </w:r>
@@ -19036,15 +18718,7 @@
         <w:jc w:val="both"/>
       </w:pPr>
       <w:r>
-        <w:t xml:space="preserve">Introduction of offsite construction for building elements </w:t>
-      </w:r>
-      <w:proofErr w:type="gramStart"/>
-      <w:r>
-        <w:t>where</w:t>
-      </w:r>
-      <w:proofErr w:type="gramEnd"/>
-      <w:r>
-        <w:t xml:space="preserve"> deemed appropriate.</w:t>
+        <w:t>Introduction of offsite construction for building elements where deemed appropriate.</w:t>
       </w:r>
     </w:p>
     <w:p>
@@ -19963,21 +19637,7 @@
               <w:rPr>
                 <w:szCs w:val="22"/>
               </w:rPr>
-              <w:t xml:space="preserve">Clear inflow points of </w:t>
-            </w:r>
-            <w:proofErr w:type="gramStart"/>
-            <w:r>
-              <w:rPr>
-                <w:szCs w:val="22"/>
-              </w:rPr>
-              <w:t>built up</w:t>
-            </w:r>
-            <w:proofErr w:type="gramEnd"/>
-            <w:r>
-              <w:rPr>
-                <w:szCs w:val="22"/>
-              </w:rPr>
-              <w:t xml:space="preserve"> sediment, rubbish and leaves.  </w:t>
+              <w:t xml:space="preserve">Clear inflow points of built up sediment, rubbish and leaves.  </w:t>
             </w:r>
           </w:p>
           <w:p>
@@ -20489,8 +20149,8 @@
           <w:rFonts w:eastAsiaTheme="minorEastAsia"/>
         </w:rPr>
       </w:pPr>
-      <w:bookmarkStart w:id="119" w:name="Energy_Appendix"/>
-      <w:bookmarkStart w:id="120" w:name="_Toc231555535"/>
+      <w:bookmarkStart w:id="120" w:name="Energy_Appendix"/>
+      <w:bookmarkStart w:id="121" w:name="_Toc231555535"/>
       <w:r>
         <w:lastRenderedPageBreak/>
         <w:t xml:space="preserve">Appendix </w:t>
@@ -20510,14 +20170,14 @@
       <w:r>
         <w:t xml:space="preserve"> Certificates</w:t>
       </w:r>
-      <w:bookmarkEnd w:id="119"/>
+      <w:bookmarkEnd w:id="120"/>
       <w:r>
         <w:rPr>
           <w:rFonts w:eastAsiaTheme="minorEastAsia"/>
         </w:rPr>
         <w:t>.</w:t>
       </w:r>
-      <w:bookmarkEnd w:id="120"/>
+      <w:bookmarkEnd w:id="121"/>
       <w:r>
         <w:rPr>
           <w:rFonts w:eastAsiaTheme="minorEastAsia"/>
@@ -20537,21 +20197,7 @@
         <w:rPr>
           <w:rFonts w:eastAsia="Times New Roman" w:cs="Times New Roman"/>
         </w:rPr>
-        <w:t xml:space="preserve">The National Construction Code (NCC) Class 2 – Sole Occupancy Unit(s) residential building component is to be designed in accordance with NCC Section J (2022) </w:t>
-      </w:r>
-      <w:proofErr w:type="spellStart"/>
-      <w:r>
-        <w:rPr>
-          <w:rFonts w:eastAsia="Times New Roman" w:cs="Times New Roman"/>
-        </w:rPr>
-        <w:t>NatHERS</w:t>
-      </w:r>
-      <w:proofErr w:type="spellEnd"/>
-      <w:r>
-        <w:rPr>
-          <w:rFonts w:eastAsia="Times New Roman" w:cs="Times New Roman"/>
-        </w:rPr>
-        <w:t xml:space="preserve"> requirements. The residential units must achieve an average </w:t>
+        <w:t xml:space="preserve">The National Construction Code (NCC) Class 2 – Sole Occupancy Unit(s) residential building component is to be designed in accordance with NCC Section J (2022) NatHERS requirements. The residential units must achieve an average </w:t>
       </w:r>
       <w:r>
         <w:rPr>
@@ -20987,27 +20633,7 @@
           <w:color w:val="auto"/>
           <w:szCs w:val="22"/>
         </w:rPr>
-        <w:t xml:space="preserve">The apartments are currently achieving a X.X Star average. The below sample ratings demonstrate the </w:t>
-      </w:r>
-      <w:proofErr w:type="gramStart"/>
-      <w:r>
-        <w:rPr>
-          <w:rFonts w:ascii="Roboto Light" w:hAnsi="Roboto Light"/>
-          <w:b w:val="0"/>
-          <w:color w:val="auto"/>
-          <w:szCs w:val="22"/>
-        </w:rPr>
-        <w:t>developments</w:t>
-      </w:r>
-      <w:proofErr w:type="gramEnd"/>
-      <w:r>
-        <w:rPr>
-          <w:rFonts w:ascii="Roboto Light" w:hAnsi="Roboto Light"/>
-          <w:b w:val="0"/>
-          <w:color w:val="auto"/>
-          <w:szCs w:val="22"/>
-        </w:rPr>
-        <w:t xml:space="preserve"> ability to achieve </w:t>
+        <w:t xml:space="preserve">The apartments are currently achieving a X.X Star average. The below sample ratings demonstrate the developments ability to achieve </w:t>
       </w:r>
       <w:r>
         <w:rPr>
@@ -21134,7 +20760,6 @@
                 <w:color w:val="00602B" w:themeColor="accent1"/>
               </w:rPr>
             </w:pPr>
-            <w:proofErr w:type="gramStart"/>
             <w:r>
               <w:rPr>
                 <w:rFonts w:ascii="Roboto" w:hAnsi="Roboto"/>
@@ -21142,7 +20767,6 @@
               </w:rPr>
               <w:t>ACE  Heating</w:t>
             </w:r>
-            <w:proofErr w:type="gramEnd"/>
             <w:r>
               <w:rPr>
                 <w:rFonts w:ascii="Roboto" w:hAnsi="Roboto"/>
@@ -21177,7 +20801,6 @@
                 <w:color w:val="00602B" w:themeColor="accent1"/>
               </w:rPr>
             </w:pPr>
-            <w:proofErr w:type="gramStart"/>
             <w:r>
               <w:rPr>
                 <w:rFonts w:ascii="Roboto" w:hAnsi="Roboto"/>
@@ -21185,7 +20808,6 @@
               </w:rPr>
               <w:t>ACE  Cooling</w:t>
             </w:r>
-            <w:proofErr w:type="gramEnd"/>
             <w:r>
               <w:rPr>
                 <w:rFonts w:ascii="Roboto" w:hAnsi="Roboto"/>
@@ -21220,7 +20842,6 @@
                 <w:color w:val="00602B" w:themeColor="accent1"/>
               </w:rPr>
             </w:pPr>
-            <w:proofErr w:type="gramStart"/>
             <w:r>
               <w:rPr>
                 <w:rFonts w:ascii="Roboto" w:hAnsi="Roboto"/>
@@ -21228,7 +20849,6 @@
               </w:rPr>
               <w:t>ACE  NCFA</w:t>
             </w:r>
-            <w:proofErr w:type="gramEnd"/>
           </w:p>
         </w:tc>
         <w:tc>
@@ -22417,7 +22037,6 @@
                 <w:szCs w:val="22"/>
               </w:rPr>
             </w:pPr>
-            <w:proofErr w:type="gramStart"/>
             <w:r>
               <w:rPr>
                 <w:rFonts w:ascii="Roboto Light" w:hAnsi="Roboto Light"/>
@@ -22426,7 +22045,6 @@
               </w:rPr>
               <w:t>RX.X+RX.X</w:t>
             </w:r>
-            <w:proofErr w:type="gramEnd"/>
           </w:p>
         </w:tc>
       </w:tr>
@@ -22658,26 +22276,16 @@
                 <w:b w:val="0"/>
                 <w:szCs w:val="22"/>
               </w:rPr>
-              <w:t xml:space="preserve"> Argon </w:t>
-            </w:r>
-            <w:proofErr w:type="gramStart"/>
+              <w:t xml:space="preserve"> Argon filled, </w:t>
+            </w:r>
             <w:r>
               <w:rPr>
                 <w:rFonts w:ascii="Roboto Light" w:hAnsi="Roboto Light"/>
                 <w:b w:val="0"/>
                 <w:szCs w:val="22"/>
               </w:rPr>
-              <w:t xml:space="preserve">filled, </w:t>
-            </w:r>
-            <w:r>
-              <w:rPr>
-                <w:rFonts w:ascii="Roboto Light" w:hAnsi="Roboto Light"/>
-                <w:b w:val="0"/>
-                <w:szCs w:val="22"/>
-              </w:rPr>
               <w:t xml:space="preserve"> Clear</w:t>
             </w:r>
-            <w:proofErr w:type="gramEnd"/>
           </w:p>
         </w:tc>
         <w:tc>
@@ -22828,26 +22436,16 @@
                 <w:b w:val="0"/>
                 <w:szCs w:val="22"/>
               </w:rPr>
-              <w:t xml:space="preserve"> Argon </w:t>
-            </w:r>
-            <w:proofErr w:type="gramStart"/>
+              <w:t xml:space="preserve"> Argon filled, </w:t>
+            </w:r>
             <w:r>
               <w:rPr>
                 <w:rFonts w:ascii="Roboto Light" w:hAnsi="Roboto Light"/>
                 <w:b w:val="0"/>
                 <w:szCs w:val="22"/>
               </w:rPr>
-              <w:t xml:space="preserve">filled, </w:t>
-            </w:r>
-            <w:r>
-              <w:rPr>
-                <w:rFonts w:ascii="Roboto Light" w:hAnsi="Roboto Light"/>
-                <w:b w:val="0"/>
-                <w:szCs w:val="22"/>
-              </w:rPr>
               <w:t xml:space="preserve"> Clear</w:t>
             </w:r>
-            <w:proofErr w:type="gramEnd"/>
           </w:p>
         </w:tc>
         <w:tc>
@@ -22935,14 +22533,14 @@
       <w:pPr>
         <w:pStyle w:val="Heading2"/>
       </w:pPr>
-      <w:bookmarkStart w:id="121" w:name="Renewble_Appendix"/>
-      <w:bookmarkStart w:id="122" w:name="_Toc231555536"/>
+      <w:bookmarkStart w:id="122" w:name="Renewble_Appendix"/>
+      <w:bookmarkStart w:id="123" w:name="_Toc231555536"/>
       <w:r>
         <w:lastRenderedPageBreak/>
         <w:t>Appendix X – Renewable Energy</w:t>
       </w:r>
-      <w:bookmarkEnd w:id="121"/>
       <w:bookmarkEnd w:id="122"/>
+      <w:bookmarkEnd w:id="123"/>
     </w:p>
     <w:tbl>
       <w:tblPr>
@@ -23039,7 +22637,6 @@
       <w:pPr>
         <w:pStyle w:val="Heading3"/>
       </w:pPr>
-      <w:proofErr w:type="spellStart"/>
       <w:r>
         <w:rPr>
           <w:highlight w:val="yellow"/>
@@ -23056,14 +22653,7 @@
         <w:rPr>
           <w:highlight w:val="yellow"/>
         </w:rPr>
-        <w:t>atts</w:t>
-      </w:r>
-      <w:proofErr w:type="spellEnd"/>
-      <w:r>
-        <w:rPr>
-          <w:highlight w:val="yellow"/>
-        </w:rPr>
-        <w:t xml:space="preserve"> Calculator</w:t>
+        <w:t>atts Calculator</w:t>
       </w:r>
       <w:r>
         <w:br w:type="page"/>
@@ -23073,7 +22663,7 @@
       <w:pPr>
         <w:pStyle w:val="Heading2"/>
       </w:pPr>
-      <w:bookmarkStart w:id="123" w:name="PrelimJ4D6_Appendix"/>
+      <w:bookmarkStart w:id="124" w:name="PrelimJ4D6_Appendix"/>
       <w:r>
         <w:lastRenderedPageBreak/>
         <w:t xml:space="preserve">Appendix X – </w:t>
@@ -23081,7 +22671,7 @@
       <w:r>
         <w:t>Preliminary Part J4D6 Façade Calculator</w:t>
       </w:r>
-      <w:bookmarkEnd w:id="123"/>
+      <w:bookmarkEnd w:id="124"/>
     </w:p>
     <w:p>
       <w:pPr>
@@ -23095,14 +22685,14 @@
       <w:pPr>
         <w:pStyle w:val="Heading2"/>
       </w:pPr>
-      <w:bookmarkStart w:id="124" w:name="Daylight_Appendix"/>
-      <w:bookmarkStart w:id="125" w:name="_Toc231555537"/>
+      <w:bookmarkStart w:id="125" w:name="Daylight_Appendix"/>
+      <w:bookmarkStart w:id="126" w:name="_Toc231555537"/>
       <w:r>
         <w:lastRenderedPageBreak/>
         <w:t>Appendix X – Daylight Modelling</w:t>
       </w:r>
-      <w:bookmarkEnd w:id="124"/>
       <w:bookmarkEnd w:id="125"/>
+      <w:bookmarkEnd w:id="126"/>
     </w:p>
     <w:p>
       <w:pPr>
@@ -25661,7 +25251,7 @@
               <w:spacing w:before="0" w:after="0"/>
               <w:jc w:val="center"/>
             </w:pPr>
-            <w:bookmarkStart w:id="126" w:name="Daylight_modelling_Livingareas"/>
+            <w:bookmarkStart w:id="127" w:name="Daylight_modelling_Livingareas"/>
             <w:r>
               <w:rPr>
                 <w:rFonts w:eastAsia="SimSun" w:cs="Calibri"/>
@@ -25678,7 +25268,7 @@
               </w:rPr>
               <w:t xml:space="preserve"> of Living areas</w:t>
             </w:r>
-            <w:bookmarkEnd w:id="126"/>
+            <w:bookmarkEnd w:id="127"/>
           </w:p>
         </w:tc>
         <w:tc>
@@ -25698,7 +25288,7 @@
               <w:spacing w:before="0" w:after="0"/>
               <w:jc w:val="center"/>
             </w:pPr>
-            <w:bookmarkStart w:id="127" w:name="Daylight_modelling_bedrooms"/>
+            <w:bookmarkStart w:id="128" w:name="Daylight_modelling_bedrooms"/>
             <w:r>
               <w:rPr>
                 <w:rFonts w:eastAsia="SimSun" w:cs="Calibri"/>
@@ -25715,7 +25305,7 @@
               </w:rPr>
               <w:t xml:space="preserve"> of Bedrooms</w:t>
             </w:r>
-            <w:bookmarkEnd w:id="127"/>
+            <w:bookmarkEnd w:id="128"/>
           </w:p>
         </w:tc>
       </w:tr>
@@ -25752,8 +25342,8 @@
       <w:pPr>
         <w:pStyle w:val="Heading2"/>
       </w:pPr>
-      <w:bookmarkStart w:id="128" w:name="NatVent_Appendix"/>
-      <w:bookmarkStart w:id="129" w:name="_Toc231555538"/>
+      <w:bookmarkStart w:id="129" w:name="NatVent_Appendix"/>
+      <w:bookmarkStart w:id="130" w:name="_Toc231555538"/>
       <w:r>
         <w:lastRenderedPageBreak/>
         <w:t>Appendix X –</w:t>
@@ -25764,8 +25354,8 @@
       <w:r>
         <w:t>Natural Ventilation</w:t>
       </w:r>
-      <w:bookmarkEnd w:id="128"/>
       <w:bookmarkEnd w:id="129"/>
+      <w:bookmarkEnd w:id="130"/>
     </w:p>
     <w:tbl>
       <w:tblPr>
@@ -28026,12 +27616,12 @@
       <w:pPr>
         <w:pStyle w:val="Heading2"/>
       </w:pPr>
-      <w:bookmarkStart w:id="130" w:name="_Toc231555539"/>
+      <w:bookmarkStart w:id="131" w:name="_Toc231555539"/>
       <w:r>
         <w:lastRenderedPageBreak/>
         <w:t>Appendix X – BESS Assessment</w:t>
       </w:r>
-      <w:bookmarkEnd w:id="130"/>
+      <w:bookmarkEnd w:id="131"/>
     </w:p>
     <w:p/>
     <w:sectPr>
@@ -34168,6 +33758,7 @@
     <w:rsid w:val="001F774D"/>
     <w:rsid w:val="0024754E"/>
     <w:rsid w:val="002476EF"/>
+    <w:rsid w:val="00265BF8"/>
     <w:rsid w:val="00280C54"/>
     <w:rsid w:val="002870BB"/>
     <w:rsid w:val="002A4853"/>
@@ -34211,6 +33802,7 @@
     <w:rsid w:val="00635930"/>
     <w:rsid w:val="00644C13"/>
     <w:rsid w:val="006718F4"/>
+    <w:rsid w:val="00680F0B"/>
     <w:rsid w:val="0069527B"/>
     <w:rsid w:val="006A4FF8"/>
     <w:rsid w:val="006A71BB"/>
@@ -34259,6 +33851,7 @@
     <w:rsid w:val="00A36613"/>
     <w:rsid w:val="00A44511"/>
     <w:rsid w:val="00A474E6"/>
+    <w:rsid w:val="00A5620E"/>
     <w:rsid w:val="00A70FF1"/>
     <w:rsid w:val="00AC4FCD"/>
     <w:rsid w:val="00AE5972"/>
@@ -35001,20 +34594,6 @@
       <w14:ligatures w14:val="standardContextual"/>
     </w:rPr>
   </w:style>
-  <w:style w:type="paragraph" w:customStyle="1" w:styleId="09364AE021A3449DB52A371E5B21A049">
-    <w:name w:val="09364AE021A3449DB52A371E5B21A049"/>
-    <w:rsid w:val="008D618A"/>
-    <w:pPr>
-      <w:spacing w:after="160" w:line="278" w:lineRule="auto"/>
-    </w:pPr>
-    <w:rPr>
-      <w:kern w:val="2"/>
-      <w:sz w:val="24"/>
-      <w:szCs w:val="24"/>
-      <w:lang w:val="en-CA" w:eastAsia="zh-CN"/>
-      <w14:ligatures w14:val="standardContextual"/>
-    </w:rPr>
-  </w:style>
 </w:styles>
 </file>
 

</xml_diff>

<commit_message>
Update MixUse and Multi-Apt Word templates
Co-Authored-By: Claude Sonnet 4.6 <noreply@anthropic.com>
</commit_message>
<xml_diff>
--- a/server/templates/DATE-GIWREF-Address-SMP-MixUse-2022-A.docx
+++ b/server/templates/DATE-GIWREF-Address-SMP-MixUse-2022-A.docx
@@ -1771,11 +1771,11 @@
         <w:br w:type="page"/>
       </w:r>
     </w:p>
-    <w:bookmarkStart w:id="19" w:name="_Toc209592307" w:displacedByCustomXml="next"/>
-    <w:bookmarkStart w:id="20" w:name="_Toc209557015" w:displacedByCustomXml="next"/>
+    <w:bookmarkStart w:id="19" w:name="_Toc231555515" w:displacedByCustomXml="next"/>
+    <w:bookmarkStart w:id="20" w:name="_Toc209555290" w:displacedByCustomXml="next"/>
     <w:bookmarkStart w:id="21" w:name="_Toc209555543" w:displacedByCustomXml="next"/>
-    <w:bookmarkStart w:id="22" w:name="_Toc209555290" w:displacedByCustomXml="next"/>
-    <w:bookmarkStart w:id="23" w:name="_Toc231555515" w:displacedByCustomXml="next"/>
+    <w:bookmarkStart w:id="22" w:name="_Toc209557015" w:displacedByCustomXml="next"/>
+    <w:bookmarkStart w:id="23" w:name="_Toc209592307" w:displacedByCustomXml="next"/>
     <w:sdt>
       <w:sdtPr>
         <w:rPr>
@@ -6136,7 +6136,7 @@
                 <w:color w:val="000000"/>
               </w:rPr>
               <w:drawing>
-                <wp:anchor distT="0" distB="0" distL="114300" distR="114300" simplePos="0" relativeHeight="251738112" behindDoc="1" locked="0" layoutInCell="1" allowOverlap="1" wp14:anchorId="22787630" wp14:editId="456AAAD2">
+                <wp:anchor distT="0" distB="0" distL="114300" distR="114300" simplePos="0" relativeHeight="251738112" behindDoc="1" locked="0" layoutInCell="1" allowOverlap="1" wp14:anchorId="22787630" wp14:editId="103BB15E">
                   <wp:simplePos x="0" y="0"/>
                   <wp:positionH relativeFrom="column">
                     <wp:posOffset>77470</wp:posOffset>
@@ -6599,7 +6599,7 @@
                 <w:color w:val="000000"/>
               </w:rPr>
               <w:drawing>
-                <wp:anchor distT="0" distB="0" distL="114300" distR="114300" simplePos="0" relativeHeight="251739136" behindDoc="1" locked="0" layoutInCell="1" allowOverlap="1" wp14:anchorId="7055ECC5" wp14:editId="059F2568">
+                <wp:anchor distT="0" distB="0" distL="114300" distR="114300" simplePos="0" relativeHeight="251739136" behindDoc="1" locked="0" layoutInCell="1" allowOverlap="1" wp14:anchorId="7055ECC5" wp14:editId="2A155A73">
                   <wp:simplePos x="0" y="0"/>
                   <wp:positionH relativeFrom="column">
                     <wp:posOffset>76200</wp:posOffset>
@@ -7600,7 +7600,7 @@
                 <w:color w:val="000000"/>
               </w:rPr>
               <w:drawing>
-                <wp:anchor distT="0" distB="0" distL="114300" distR="114300" simplePos="0" relativeHeight="251741184" behindDoc="1" locked="0" layoutInCell="1" allowOverlap="1" wp14:anchorId="63206793" wp14:editId="6CBF6553">
+                <wp:anchor distT="0" distB="0" distL="114300" distR="114300" simplePos="0" relativeHeight="251741184" behindDoc="1" locked="0" layoutInCell="1" allowOverlap="1" wp14:anchorId="63206793" wp14:editId="0478D1CD">
                   <wp:simplePos x="0" y="0"/>
                   <wp:positionH relativeFrom="column">
                     <wp:posOffset>91440</wp:posOffset>
@@ -12600,13 +12600,6 @@
                       <w:rFonts w:eastAsia="SimSun" w:cs="Calibri"/>
                       <w:color w:val="000000"/>
                     </w:rPr>
-                    <w:t>%</w:t>
-                  </w:r>
-                  <w:r>
-                    <w:rPr>
-                      <w:rFonts w:eastAsia="SimSun" w:cs="Calibri"/>
-                      <w:color w:val="000000"/>
-                    </w:rPr>
                     <w:t xml:space="preserve"> of Living areas</w:t>
                   </w:r>
                   <w:r>
@@ -12689,13 +12682,6 @@
                       <w:color w:val="000000"/>
                     </w:rPr>
                     <w:t>]</w:t>
-                  </w:r>
-                  <w:r>
-                    <w:rPr>
-                      <w:rFonts w:eastAsia="SimSun" w:cs="Calibri"/>
-                      <w:color w:val="000000"/>
-                    </w:rPr>
-                    <w:t>%</w:t>
                   </w:r>
                   <w:r>
                     <w:rPr>
@@ -33872,6 +33858,7 @@
     <w:rsid w:val="00BC50D9"/>
     <w:rsid w:val="00C04E7C"/>
     <w:rsid w:val="00C1048C"/>
+    <w:rsid w:val="00C203DC"/>
     <w:rsid w:val="00C45294"/>
     <w:rsid w:val="00C56DB8"/>
     <w:rsid w:val="00C633E8"/>
@@ -33908,6 +33895,7 @@
     <w:rsid w:val="00EF6D39"/>
     <w:rsid w:val="00F2145B"/>
     <w:rsid w:val="00F42234"/>
+    <w:rsid w:val="00FA4B73"/>
   </w:rsids>
   <m:mathPr>
     <m:mathFont m:val="Cambria Math"/>

</xml_diff>